<commit_message>
docs: update SP Agent Vulcan acquisition guide with Divine Fire event images and content improvements
</commit_message>
<xml_diff>
--- a/my-articles-md/活动/sp特工伏尔甘获取攻略/sp特工伏尔甘获取攻略_wechat.docx
+++ b/my-articles-md/活动/sp特工伏尔甘获取攻略/sp特工伏尔甘获取攻略_wechat.docx
@@ -413,7 +413,7 @@
         <w:t xml:space="preserve">属性机制简析</w:t>
       </w:r>
       <w:r>
-        <w:t xml:space="preserve">：个人认为，非常推荐入手。虽然</w:t>
+        <w:t xml:space="preserve">：个人认为，推荐入手。虽然</w:t>
       </w:r>
       <w:r>
         <w:drawing>
@@ -574,7 +574,7 @@
         <w:t xml:space="preserve"> </w:t>
       </w:r>
       <w:r>
-        <w:t xml:space="preserve">处于同一伤害乘区，但其带来的“武器技能初始学习等级+1（满级可达+2）”属性十分强力。用在 SS 级武器上，1</w:t>
+        <w:t xml:space="preserve">处于同一伤害乘区，但其带来的武器技能初始学习等级+1（满级+2）用在ss武器上1</w:t>
       </w:r>
       <w:r>
         <w:drawing>
@@ -619,7 +619,7 @@
         </w:drawing>
       </w:r>
       <w:r>
-        <w:t xml:space="preserve">开局即可达到 4 级，4</w:t>
+        <w:t xml:space="preserve">开局4级，4</w:t>
       </w:r>
       <w:r>
         <w:drawing>
@@ -664,24 +664,7 @@
         </w:drawing>
       </w:r>
       <w:r>
-        <w:t xml:space="preserve">开局直接 5 级（满级），对回响之战的体验有着颠覆性的提升。平民与微氪玩家可以考虑按照“解锁</w:t>
-      </w:r>
-      <w:r>
-        <w:t xml:space="preserve"> </w:t>
-      </w:r>
-      <m:oMath>
-        <m:r>
-          <m:rPr>
-            <m:sty m:val="p"/>
-          </m:rPr>
-          <m:t>→</m:t>
-        </m:r>
-      </m:oMath>
-      <w:r>
-        <w:t xml:space="preserve"> </w:t>
-      </w:r>
-      <w:r>
-        <w:t xml:space="preserve">1</w:t>
+        <w:t xml:space="preserve">开局5级的收益非常可观，足以改变回响之战的体验，微氪玩家平民玩家慢慢从开通-&gt;1</w:t>
       </w:r>
       <w:r>
         <w:drawing>
@@ -726,21 +709,7 @@
         </w:drawing>
       </w:r>
       <w:r>
-        <w:t xml:space="preserve"> </w:t>
-      </w:r>
-      <m:oMath>
-        <m:r>
-          <m:rPr>
-            <m:sty m:val="p"/>
-          </m:rPr>
-          <m:t>→</m:t>
-        </m:r>
-      </m:oMath>
-      <w:r>
-        <w:t xml:space="preserve"> </w:t>
-      </w:r>
-      <w:r>
-        <w:t xml:space="preserve">2</w:t>
+        <w:t xml:space="preserve">-&gt;2</w:t>
       </w:r>
       <w:r>
         <w:drawing>
@@ -785,21 +754,7 @@
         </w:drawing>
       </w:r>
       <w:r>
-        <w:t xml:space="preserve"> </w:t>
-      </w:r>
-      <m:oMath>
-        <m:r>
-          <m:rPr>
-            <m:sty m:val="p"/>
-          </m:rPr>
-          <m:t>→</m:t>
-        </m:r>
-      </m:oMath>
-      <w:r>
-        <w:t xml:space="preserve"> </w:t>
-      </w:r>
-      <w:r>
-        <w:t xml:space="preserve">4</w:t>
+        <w:t xml:space="preserve">-&gt;4</w:t>
       </w:r>
       <w:r>
         <w:drawing>
@@ -844,7 +799,7 @@
         </w:drawing>
       </w:r>
       <w:r>
-        <w:t xml:space="preserve">”的路线逐步培养；重氪玩家则推荐直接拉满至 4</w:t>
+        <w:t xml:space="preserve">，重氪玩家可选择直接到4</w:t>
       </w:r>
       <w:r>
         <w:drawing>
@@ -889,10 +844,7 @@
         </w:drawing>
       </w:r>
       <w:r>
-        <w:t xml:space="preserve"> </w:t>
-      </w:r>
-      <w:r>
-        <w:t xml:space="preserve">或 6</w:t>
+        <w:t xml:space="preserve">或者6</w:t>
       </w:r>
       <w:r>
         <w:drawing>
@@ -1346,7 +1298,7 @@
       </w:r>
     </w:p>
     <w:bookmarkEnd w:id="62"/>
-    <w:bookmarkStart w:id="97" w:name="四不同预算段获取方案推荐"/>
+    <w:bookmarkStart w:id="100" w:name="四不同预算段获取方案推荐"/>
     <w:p>
       <w:pPr>
         <w:pStyle w:val="Heading2"/>
@@ -1951,7 +1903,7 @@
       </w:r>
     </w:p>
     <w:bookmarkEnd w:id="84"/>
-    <w:bookmarkStart w:id="96" w:name="方案四拉满任务-购买128元礼包方案"/>
+    <w:bookmarkStart w:id="99" w:name="方案四拉满任务-购买128元礼包方案"/>
     <w:p>
       <w:pPr>
         <w:pStyle w:val="Heading3"/>
@@ -2114,34 +2066,19 @@
         </w:drawing>
       </w:r>
       <w:r>
-        <w:t xml:space="preserve">）即可多获得80火神之锤碎片用于升星。</w:t>
-      </w:r>
-    </w:p>
-    <w:p>
-      <w:r>
-        <w:pict>
-          <v:rect style="width:0;height:1.5pt" o:hralign="center" o:hrstd="t" o:hr="t"/>
-        </w:pict>
-      </w:r>
-    </w:p>
-    <w:p>
-      <w:pPr>
-        <w:pStyle w:val="FirstParagraph"/>
-      </w:pPr>
-      <w:r>
-        <w:t xml:space="preserve">此外，还有一种特殊情况：如果你目前尚未解锁哪吒</w:t>
+        <w:t xml:space="preserve">）即可多获得80</w:t>
       </w:r>
       <w:r>
         <w:drawing>
           <wp:inline>
             <wp:extent cx="228600" cy="228600"/>
             <wp:effectExtent b="0" l="0" r="0" t="0"/>
-            <wp:docPr descr="哪吒" title="" id="90" name="Picture"/>
+            <wp:docPr descr="火神之锤" title="" id="90" name="Picture"/>
             <a:graphic>
               <a:graphicData uri="http://schemas.openxmlformats.org/drawingml/2006/picture">
                 <pic:pic>
                   <pic:nvPicPr>
-                    <pic:cNvPr descr="assets/img/特工/哪吒.png" id="91" name="Picture"/>
+                    <pic:cNvPr descr="assets/img/活动道具/神火活动/火神之锤.png" id="91" name="Picture"/>
                     <pic:cNvPicPr>
                       <a:picLocks noChangeArrowheads="1" noChangeAspect="1"/>
                     </pic:cNvPicPr>
@@ -2174,19 +2111,79 @@
         </w:drawing>
       </w:r>
       <w:r>
-        <w:t xml:space="preserve">，那么在本次活动中建议优先选择哪吒碎片，待哪吒解锁后再选择伏尔甘</w:t>
+        <w:t xml:space="preserve">碎片用于升星。</w:t>
+      </w:r>
+    </w:p>
+    <w:p>
+      <w:r>
+        <w:pict>
+          <v:rect style="width:0;height:1.5pt" o:hralign="center" o:hrstd="t" o:hr="t"/>
+        </w:pict>
+      </w:r>
+    </w:p>
+    <w:p>
+      <w:pPr>
+        <w:pStyle w:val="FirstParagraph"/>
+      </w:pPr>
+      <w:r>
+        <w:t xml:space="preserve">此外，还有一种特殊情况：如果你目前尚未解锁哪吒</w:t>
       </w:r>
       <w:r>
         <w:drawing>
           <wp:inline>
             <wp:extent cx="228600" cy="228600"/>
             <wp:effectExtent b="0" l="0" r="0" t="0"/>
-            <wp:docPr descr="伏尔甘" title="" id="92" name="Picture"/>
+            <wp:docPr descr="哪吒" title="" id="93" name="Picture"/>
             <a:graphic>
               <a:graphicData uri="http://schemas.openxmlformats.org/drawingml/2006/picture">
                 <pic:pic>
                   <pic:nvPicPr>
-                    <pic:cNvPr descr="assets/img/特工/伏尔甘.png" id="93" name="Picture"/>
+                    <pic:cNvPr descr="assets/img/特工/哪吒.png" id="94" name="Picture"/>
+                    <pic:cNvPicPr>
+                      <a:picLocks noChangeArrowheads="1" noChangeAspect="1"/>
+                    </pic:cNvPicPr>
+                  </pic:nvPicPr>
+                  <pic:blipFill>
+                    <a:blip r:embed="rId92"/>
+                    <a:stretch>
+                      <a:fillRect/>
+                    </a:stretch>
+                  </pic:blipFill>
+                  <pic:spPr bwMode="auto">
+                    <a:xfrm>
+                      <a:off x="0" y="0"/>
+                      <a:ext cx="228600" cy="228600"/>
+                    </a:xfrm>
+                    <a:prstGeom prst="rect">
+                      <a:avLst/>
+                    </a:prstGeom>
+                    <a:noFill/>
+                    <a:ln w="9525">
+                      <a:noFill/>
+                      <a:headEnd/>
+                      <a:tailEnd/>
+                    </a:ln>
+                  </pic:spPr>
+                </pic:pic>
+              </a:graphicData>
+            </a:graphic>
+          </wp:inline>
+        </w:drawing>
+      </w:r>
+      <w:r>
+        <w:t xml:space="preserve">，那么在本次活动中建议优先选择哪吒碎片，待哪吒解锁后再选择伏尔甘</w:t>
+      </w:r>
+      <w:r>
+        <w:drawing>
+          <wp:inline>
+            <wp:extent cx="228600" cy="228600"/>
+            <wp:effectExtent b="0" l="0" r="0" t="0"/>
+            <wp:docPr descr="伏尔甘" title="" id="95" name="Picture"/>
+            <a:graphic>
+              <a:graphicData uri="http://schemas.openxmlformats.org/drawingml/2006/picture">
+                <pic:pic>
+                  <pic:nvPicPr>
+                    <pic:cNvPr descr="assets/img/特工/伏尔甘.png" id="96" name="Picture"/>
                     <pic:cNvPicPr>
                       <a:picLocks noChangeArrowheads="1" noChangeAspect="1"/>
                     </pic:cNvPicPr>
@@ -2234,12 +2231,12 @@
           <wp:inline>
             <wp:extent cx="228600" cy="228600"/>
             <wp:effectExtent b="0" l="0" r="0" t="0"/>
-            <wp:docPr descr="伏尔甘" title="" id="94" name="Picture"/>
+            <wp:docPr descr="伏尔甘" title="" id="97" name="Picture"/>
             <a:graphic>
               <a:graphicData uri="http://schemas.openxmlformats.org/drawingml/2006/picture">
                 <pic:pic>
                   <pic:nvPicPr>
-                    <pic:cNvPr descr="assets/img/特工/伏尔甘.png" id="95" name="Picture"/>
+                    <pic:cNvPr descr="assets/img/特工/伏尔甘.png" id="98" name="Picture"/>
                     <pic:cNvPicPr>
                       <a:picLocks noChangeArrowheads="1" noChangeAspect="1"/>
                     </pic:cNvPicPr>
@@ -2331,8 +2328,8 @@
         <w:t xml:space="preserve">讨论，我会第一时间回复大家，我们下期再见！</w:t>
       </w:r>
     </w:p>
-    <w:bookmarkEnd w:id="96"/>
-    <w:bookmarkEnd w:id="97"/>
+    <w:bookmarkEnd w:id="99"/>
+    <w:bookmarkEnd w:id="100"/>
     <w:sectPr/>
   </w:body>
 </w:document>

</xml_diff>

<commit_message>
docs: format and publish SP Vulcan acquisition guide using danke-strategy-skill
</commit_message>
<xml_diff>
--- a/my-articles-md/活动/sp特工伏尔甘获取攻略/sp特工伏尔甘获取攻略_wechat.docx
+++ b/my-articles-md/活动/sp特工伏尔甘获取攻略/sp特工伏尔甘获取攻略_wechat.docx
@@ -37,7 +37,11 @@
         <w:pStyle w:val="FirstParagraph"/>
       </w:pPr>
       <w:r>
-        <w:t xml:space="preserve">SP特工</w:t>
+        <w:rPr>
+          <w:bCs/>
+          <w:b/>
+        </w:rPr>
+        <w:t xml:space="preserve">【SP特工伏尔甘】</w:t>
       </w:r>
       <w:r>
         <w:drawing>
@@ -85,6 +89,13 @@
         <w:t xml:space="preserve">降临！本篇攻略将为您详细拆解本次活动的玩法以及获取</w:t>
       </w:r>
       <w:r>
+        <w:rPr>
+          <w:bCs/>
+          <w:b/>
+        </w:rPr>
+        <w:t xml:space="preserve">【伏尔甘】</w:t>
+      </w:r>
+      <w:r>
         <w:drawing>
           <wp:inline>
             <wp:extent cx="228600" cy="228600"/>
@@ -154,6 +165,13 @@
         <w:t xml:space="preserve">目前获取</w:t>
       </w:r>
       <w:r>
+        <w:rPr>
+          <w:bCs/>
+          <w:b/>
+        </w:rPr>
+        <w:t xml:space="preserve">【伏尔甘】</w:t>
+      </w:r>
+      <w:r>
         <w:drawing>
           <wp:inline>
             <wp:extent cx="228600" cy="228600"/>
@@ -225,10 +243,24 @@
           <w:bCs/>
           <w:b/>
         </w:rPr>
-        <w:t xml:space="preserve">128元礼包</w:t>
+        <w:t xml:space="preserve">128</w:t>
+      </w:r>
+      <w:r>
+        <w:rPr>
+          <w:bCs/>
+          <w:b/>
+        </w:rPr>
+        <w:t xml:space="preserve">元礼包</w:t>
       </w:r>
       <w:r>
         <w:t xml:space="preserve">（内含</w:t>
+      </w:r>
+      <w:r>
+        <w:rPr>
+          <w:bCs/>
+          <w:b/>
+        </w:rPr>
+        <w:t xml:space="preserve">【伏尔甘】</w:t>
       </w:r>
       <w:r>
         <w:drawing>
@@ -289,10 +321,20 @@
           <w:bCs/>
           <w:b/>
         </w:rPr>
-        <w:t xml:space="preserve">转盘累计</w:t>
-      </w:r>
-      <w:r>
-        <w:t xml:space="preserve">：在活动转盘中，累计消耗</w:t>
+        <w:t xml:space="preserve">转盘</w:t>
+      </w:r>
+      <w:r>
+        <w:t xml:space="preserve">：在活动</w:t>
+      </w:r>
+      <w:r>
+        <w:rPr>
+          <w:bCs/>
+          <w:b/>
+        </w:rPr>
+        <w:t xml:space="preserve">【转盘】</w:t>
+      </w:r>
+      <w:r>
+        <w:t xml:space="preserve">中，累计消耗</w:t>
       </w:r>
       <w:r>
         <w:t xml:space="preserve"> </w:t>
@@ -318,7 +360,7 @@
           <w:bCs/>
           <w:b/>
         </w:rPr>
-        <w:t xml:space="preserve">火神锤抽奖券</w:t>
+        <w:t xml:space="preserve">【火神锤抽奖券】</w:t>
       </w:r>
       <w:r>
         <w:t xml:space="preserve"> </w:t>
@@ -335,7 +377,7 @@
       </w:r>
     </w:p>
     <w:bookmarkEnd w:id="29"/>
-    <w:bookmarkStart w:id="57" w:name="二白嫖及钻石规划策略"/>
+    <w:bookmarkStart w:id="42" w:name="二白嫖及钻石规划策略"/>
     <w:p>
       <w:pPr>
         <w:pStyle w:val="Heading2"/>
@@ -350,6 +392,13 @@
       </w:pPr>
       <w:r>
         <w:t xml:space="preserve">针对想要通过活动白嫖或利用储备</w:t>
+      </w:r>
+      <w:r>
+        <w:rPr>
+          <w:bCs/>
+          <w:b/>
+        </w:rPr>
+        <w:t xml:space="preserve">【钻石】</w:t>
       </w:r>
       <w:r>
         <w:drawing>
@@ -413,7 +462,14 @@
         <w:t xml:space="preserve">属性机制简析</w:t>
       </w:r>
       <w:r>
-        <w:t xml:space="preserve">：个人认为，推荐入手。虽然</w:t>
+        <w:t xml:space="preserve">：个人认为，非常推荐入手。虽然</w:t>
+      </w:r>
+      <w:r>
+        <w:rPr>
+          <w:bCs/>
+          <w:b/>
+        </w:rPr>
+        <w:t xml:space="preserve">【伏尔甘】</w:t>
       </w:r>
       <w:r>
         <w:drawing>
@@ -468,7 +524,7 @@
           <w:bCs/>
           <w:b/>
         </w:rPr>
-        <w:t xml:space="preserve">神火</w:t>
+        <w:t xml:space="preserve">【神火】</w:t>
       </w:r>
       <w:r>
         <w:drawing>
@@ -526,7 +582,7 @@
           <w:bCs/>
           <w:b/>
         </w:rPr>
-        <w:t xml:space="preserve">裂伤</w:t>
+        <w:t xml:space="preserve">【裂伤】</w:t>
       </w:r>
       <w:r>
         <w:drawing>
@@ -574,319 +630,190 @@
         <w:t xml:space="preserve"> </w:t>
       </w:r>
       <w:r>
-        <w:t xml:space="preserve">处于同一伤害乘区，但其带来的武器技能初始学习等级+1（满级+2）用在ss武器上1</w:t>
-      </w:r>
-      <w:r>
-        <w:drawing>
-          <wp:inline>
-            <wp:extent cx="228600" cy="228600"/>
-            <wp:effectExtent b="0" l="0" r="0" t="0"/>
-            <wp:docPr descr="红星" title="" id="42" name="Picture"/>
-            <a:graphic>
-              <a:graphicData uri="http://schemas.openxmlformats.org/drawingml/2006/picture">
-                <pic:pic>
-                  <pic:nvPicPr>
-                    <pic:cNvPr descr="assets/img/其它/红星.png" id="43" name="Picture"/>
-                    <pic:cNvPicPr>
-                      <a:picLocks noChangeArrowheads="1" noChangeAspect="1"/>
-                    </pic:cNvPicPr>
-                  </pic:nvPicPr>
-                  <pic:blipFill>
-                    <a:blip r:embed="rId41"/>
-                    <a:stretch>
-                      <a:fillRect/>
-                    </a:stretch>
-                  </pic:blipFill>
-                  <pic:spPr bwMode="auto">
-                    <a:xfrm>
-                      <a:off x="0" y="0"/>
-                      <a:ext cx="228600" cy="228600"/>
-                    </a:xfrm>
-                    <a:prstGeom prst="rect">
-                      <a:avLst/>
-                    </a:prstGeom>
-                    <a:noFill/>
-                    <a:ln w="9525">
-                      <a:noFill/>
-                      <a:headEnd/>
-                      <a:tailEnd/>
-                    </a:ln>
-                  </pic:spPr>
-                </pic:pic>
-              </a:graphicData>
-            </a:graphic>
-          </wp:inline>
-        </w:drawing>
-      </w:r>
-      <w:r>
-        <w:t xml:space="preserve">开局4级，4</w:t>
-      </w:r>
-      <w:r>
-        <w:drawing>
-          <wp:inline>
-            <wp:extent cx="228600" cy="228600"/>
-            <wp:effectExtent b="0" l="0" r="0" t="0"/>
-            <wp:docPr descr="红星" title="" id="44" name="Picture"/>
-            <a:graphic>
-              <a:graphicData uri="http://schemas.openxmlformats.org/drawingml/2006/picture">
-                <pic:pic>
-                  <pic:nvPicPr>
-                    <pic:cNvPr descr="assets/img/其它/红星.png" id="45" name="Picture"/>
-                    <pic:cNvPicPr>
-                      <a:picLocks noChangeArrowheads="1" noChangeAspect="1"/>
-                    </pic:cNvPicPr>
-                  </pic:nvPicPr>
-                  <pic:blipFill>
-                    <a:blip r:embed="rId41"/>
-                    <a:stretch>
-                      <a:fillRect/>
-                    </a:stretch>
-                  </pic:blipFill>
-                  <pic:spPr bwMode="auto">
-                    <a:xfrm>
-                      <a:off x="0" y="0"/>
-                      <a:ext cx="228600" cy="228600"/>
-                    </a:xfrm>
-                    <a:prstGeom prst="rect">
-                      <a:avLst/>
-                    </a:prstGeom>
-                    <a:noFill/>
-                    <a:ln w="9525">
-                      <a:noFill/>
-                      <a:headEnd/>
-                      <a:tailEnd/>
-                    </a:ln>
-                  </pic:spPr>
-                </pic:pic>
-              </a:graphicData>
-            </a:graphic>
-          </wp:inline>
-        </w:drawing>
-      </w:r>
-      <w:r>
-        <w:t xml:space="preserve">开局5级的收益非常可观，足以改变回响之战的体验，微氪玩家平民玩家慢慢从开通-&gt;1</w:t>
-      </w:r>
-      <w:r>
-        <w:drawing>
-          <wp:inline>
-            <wp:extent cx="228600" cy="228600"/>
-            <wp:effectExtent b="0" l="0" r="0" t="0"/>
-            <wp:docPr descr="红星" title="" id="46" name="Picture"/>
-            <a:graphic>
-              <a:graphicData uri="http://schemas.openxmlformats.org/drawingml/2006/picture">
-                <pic:pic>
-                  <pic:nvPicPr>
-                    <pic:cNvPr descr="assets/img/其它/红星.png" id="47" name="Picture"/>
-                    <pic:cNvPicPr>
-                      <a:picLocks noChangeArrowheads="1" noChangeAspect="1"/>
-                    </pic:cNvPicPr>
-                  </pic:nvPicPr>
-                  <pic:blipFill>
-                    <a:blip r:embed="rId41"/>
-                    <a:stretch>
-                      <a:fillRect/>
-                    </a:stretch>
-                  </pic:blipFill>
-                  <pic:spPr bwMode="auto">
-                    <a:xfrm>
-                      <a:off x="0" y="0"/>
-                      <a:ext cx="228600" cy="228600"/>
-                    </a:xfrm>
-                    <a:prstGeom prst="rect">
-                      <a:avLst/>
-                    </a:prstGeom>
-                    <a:noFill/>
-                    <a:ln w="9525">
-                      <a:noFill/>
-                      <a:headEnd/>
-                      <a:tailEnd/>
-                    </a:ln>
-                  </pic:spPr>
-                </pic:pic>
-              </a:graphicData>
-            </a:graphic>
-          </wp:inline>
-        </w:drawing>
-      </w:r>
-      <w:r>
-        <w:t xml:space="preserve">-&gt;2</w:t>
-      </w:r>
-      <w:r>
-        <w:drawing>
-          <wp:inline>
-            <wp:extent cx="228600" cy="228600"/>
-            <wp:effectExtent b="0" l="0" r="0" t="0"/>
-            <wp:docPr descr="红星" title="" id="48" name="Picture"/>
-            <a:graphic>
-              <a:graphicData uri="http://schemas.openxmlformats.org/drawingml/2006/picture">
-                <pic:pic>
-                  <pic:nvPicPr>
-                    <pic:cNvPr descr="assets/img/其它/红星.png" id="49" name="Picture"/>
-                    <pic:cNvPicPr>
-                      <a:picLocks noChangeArrowheads="1" noChangeAspect="1"/>
-                    </pic:cNvPicPr>
-                  </pic:nvPicPr>
-                  <pic:blipFill>
-                    <a:blip r:embed="rId41"/>
-                    <a:stretch>
-                      <a:fillRect/>
-                    </a:stretch>
-                  </pic:blipFill>
-                  <pic:spPr bwMode="auto">
-                    <a:xfrm>
-                      <a:off x="0" y="0"/>
-                      <a:ext cx="228600" cy="228600"/>
-                    </a:xfrm>
-                    <a:prstGeom prst="rect">
-                      <a:avLst/>
-                    </a:prstGeom>
-                    <a:noFill/>
-                    <a:ln w="9525">
-                      <a:noFill/>
-                      <a:headEnd/>
-                      <a:tailEnd/>
-                    </a:ln>
-                  </pic:spPr>
-                </pic:pic>
-              </a:graphicData>
-            </a:graphic>
-          </wp:inline>
-        </w:drawing>
-      </w:r>
-      <w:r>
-        <w:t xml:space="preserve">-&gt;4</w:t>
-      </w:r>
-      <w:r>
-        <w:drawing>
-          <wp:inline>
-            <wp:extent cx="228600" cy="228600"/>
-            <wp:effectExtent b="0" l="0" r="0" t="0"/>
-            <wp:docPr descr="红星" title="" id="50" name="Picture"/>
-            <a:graphic>
-              <a:graphicData uri="http://schemas.openxmlformats.org/drawingml/2006/picture">
-                <pic:pic>
-                  <pic:nvPicPr>
-                    <pic:cNvPr descr="assets/img/其它/红星.png" id="51" name="Picture"/>
-                    <pic:cNvPicPr>
-                      <a:picLocks noChangeArrowheads="1" noChangeAspect="1"/>
-                    </pic:cNvPicPr>
-                  </pic:nvPicPr>
-                  <pic:blipFill>
-                    <a:blip r:embed="rId41"/>
-                    <a:stretch>
-                      <a:fillRect/>
-                    </a:stretch>
-                  </pic:blipFill>
-                  <pic:spPr bwMode="auto">
-                    <a:xfrm>
-                      <a:off x="0" y="0"/>
-                      <a:ext cx="228600" cy="228600"/>
-                    </a:xfrm>
-                    <a:prstGeom prst="rect">
-                      <a:avLst/>
-                    </a:prstGeom>
-                    <a:noFill/>
-                    <a:ln w="9525">
-                      <a:noFill/>
-                      <a:headEnd/>
-                      <a:tailEnd/>
-                    </a:ln>
-                  </pic:spPr>
-                </pic:pic>
-              </a:graphicData>
-            </a:graphic>
-          </wp:inline>
-        </w:drawing>
-      </w:r>
-      <w:r>
-        <w:t xml:space="preserve">，重氪玩家可选择直接到4</w:t>
-      </w:r>
-      <w:r>
-        <w:drawing>
-          <wp:inline>
-            <wp:extent cx="228600" cy="228600"/>
-            <wp:effectExtent b="0" l="0" r="0" t="0"/>
-            <wp:docPr descr="红星" title="" id="52" name="Picture"/>
-            <a:graphic>
-              <a:graphicData uri="http://schemas.openxmlformats.org/drawingml/2006/picture">
-                <pic:pic>
-                  <pic:nvPicPr>
-                    <pic:cNvPr descr="assets/img/其它/红星.png" id="53" name="Picture"/>
-                    <pic:cNvPicPr>
-                      <a:picLocks noChangeArrowheads="1" noChangeAspect="1"/>
-                    </pic:cNvPicPr>
-                  </pic:nvPicPr>
-                  <pic:blipFill>
-                    <a:blip r:embed="rId41"/>
-                    <a:stretch>
-                      <a:fillRect/>
-                    </a:stretch>
-                  </pic:blipFill>
-                  <pic:spPr bwMode="auto">
-                    <a:xfrm>
-                      <a:off x="0" y="0"/>
-                      <a:ext cx="228600" cy="228600"/>
-                    </a:xfrm>
-                    <a:prstGeom prst="rect">
-                      <a:avLst/>
-                    </a:prstGeom>
-                    <a:noFill/>
-                    <a:ln w="9525">
-                      <a:noFill/>
-                      <a:headEnd/>
-                      <a:tailEnd/>
-                    </a:ln>
-                  </pic:spPr>
-                </pic:pic>
-              </a:graphicData>
-            </a:graphic>
-          </wp:inline>
-        </w:drawing>
-      </w:r>
-      <w:r>
-        <w:t xml:space="preserve">或者6</w:t>
-      </w:r>
-      <w:r>
-        <w:drawing>
-          <wp:inline>
-            <wp:extent cx="228600" cy="228600"/>
-            <wp:effectExtent b="0" l="0" r="0" t="0"/>
-            <wp:docPr descr="红星" title="" id="54" name="Picture"/>
-            <a:graphic>
-              <a:graphicData uri="http://schemas.openxmlformats.org/drawingml/2006/picture">
-                <pic:pic>
-                  <pic:nvPicPr>
-                    <pic:cNvPr descr="assets/img/其它/红星.png" id="55" name="Picture"/>
-                    <pic:cNvPicPr>
-                      <a:picLocks noChangeArrowheads="1" noChangeAspect="1"/>
-                    </pic:cNvPicPr>
-                  </pic:nvPicPr>
-                  <pic:blipFill>
-                    <a:blip r:embed="rId41"/>
-                    <a:stretch>
-                      <a:fillRect/>
-                    </a:stretch>
-                  </pic:blipFill>
-                  <pic:spPr bwMode="auto">
-                    <a:xfrm>
-                      <a:off x="0" y="0"/>
-                      <a:ext cx="228600" cy="228600"/>
-                    </a:xfrm>
-                    <a:prstGeom prst="rect">
-                      <a:avLst/>
-                    </a:prstGeom>
-                    <a:noFill/>
-                    <a:ln w="9525">
-                      <a:noFill/>
-                      <a:headEnd/>
-                      <a:tailEnd/>
-                    </a:ln>
-                  </pic:spPr>
-                </pic:pic>
-              </a:graphicData>
-            </a:graphic>
-          </wp:inline>
-        </w:drawing>
+        <w:t xml:space="preserve">处于同一伤害乘区，但其带来的“武器技能初始学习等级+1（满级可达+2）”属性十分强力。用在</w:t>
+      </w:r>
+      <w:r>
+        <w:t xml:space="preserve"> </w:t>
+      </w:r>
+      <w:r>
+        <w:rPr>
+          <w:bCs/>
+          <w:b/>
+        </w:rPr>
+        <w:t xml:space="preserve">【SS级武器】</w:t>
+      </w:r>
+      <w:r>
+        <w:t xml:space="preserve"> </w:t>
+      </w:r>
+      <w:r>
+        <w:t xml:space="preserve">上，</w:t>
+      </w:r>
+      <w:r>
+        <w:t xml:space="preserve">1</w:t>
+      </w:r>
+      <w:r>
+        <w:rPr>
+          <w:bCs/>
+          <w:b/>
+        </w:rPr>
+        <w:t xml:space="preserve">【红星】</w:t>
+      </w:r>
+      <w:r>
+        <w:t xml:space="preserve">开局即可达到</w:t>
+      </w:r>
+      <w:r>
+        <w:t xml:space="preserve"> </w:t>
+      </w:r>
+      <w:r>
+        <w:t xml:space="preserve">4</w:t>
+      </w:r>
+      <w:r>
+        <w:t xml:space="preserve"> </w:t>
+      </w:r>
+      <w:r>
+        <w:t xml:space="preserve">级，</w:t>
+      </w:r>
+      <w:r>
+        <w:t xml:space="preserve">4</w:t>
+      </w:r>
+      <w:r>
+        <w:rPr>
+          <w:bCs/>
+          <w:b/>
+        </w:rPr>
+        <w:t xml:space="preserve">【红星】</w:t>
+      </w:r>
+      <w:r>
+        <w:t xml:space="preserve">开局直接</w:t>
+      </w:r>
+      <w:r>
+        <w:t xml:space="preserve"> </w:t>
+      </w:r>
+      <w:r>
+        <w:t xml:space="preserve">5</w:t>
+      </w:r>
+      <w:r>
+        <w:t xml:space="preserve"> </w:t>
+      </w:r>
+      <w:r>
+        <w:t xml:space="preserve">级（满级），对</w:t>
+      </w:r>
+      <w:r>
+        <w:rPr>
+          <w:bCs/>
+          <w:b/>
+        </w:rPr>
+        <w:t xml:space="preserve">【回响之战】</w:t>
+      </w:r>
+      <w:r>
+        <w:t xml:space="preserve">的体验有着颠覆性的提升。平民与微氪玩家可以考虑从“解锁</w:t>
+      </w:r>
+      <w:r>
+        <w:t xml:space="preserve"> </w:t>
+      </w:r>
+      <m:oMath>
+        <m:r>
+          <m:rPr>
+            <m:sty m:val="p"/>
+          </m:rPr>
+          <m:t>→</m:t>
+        </m:r>
+      </m:oMath>
+      <w:r>
+        <w:t xml:space="preserve"> </w:t>
+      </w:r>
+      <w:r>
+        <w:t xml:space="preserve">1</w:t>
+      </w:r>
+      <w:r>
+        <w:rPr>
+          <w:bCs/>
+          <w:b/>
+        </w:rPr>
+        <w:t xml:space="preserve">【红星】</w:t>
+      </w:r>
+      <w:r>
+        <w:t xml:space="preserve"> </w:t>
+      </w:r>
+      <m:oMath>
+        <m:r>
+          <m:rPr>
+            <m:sty m:val="p"/>
+          </m:rPr>
+          <m:t>→</m:t>
+        </m:r>
+      </m:oMath>
+      <w:r>
+        <w:t xml:space="preserve"> </w:t>
+      </w:r>
+      <w:r>
+        <w:t xml:space="preserve">2</w:t>
+      </w:r>
+      <w:r>
+        <w:rPr>
+          <w:bCs/>
+          <w:b/>
+        </w:rPr>
+        <w:t xml:space="preserve">【红星】</w:t>
+      </w:r>
+      <w:r>
+        <w:t xml:space="preserve"> </w:t>
+      </w:r>
+      <m:oMath>
+        <m:r>
+          <m:rPr>
+            <m:sty m:val="p"/>
+          </m:rPr>
+          <m:t>→</m:t>
+        </m:r>
+      </m:oMath>
+      <w:r>
+        <w:t xml:space="preserve"> </w:t>
+      </w:r>
+      <w:r>
+        <w:t xml:space="preserve">4</w:t>
+      </w:r>
+      <w:r>
+        <w:rPr>
+          <w:bCs/>
+          <w:b/>
+        </w:rPr>
+        <w:t xml:space="preserve">【红星】</w:t>
+      </w:r>
+      <w:r>
+        <w:t xml:space="preserve">”逐步培养；重氪玩家则推荐直接拉满至</w:t>
+      </w:r>
+      <w:r>
+        <w:t xml:space="preserve"> </w:t>
+      </w:r>
+      <w:r>
+        <w:t xml:space="preserve">4</w:t>
+      </w:r>
+      <w:r>
+        <w:rPr>
+          <w:bCs/>
+          <w:b/>
+        </w:rPr>
+        <w:t xml:space="preserve">【红星】</w:t>
+      </w:r>
+      <w:r>
+        <w:t xml:space="preserve"> </w:t>
+      </w:r>
+      <w:r>
+        <w:t xml:space="preserve">或</w:t>
+      </w:r>
+      <w:r>
+        <w:t xml:space="preserve"> </w:t>
+      </w:r>
+      <w:r>
+        <w:t xml:space="preserve">6</w:t>
+      </w:r>
+      <w:r>
+        <w:rPr>
+          <w:bCs/>
+          <w:b/>
+        </w:rPr>
+        <w:t xml:space="preserve">【红星】</w:t>
       </w:r>
       <w:r>
         <w:t xml:space="preserve">。</w:t>
@@ -900,7 +827,7 @@
         </w:numPr>
         <w:pStyle w:val="Heading2"/>
       </w:pPr>
-      <w:bookmarkStart w:id="56" w:name="解锁需要票数转盘解锁共需-300-票"/>
+      <w:bookmarkStart w:id="41" w:name="解锁需要票数转盘解锁共需-300-票"/>
       <w:r>
         <w:rPr>
           <w:bCs/>
@@ -927,10 +854,10 @@
       <w:r>
         <w:t xml:space="preserve">票。</w:t>
       </w:r>
-      <w:bookmarkEnd w:id="56"/>
+      <w:bookmarkEnd w:id="41"/>
     </w:p>
-    <w:bookmarkEnd w:id="57"/>
-    <w:bookmarkStart w:id="62" w:name="三火神锤抽奖券任务产出统计"/>
+    <w:bookmarkEnd w:id="42"/>
+    <w:bookmarkStart w:id="47" w:name="三火神锤抽奖券任务产出统计"/>
     <w:p>
       <w:pPr>
         <w:pStyle w:val="Heading2"/>
@@ -1168,19 +1095,41 @@
         <w:t xml:space="preserve"> </w:t>
       </w:r>
       <w:r>
-        <w:t xml:space="preserve">- 1张票 = 300</w:t>
+        <w:t xml:space="preserve">-</w:t>
+      </w:r>
+      <w:r>
+        <w:t xml:space="preserve"> </w:t>
+      </w:r>
+      <w:r>
+        <w:t xml:space="preserve">1</w:t>
+      </w:r>
+      <w:r>
+        <w:t xml:space="preserve">张票 =</w:t>
+      </w:r>
+      <w:r>
+        <w:t xml:space="preserve"> </w:t>
+      </w:r>
+      <w:r>
+        <w:t xml:space="preserve">300</w:t>
+      </w:r>
+      <w:r>
+        <w:rPr>
+          <w:bCs/>
+          <w:b/>
+        </w:rPr>
+        <w:t xml:space="preserve">【钻石】</w:t>
       </w:r>
       <w:r>
         <w:drawing>
           <wp:inline>
             <wp:extent cx="228600" cy="228600"/>
             <wp:effectExtent b="0" l="0" r="0" t="0"/>
-            <wp:docPr descr="钻石" title="" id="58" name="Picture"/>
+            <wp:docPr descr="钻石" title="" id="43" name="Picture"/>
             <a:graphic>
               <a:graphicData uri="http://schemas.openxmlformats.org/drawingml/2006/picture">
                 <pic:pic>
                   <pic:nvPicPr>
-                    <pic:cNvPr descr="assets/img/道具/钻石.png" id="59" name="Picture"/>
+                    <pic:cNvPr descr="assets/img/道具/钻石.png" id="44" name="Picture"/>
                     <pic:cNvPicPr>
                       <a:picLocks noChangeArrowheads="1" noChangeAspect="1"/>
                     </pic:cNvPicPr>
@@ -1245,16 +1194,23 @@
         <w:t xml:space="preserve"> </w:t>
       </w:r>
       <w:r>
+        <w:rPr>
+          <w:bCs/>
+          <w:b/>
+        </w:rPr>
+        <w:t xml:space="preserve">【钻石】</w:t>
+      </w:r>
+      <w:r>
         <w:drawing>
           <wp:inline>
             <wp:extent cx="228600" cy="228600"/>
             <wp:effectExtent b="0" l="0" r="0" t="0"/>
-            <wp:docPr descr="钻石" title="" id="60" name="Picture"/>
+            <wp:docPr descr="钻石" title="" id="45" name="Picture"/>
             <a:graphic>
               <a:graphicData uri="http://schemas.openxmlformats.org/drawingml/2006/picture">
                 <pic:pic>
                   <pic:nvPicPr>
-                    <pic:cNvPr descr="assets/img/道具/钻石.png" id="61" name="Picture"/>
+                    <pic:cNvPr descr="assets/img/道具/钻石.png" id="46" name="Picture"/>
                     <pic:cNvPicPr>
                       <a:picLocks noChangeArrowheads="1" noChangeAspect="1"/>
                     </pic:cNvPicPr>
@@ -1297,8 +1253,8 @@
         </w:pict>
       </w:r>
     </w:p>
-    <w:bookmarkEnd w:id="62"/>
-    <w:bookmarkStart w:id="100" w:name="四不同预算段获取方案推荐"/>
+    <w:bookmarkEnd w:id="47"/>
+    <w:bookmarkStart w:id="102" w:name="四不同预算段获取方案推荐"/>
     <w:p>
       <w:pPr>
         <w:pStyle w:val="Heading2"/>
@@ -1307,7 +1263,7 @@
         <w:t xml:space="preserve">四、不同预算段获取方案推荐</w:t>
       </w:r>
     </w:p>
-    <w:bookmarkStart w:id="65" w:name="方案一适度氪金方案"/>
+    <w:bookmarkStart w:id="56" w:name="方案一适度氪金方案"/>
     <w:p>
       <w:pPr>
         <w:pStyle w:val="Heading3"/>
@@ -1361,22 +1317,45 @@
           <w:bCs/>
           <w:b/>
         </w:rPr>
-        <w:t xml:space="preserve">128元礼包</w:t>
-      </w:r>
-      <w:r>
-        <w:t xml:space="preserve">。对比直接买45,000</w:t>
+        <w:t xml:space="preserve">128</w:t>
+      </w:r>
+      <w:r>
+        <w:rPr>
+          <w:bCs/>
+          <w:b/>
+        </w:rPr>
+        <w:t xml:space="preserve">元礼包</w:t>
+      </w:r>
+      <w:r>
+        <w:t xml:space="preserve">。对比直接买</w:t>
+      </w:r>
+      <w:r>
+        <w:t xml:space="preserve"> </w:t>
+      </w:r>
+      <w:r>
+        <w:t xml:space="preserve">45,000</w:t>
+      </w:r>
+      <w:r>
+        <w:t xml:space="preserve"> </w:t>
+      </w:r>
+      <w:r>
+        <w:rPr>
+          <w:bCs/>
+          <w:b/>
+        </w:rPr>
+        <w:t xml:space="preserve">【钻石】</w:t>
       </w:r>
       <w:r>
         <w:drawing>
           <wp:inline>
             <wp:extent cx="228600" cy="228600"/>
             <wp:effectExtent b="0" l="0" r="0" t="0"/>
-            <wp:docPr descr="钻石" title="" id="63" name="Picture"/>
+            <wp:docPr descr="钻石" title="" id="48" name="Picture"/>
             <a:graphic>
               <a:graphicData uri="http://schemas.openxmlformats.org/drawingml/2006/picture">
                 <pic:pic>
                   <pic:nvPicPr>
-                    <pic:cNvPr descr="assets/img/道具/钻石.png" id="64" name="Picture"/>
+                    <pic:cNvPr descr="assets/img/道具/钻石.png" id="49" name="Picture"/>
                     <pic:cNvPicPr>
                       <a:picLocks noChangeArrowheads="1" noChangeAspect="1"/>
                     </pic:cNvPicPr>
@@ -1409,11 +1388,124 @@
         </w:drawing>
       </w:r>
       <w:r>
-        <w:t xml:space="preserve">，该礼包性价比极高。买完后多余的转盘票数可用于获取星级道具和其他稀有奖励。</w:t>
+        <w:t xml:space="preserve">，该礼包性价比极高。买完后多余的转盘票数可用于获取其他稀有奖励，如</w:t>
+      </w:r>
+      <w:r>
+        <w:t xml:space="preserve"> </w:t>
+      </w:r>
+      <w:r>
+        <w:rPr>
+          <w:bCs/>
+          <w:b/>
+        </w:rPr>
+        <w:t xml:space="preserve">【末世战马碎片】</w:t>
+      </w:r>
+      <w:r>
+        <w:drawing>
+          <wp:inline>
+            <wp:extent cx="228600" cy="228600"/>
+            <wp:effectExtent b="0" l="0" r="0" t="0"/>
+            <wp:docPr descr="末世战马碎片" title="" id="51" name="Picture"/>
+            <a:graphic>
+              <a:graphicData uri="http://schemas.openxmlformats.org/drawingml/2006/picture">
+                <pic:pic>
+                  <pic:nvPicPr>
+                    <pic:cNvPr descr="assets/img/碎片/末世战马碎片.png" id="52" name="Picture"/>
+                    <pic:cNvPicPr>
+                      <a:picLocks noChangeArrowheads="1" noChangeAspect="1"/>
+                    </pic:cNvPicPr>
+                  </pic:nvPicPr>
+                  <pic:blipFill>
+                    <a:blip r:embed="rId50"/>
+                    <a:stretch>
+                      <a:fillRect/>
+                    </a:stretch>
+                  </pic:blipFill>
+                  <pic:spPr bwMode="auto">
+                    <a:xfrm>
+                      <a:off x="0" y="0"/>
+                      <a:ext cx="228600" cy="228600"/>
+                    </a:xfrm>
+                    <a:prstGeom prst="rect">
+                      <a:avLst/>
+                    </a:prstGeom>
+                    <a:noFill/>
+                    <a:ln w="9525">
+                      <a:noFill/>
+                      <a:headEnd/>
+                      <a:tailEnd/>
+                    </a:ln>
+                  </pic:spPr>
+                </pic:pic>
+              </a:graphicData>
+            </a:graphic>
+          </wp:inline>
+        </w:drawing>
+      </w:r>
+      <w:r>
+        <w:t xml:space="preserve"> </w:t>
+      </w:r>
+      <w:r>
+        <w:t xml:space="preserve">和</w:t>
+      </w:r>
+      <w:r>
+        <w:t xml:space="preserve"> </w:t>
+      </w:r>
+      <w:r>
+        <w:rPr>
+          <w:bCs/>
+          <w:b/>
+        </w:rPr>
+        <w:t xml:space="preserve">【核心自选宝箱精华】</w:t>
+      </w:r>
+      <w:r>
+        <w:drawing>
+          <wp:inline>
+            <wp:extent cx="228600" cy="228600"/>
+            <wp:effectExtent b="0" l="0" r="0" t="0"/>
+            <wp:docPr descr="核心自选宝箱精华" title="" id="54" name="Picture"/>
+            <a:graphic>
+              <a:graphicData uri="http://schemas.openxmlformats.org/drawingml/2006/picture">
+                <pic:pic>
+                  <pic:nvPicPr>
+                    <pic:cNvPr descr="assets/img/道具/核心自选宝箱精华.png" id="55" name="Picture"/>
+                    <pic:cNvPicPr>
+                      <a:picLocks noChangeArrowheads="1" noChangeAspect="1"/>
+                    </pic:cNvPicPr>
+                  </pic:nvPicPr>
+                  <pic:blipFill>
+                    <a:blip r:embed="rId53"/>
+                    <a:stretch>
+                      <a:fillRect/>
+                    </a:stretch>
+                  </pic:blipFill>
+                  <pic:spPr bwMode="auto">
+                    <a:xfrm>
+                      <a:off x="0" y="0"/>
+                      <a:ext cx="228600" cy="228600"/>
+                    </a:xfrm>
+                    <a:prstGeom prst="rect">
+                      <a:avLst/>
+                    </a:prstGeom>
+                    <a:noFill/>
+                    <a:ln w="9525">
+                      <a:noFill/>
+                      <a:headEnd/>
+                      <a:tailEnd/>
+                    </a:ln>
+                  </pic:spPr>
+                </pic:pic>
+              </a:graphicData>
+            </a:graphic>
+          </wp:inline>
+        </w:drawing>
+      </w:r>
+      <w:r>
+        <w:t xml:space="preserve">。</w:t>
       </w:r>
     </w:p>
-    <w:bookmarkEnd w:id="65"/>
-    <w:bookmarkStart w:id="70" w:name="方案二完全白嫖钻石直购方案"/>
+    <w:bookmarkEnd w:id="56"/>
+    <w:bookmarkStart w:id="63" w:name="方案二完全白嫖钻石直购方案"/>
     <w:p>
       <w:pPr>
         <w:pStyle w:val="Heading3"/>
@@ -1438,19 +1530,26 @@
         <w:t xml:space="preserve">适用人群</w:t>
       </w:r>
       <w:r>
-        <w:t xml:space="preserve">：无氪、拥有充足</w:t>
+        <w:t xml:space="preserve">：零氪或拥有充足</w:t>
+      </w:r>
+      <w:r>
+        <w:rPr>
+          <w:bCs/>
+          <w:b/>
+        </w:rPr>
+        <w:t xml:space="preserve">【钻石】</w:t>
       </w:r>
       <w:r>
         <w:drawing>
           <wp:inline>
             <wp:extent cx="228600" cy="228600"/>
             <wp:effectExtent b="0" l="0" r="0" t="0"/>
-            <wp:docPr descr="钻石" title="" id="66" name="Picture"/>
+            <wp:docPr descr="钻石" title="" id="57" name="Picture"/>
             <a:graphic>
               <a:graphicData uri="http://schemas.openxmlformats.org/drawingml/2006/picture">
                 <pic:pic>
                   <pic:nvPicPr>
-                    <pic:cNvPr descr="assets/img/道具/钻石.png" id="67" name="Picture"/>
+                    <pic:cNvPr descr="assets/img/道具/钻石.png" id="58" name="Picture"/>
                     <pic:cNvPicPr>
                       <a:picLocks noChangeArrowheads="1" noChangeAspect="1"/>
                     </pic:cNvPicPr>
@@ -1502,7 +1601,19 @@
         <w:t xml:space="preserve">具体策略</w:t>
       </w:r>
       <w:r>
-        <w:t xml:space="preserve">：拉满所有活动任务（白嫖 105 张券），最后一天定好闹钟（以免活动期间官方送券而浪费钻石），使用</w:t>
+        <w:t xml:space="preserve">：拉满所有活动任务（白嫖</w:t>
+      </w:r>
+      <w:r>
+        <w:t xml:space="preserve"> </w:t>
+      </w:r>
+      <w:r>
+        <w:t xml:space="preserve">105</w:t>
+      </w:r>
+      <w:r>
+        <w:t xml:space="preserve"> </w:t>
+      </w:r>
+      <w:r>
+        <w:t xml:space="preserve">张券），最后一天定好闹钟（以免活动期间官方通过其他途径送券而多花钻石），使用</w:t>
       </w:r>
       <w:r>
         <w:t xml:space="preserve"> </w:t>
@@ -1516,18 +1627,25 @@
       </w:r>
       <w:r>
         <w:t xml:space="preserve"> </w:t>
+      </w:r>
+      <w:r>
+        <w:rPr>
+          <w:bCs/>
+          <w:b/>
+        </w:rPr>
+        <w:t xml:space="preserve">【钻石】</w:t>
       </w:r>
       <w:r>
         <w:drawing>
           <wp:inline>
             <wp:extent cx="228600" cy="228600"/>
             <wp:effectExtent b="0" l="0" r="0" t="0"/>
-            <wp:docPr descr="钻石" title="" id="68" name="Picture"/>
+            <wp:docPr descr="钻石" title="" id="59" name="Picture"/>
             <a:graphic>
               <a:graphicData uri="http://schemas.openxmlformats.org/drawingml/2006/picture">
                 <pic:pic>
                   <pic:nvPicPr>
-                    <pic:cNvPr descr="assets/img/道具/钻石.png" id="69" name="Picture"/>
+                    <pic:cNvPr descr="assets/img/道具/钻石.png" id="60" name="Picture"/>
                     <pic:cNvPicPr>
                       <a:picLocks noChangeArrowheads="1" noChangeAspect="1"/>
                     </pic:cNvPicPr>
@@ -1579,76 +1697,32 @@
         <w:t xml:space="preserve"> </w:t>
       </w:r>
       <w:r>
-        <w:t xml:space="preserve">张券，即可成功解锁。</w:t>
-      </w:r>
-    </w:p>
-    <w:bookmarkEnd w:id="70"/>
-    <w:bookmarkStart w:id="84" w:name="方案三任务-钻石自选礼包方案"/>
-    <w:p>
-      <w:pPr>
-        <w:pStyle w:val="Heading3"/>
-      </w:pPr>
-      <w:r>
-        <w:t xml:space="preserve">方案三：任务 + 钻石自选礼包方案</w:t>
-      </w:r>
-    </w:p>
-    <w:p>
-      <w:pPr>
-        <w:numPr>
-          <w:ilvl w:val="0"/>
-          <w:numId w:val="1005"/>
-        </w:numPr>
-        <w:pStyle w:val="Compact"/>
-      </w:pPr>
-      <w:r>
-        <w:rPr>
-          <w:bCs/>
-          <w:b/>
-        </w:rPr>
-        <w:t xml:space="preserve">适用人群</w:t>
-      </w:r>
-      <w:r>
-        <w:t xml:space="preserve">：钻石充足、希望同时补齐其他核心养成资源的玩家。</w:t>
-      </w:r>
-    </w:p>
-    <w:p>
-      <w:pPr>
-        <w:numPr>
-          <w:ilvl w:val="0"/>
-          <w:numId w:val="1005"/>
-        </w:numPr>
-        <w:pStyle w:val="Compact"/>
-      </w:pPr>
-      <w:r>
-        <w:rPr>
-          <w:bCs/>
-          <w:b/>
-        </w:rPr>
-        <w:t xml:space="preserve">具体策略</w:t>
-      </w:r>
-      <w:r>
-        <w:t xml:space="preserve">：拉满任务（105张券），购买包含</w:t>
-      </w:r>
-      <w:r>
-        <w:t xml:space="preserve"> </w:t>
+        <w:t xml:space="preserve">张券，即可成功解锁</w:t>
+      </w:r>
+      <w:r>
+        <w:rPr>
+          <w:bCs/>
+          <w:b/>
+        </w:rPr>
+        <w:t xml:space="preserve">【伏尔甘】</w:t>
       </w:r>
       <w:r>
         <w:drawing>
           <wp:inline>
             <wp:extent cx="228600" cy="228600"/>
             <wp:effectExtent b="0" l="0" r="0" t="0"/>
-            <wp:docPr descr="异宠核心自选" title="" id="72" name="Picture"/>
+            <wp:docPr descr="伏尔甘" title="" id="61" name="Picture"/>
             <a:graphic>
               <a:graphicData uri="http://schemas.openxmlformats.org/drawingml/2006/picture">
                 <pic:pic>
                   <pic:nvPicPr>
-                    <pic:cNvPr descr="assets/img/宝箱/异宠核心自选宝箱.png" id="73" name="Picture"/>
+                    <pic:cNvPr descr="assets/img/特工/伏尔甘.png" id="62" name="Picture"/>
                     <pic:cNvPicPr>
                       <a:picLocks noChangeArrowheads="1" noChangeAspect="1"/>
                     </pic:cNvPicPr>
                   </pic:nvPicPr>
                   <pic:blipFill>
-                    <a:blip r:embed="rId71"/>
+                    <a:blip r:embed="rId20"/>
                     <a:stretch>
                       <a:fillRect/>
                     </a:stretch>
@@ -1675,31 +1749,89 @@
         </w:drawing>
       </w:r>
       <w:r>
-        <w:t xml:space="preserve"> </w:t>
-      </w:r>
-      <w:r>
-        <w:t xml:space="preserve">和</w:t>
-      </w:r>
-      <w:r>
-        <w:t xml:space="preserve"> </w:t>
+        <w:t xml:space="preserve">。</w:t>
+      </w:r>
+    </w:p>
+    <w:bookmarkEnd w:id="63"/>
+    <w:bookmarkStart w:id="79" w:name="方案三任务-钻石自选礼包方案"/>
+    <w:p>
+      <w:pPr>
+        <w:pStyle w:val="Heading3"/>
+      </w:pPr>
+      <w:r>
+        <w:t xml:space="preserve">方案三：任务 + 钻石自选礼包方案</w:t>
+      </w:r>
+    </w:p>
+    <w:p>
+      <w:pPr>
+        <w:numPr>
+          <w:ilvl w:val="0"/>
+          <w:numId w:val="1005"/>
+        </w:numPr>
+        <w:pStyle w:val="Compact"/>
+      </w:pPr>
+      <w:r>
+        <w:rPr>
+          <w:bCs/>
+          <w:b/>
+        </w:rPr>
+        <w:t xml:space="preserve">适用人群</w:t>
+      </w:r>
+      <w:r>
+        <w:t xml:space="preserve">：钻石充足、希望同时补齐其他核心养成资源的玩家。</w:t>
+      </w:r>
+    </w:p>
+    <w:p>
+      <w:pPr>
+        <w:numPr>
+          <w:ilvl w:val="0"/>
+          <w:numId w:val="1005"/>
+        </w:numPr>
+        <w:pStyle w:val="Compact"/>
+      </w:pPr>
+      <w:r>
+        <w:rPr>
+          <w:bCs/>
+          <w:b/>
+        </w:rPr>
+        <w:t xml:space="preserve">具体策略</w:t>
+      </w:r>
+      <w:r>
+        <w:t xml:space="preserve">：拉满任务（</w:t>
+      </w:r>
+      <w:r>
+        <w:t xml:space="preserve">105</w:t>
+      </w:r>
+      <w:r>
+        <w:t xml:space="preserve">张券），购买包含</w:t>
+      </w:r>
+      <w:r>
+        <w:t xml:space="preserve"> </w:t>
+      </w:r>
+      <w:r>
+        <w:rPr>
+          <w:bCs/>
+          <w:b/>
+        </w:rPr>
+        <w:t xml:space="preserve">【异宠核心自选】</w:t>
       </w:r>
       <w:r>
         <w:drawing>
           <wp:inline>
             <wp:extent cx="228600" cy="228600"/>
             <wp:effectExtent b="0" l="0" r="0" t="0"/>
-            <wp:docPr descr="谐振芯片自选" title="" id="75" name="Picture"/>
+            <wp:docPr descr="异宠核心自选" title="" id="65" name="Picture"/>
             <a:graphic>
               <a:graphicData uri="http://schemas.openxmlformats.org/drawingml/2006/picture">
                 <pic:pic>
                   <pic:nvPicPr>
-                    <pic:cNvPr descr="assets/img/宝箱/谐振芯片自选宝箱.png" id="76" name="Picture"/>
+                    <pic:cNvPr descr="assets/img/宝箱/异宠核心自选宝箱.png" id="66" name="Picture"/>
                     <pic:cNvPicPr>
                       <a:picLocks noChangeArrowheads="1" noChangeAspect="1"/>
                     </pic:cNvPicPr>
                   </pic:nvPicPr>
                   <pic:blipFill>
-                    <a:blip r:embed="rId74"/>
+                    <a:blip r:embed="rId64"/>
                     <a:stretch>
                       <a:fillRect/>
                     </a:stretch>
@@ -1729,28 +1861,35 @@
         <w:t xml:space="preserve"> </w:t>
       </w:r>
       <w:r>
-        <w:t xml:space="preserve">的特惠自选箱礼包（不推荐包含</w:t>
-      </w:r>
-      <w:r>
-        <w:t xml:space="preserve"> </w:t>
+        <w:t xml:space="preserve">和</w:t>
+      </w:r>
+      <w:r>
+        <w:t xml:space="preserve"> </w:t>
+      </w:r>
+      <w:r>
+        <w:rPr>
+          <w:bCs/>
+          <w:b/>
+        </w:rPr>
+        <w:t xml:space="preserve">【谐振芯片自选】</w:t>
       </w:r>
       <w:r>
         <w:drawing>
           <wp:inline>
             <wp:extent cx="228600" cy="228600"/>
             <wp:effectExtent b="0" l="0" r="0" t="0"/>
-            <wp:docPr descr="神器核心自选" title="" id="78" name="Picture"/>
+            <wp:docPr descr="谐振芯片自选" title="" id="68" name="Picture"/>
             <a:graphic>
               <a:graphicData uri="http://schemas.openxmlformats.org/drawingml/2006/picture">
                 <pic:pic>
                   <pic:nvPicPr>
-                    <pic:cNvPr descr="assets/img/宝箱/神器核心自选宝箱png.png" id="79" name="Picture"/>
+                    <pic:cNvPr descr="assets/img/宝箱/谐振芯片自选宝箱.png" id="69" name="Picture"/>
                     <pic:cNvPicPr>
                       <a:picLocks noChangeArrowheads="1" noChangeAspect="1"/>
                     </pic:cNvPicPr>
                   </pic:nvPicPr>
                   <pic:blipFill>
-                    <a:blip r:embed="rId77"/>
+                    <a:blip r:embed="rId67"/>
                     <a:stretch>
                       <a:fillRect/>
                     </a:stretch>
@@ -1780,7 +1919,335 @@
         <w:t xml:space="preserve"> </w:t>
       </w:r>
       <w:r>
+        <w:t xml:space="preserve">的自选箱礼包（不推荐包含</w:t>
+      </w:r>
+      <w:r>
+        <w:t xml:space="preserve"> </w:t>
+      </w:r>
+      <w:r>
+        <w:rPr>
+          <w:bCs/>
+          <w:b/>
+        </w:rPr>
+        <w:t xml:space="preserve">【神器核心自选】</w:t>
+      </w:r>
+      <w:r>
+        <w:drawing>
+          <wp:inline>
+            <wp:extent cx="228600" cy="228600"/>
+            <wp:effectExtent b="0" l="0" r="0" t="0"/>
+            <wp:docPr descr="神器核心自选" title="" id="71" name="Picture"/>
+            <a:graphic>
+              <a:graphicData uri="http://schemas.openxmlformats.org/drawingml/2006/picture">
+                <pic:pic>
+                  <pic:nvPicPr>
+                    <pic:cNvPr descr="assets/img/宝箱/神器核心自选宝箱png.png" id="72" name="Picture"/>
+                    <pic:cNvPicPr>
+                      <a:picLocks noChangeArrowheads="1" noChangeAspect="1"/>
+                    </pic:cNvPicPr>
+                  </pic:nvPicPr>
+                  <pic:blipFill>
+                    <a:blip r:embed="rId70"/>
+                    <a:stretch>
+                      <a:fillRect/>
+                    </a:stretch>
+                  </pic:blipFill>
+                  <pic:spPr bwMode="auto">
+                    <a:xfrm>
+                      <a:off x="0" y="0"/>
+                      <a:ext cx="228600" cy="228600"/>
+                    </a:xfrm>
+                    <a:prstGeom prst="rect">
+                      <a:avLst/>
+                    </a:prstGeom>
+                    <a:noFill/>
+                    <a:ln w="9525">
+                      <a:noFill/>
+                      <a:headEnd/>
+                      <a:tailEnd/>
+                    </a:ln>
+                  </pic:spPr>
+                </pic:pic>
+              </a:graphicData>
+            </a:graphic>
+          </wp:inline>
+        </w:drawing>
+      </w:r>
+      <w:r>
+        <w:t xml:space="preserve"> </w:t>
+      </w:r>
+      <w:r>
         <w:t xml:space="preserve">的礼包）。购买完礼包后，再使用</w:t>
+      </w:r>
+      <w:r>
+        <w:rPr>
+          <w:bCs/>
+          <w:b/>
+        </w:rPr>
+        <w:t xml:space="preserve">【钻石】</w:t>
+      </w:r>
+      <w:r>
+        <w:drawing>
+          <wp:inline>
+            <wp:extent cx="228600" cy="228600"/>
+            <wp:effectExtent b="0" l="0" r="0" t="0"/>
+            <wp:docPr descr="钻石" title="" id="73" name="Picture"/>
+            <a:graphic>
+              <a:graphicData uri="http://schemas.openxmlformats.org/drawingml/2006/picture">
+                <pic:pic>
+                  <pic:nvPicPr>
+                    <pic:cNvPr descr="assets/img/道具/钻石.png" id="74" name="Picture"/>
+                    <pic:cNvPicPr>
+                      <a:picLocks noChangeArrowheads="1" noChangeAspect="1"/>
+                    </pic:cNvPicPr>
+                  </pic:nvPicPr>
+                  <pic:blipFill>
+                    <a:blip r:embed="rId30"/>
+                    <a:stretch>
+                      <a:fillRect/>
+                    </a:stretch>
+                  </pic:blipFill>
+                  <pic:spPr bwMode="auto">
+                    <a:xfrm>
+                      <a:off x="0" y="0"/>
+                      <a:ext cx="228600" cy="228600"/>
+                    </a:xfrm>
+                    <a:prstGeom prst="rect">
+                      <a:avLst/>
+                    </a:prstGeom>
+                    <a:noFill/>
+                    <a:ln w="9525">
+                      <a:noFill/>
+                      <a:headEnd/>
+                      <a:tailEnd/>
+                    </a:ln>
+                  </pic:spPr>
+                </pic:pic>
+              </a:graphicData>
+            </a:graphic>
+          </wp:inline>
+        </w:drawing>
+      </w:r>
+      <w:r>
+        <w:t xml:space="preserve">补齐</w:t>
+      </w:r>
+      <w:r>
+        <w:t xml:space="preserve"> </w:t>
+      </w:r>
+      <w:r>
+        <w:rPr>
+          <w:bCs/>
+          <w:b/>
+        </w:rPr>
+        <w:t xml:space="preserve">130</w:t>
+      </w:r>
+      <w:r>
+        <w:t xml:space="preserve"> </w:t>
+      </w:r>
+      <w:r>
+        <w:t xml:space="preserve">张券（相当于</w:t>
+      </w:r>
+      <w:r>
+        <w:t xml:space="preserve"> </w:t>
+      </w:r>
+      <w:r>
+        <w:rPr>
+          <w:bCs/>
+          <w:b/>
+        </w:rPr>
+        <w:t xml:space="preserve">39,000</w:t>
+      </w:r>
+      <w:r>
+        <w:t xml:space="preserve"> </w:t>
+      </w:r>
+      <w:r>
+        <w:rPr>
+          <w:bCs/>
+          <w:b/>
+        </w:rPr>
+        <w:t xml:space="preserve">【钻石】</w:t>
+      </w:r>
+      <w:r>
+        <w:drawing>
+          <wp:inline>
+            <wp:extent cx="228600" cy="228600"/>
+            <wp:effectExtent b="0" l="0" r="0" t="0"/>
+            <wp:docPr descr="钻石" title="" id="75" name="Picture"/>
+            <a:graphic>
+              <a:graphicData uri="http://schemas.openxmlformats.org/drawingml/2006/picture">
+                <pic:pic>
+                  <pic:nvPicPr>
+                    <pic:cNvPr descr="assets/img/道具/钻石.png" id="76" name="Picture"/>
+                    <pic:cNvPicPr>
+                      <a:picLocks noChangeArrowheads="1" noChangeAspect="1"/>
+                    </pic:cNvPicPr>
+                  </pic:nvPicPr>
+                  <pic:blipFill>
+                    <a:blip r:embed="rId30"/>
+                    <a:stretch>
+                      <a:fillRect/>
+                    </a:stretch>
+                  </pic:blipFill>
+                  <pic:spPr bwMode="auto">
+                    <a:xfrm>
+                      <a:off x="0" y="0"/>
+                      <a:ext cx="228600" cy="228600"/>
+                    </a:xfrm>
+                    <a:prstGeom prst="rect">
+                      <a:avLst/>
+                    </a:prstGeom>
+                    <a:noFill/>
+                    <a:ln w="9525">
+                      <a:noFill/>
+                      <a:headEnd/>
+                      <a:tailEnd/>
+                    </a:ln>
+                  </pic:spPr>
+                </pic:pic>
+              </a:graphicData>
+            </a:graphic>
+          </wp:inline>
+        </w:drawing>
+      </w:r>
+      <w:r>
+        <w:t xml:space="preserve">）即可解锁</w:t>
+      </w:r>
+      <w:r>
+        <w:rPr>
+          <w:bCs/>
+          <w:b/>
+        </w:rPr>
+        <w:t xml:space="preserve">【伏尔甘】</w:t>
+      </w:r>
+      <w:r>
+        <w:drawing>
+          <wp:inline>
+            <wp:extent cx="228600" cy="228600"/>
+            <wp:effectExtent b="0" l="0" r="0" t="0"/>
+            <wp:docPr descr="伏尔甘" title="" id="77" name="Picture"/>
+            <a:graphic>
+              <a:graphicData uri="http://schemas.openxmlformats.org/drawingml/2006/picture">
+                <pic:pic>
+                  <pic:nvPicPr>
+                    <pic:cNvPr descr="assets/img/特工/伏尔甘.png" id="78" name="Picture"/>
+                    <pic:cNvPicPr>
+                      <a:picLocks noChangeArrowheads="1" noChangeAspect="1"/>
+                    </pic:cNvPicPr>
+                  </pic:nvPicPr>
+                  <pic:blipFill>
+                    <a:blip r:embed="rId20"/>
+                    <a:stretch>
+                      <a:fillRect/>
+                    </a:stretch>
+                  </pic:blipFill>
+                  <pic:spPr bwMode="auto">
+                    <a:xfrm>
+                      <a:off x="0" y="0"/>
+                      <a:ext cx="228600" cy="228600"/>
+                    </a:xfrm>
+                    <a:prstGeom prst="rect">
+                      <a:avLst/>
+                    </a:prstGeom>
+                    <a:noFill/>
+                    <a:ln w="9525">
+                      <a:noFill/>
+                      <a:headEnd/>
+                      <a:tailEnd/>
+                    </a:ln>
+                  </pic:spPr>
+                </pic:pic>
+              </a:graphicData>
+            </a:graphic>
+          </wp:inline>
+        </w:drawing>
+      </w:r>
+      <w:r>
+        <w:t xml:space="preserve">。</w:t>
+      </w:r>
+    </w:p>
+    <w:bookmarkEnd w:id="79"/>
+    <w:bookmarkStart w:id="101" w:name="方案四拉满任务-购买128元礼包方案"/>
+    <w:p>
+      <w:pPr>
+        <w:pStyle w:val="Heading3"/>
+      </w:pPr>
+      <w:r>
+        <w:t xml:space="preserve">方案四：拉满任务 + 购买128元礼包方案</w:t>
+      </w:r>
+    </w:p>
+    <w:p>
+      <w:pPr>
+        <w:numPr>
+          <w:ilvl w:val="0"/>
+          <w:numId w:val="1006"/>
+        </w:numPr>
+        <w:pStyle w:val="Compact"/>
+      </w:pPr>
+      <w:r>
+        <w:rPr>
+          <w:bCs/>
+          <w:b/>
+        </w:rPr>
+        <w:t xml:space="preserve">适用人群</w:t>
+      </w:r>
+      <w:r>
+        <w:t xml:space="preserve">：钻石充足、希望同时补齐其他核心养成资源的微氪玩家。</w:t>
+      </w:r>
+    </w:p>
+    <w:p>
+      <w:pPr>
+        <w:numPr>
+          <w:ilvl w:val="0"/>
+          <w:numId w:val="1006"/>
+        </w:numPr>
+        <w:pStyle w:val="Compact"/>
+      </w:pPr>
+      <w:r>
+        <w:rPr>
+          <w:bCs/>
+          <w:b/>
+        </w:rPr>
+        <w:t xml:space="preserve">具体策略</w:t>
+      </w:r>
+      <w:r>
+        <w:t xml:space="preserve">：拉满任务（</w:t>
+      </w:r>
+      <w:r>
+        <w:t xml:space="preserve">105</w:t>
+      </w:r>
+      <w:r>
+        <w:t xml:space="preserve">张券），购买</w:t>
+      </w:r>
+      <w:r>
+        <w:t xml:space="preserve"> </w:t>
+      </w:r>
+      <w:r>
+        <w:t xml:space="preserve">128</w:t>
+      </w:r>
+      <w:r>
+        <w:t xml:space="preserve"> </w:t>
+      </w:r>
+      <w:r>
+        <w:t xml:space="preserve">元礼包（内含</w:t>
+      </w:r>
+      <w:r>
+        <w:t xml:space="preserve"> </w:t>
+      </w:r>
+      <w:r>
+        <w:t xml:space="preserve">10</w:t>
+      </w:r>
+      <w:r>
+        <w:t xml:space="preserve"> </w:t>
+      </w:r>
+      <w:r>
+        <w:t xml:space="preserve">张券）。购买完礼包后，再使用</w:t>
+      </w:r>
+      <w:r>
+        <w:rPr>
+          <w:bCs/>
+          <w:b/>
+        </w:rPr>
+        <w:t xml:space="preserve">【钻石】</w:t>
       </w:r>
       <w:r>
         <w:drawing>
@@ -1835,7 +2302,7 @@
           <w:bCs/>
           <w:b/>
         </w:rPr>
-        <w:t xml:space="preserve">130</w:t>
+        <w:t xml:space="preserve">185</w:t>
       </w:r>
       <w:r>
         <w:t xml:space="preserve"> </w:t>
@@ -1851,10 +2318,17 @@
           <w:bCs/>
           <w:b/>
         </w:rPr>
-        <w:t xml:space="preserve">39,000</w:t>
-      </w:r>
-      <w:r>
-        <w:t xml:space="preserve"> </w:t>
+        <w:t xml:space="preserve">55,500</w:t>
+      </w:r>
+      <w:r>
+        <w:t xml:space="preserve"> </w:t>
+      </w:r>
+      <w:r>
+        <w:rPr>
+          <w:bCs/>
+          <w:b/>
+        </w:rPr>
+        <w:t xml:space="preserve">【钻石】</w:t>
       </w:r>
       <w:r>
         <w:drawing>
@@ -1899,73 +2373,32 @@
         </w:drawing>
       </w:r>
       <w:r>
-        <w:t xml:space="preserve">）即可解锁。</w:t>
-      </w:r>
-    </w:p>
-    <w:bookmarkEnd w:id="84"/>
-    <w:bookmarkStart w:id="99" w:name="方案四拉满任务-购买128元礼包方案"/>
-    <w:p>
-      <w:pPr>
-        <w:pStyle w:val="Heading3"/>
-      </w:pPr>
-      <w:r>
-        <w:t xml:space="preserve">方案四：拉满任务 + 购买128元礼包方案</w:t>
-      </w:r>
-    </w:p>
-    <w:p>
-      <w:pPr>
-        <w:numPr>
-          <w:ilvl w:val="0"/>
-          <w:numId w:val="1006"/>
-        </w:numPr>
-        <w:pStyle w:val="Compact"/>
-      </w:pPr>
-      <w:r>
-        <w:rPr>
-          <w:bCs/>
-          <w:b/>
-        </w:rPr>
-        <w:t xml:space="preserve">适用人群</w:t>
-      </w:r>
-      <w:r>
-        <w:t xml:space="preserve">：钻石充足、微氪希望同时补齐其他核心养成资源的玩家。</w:t>
-      </w:r>
-    </w:p>
-    <w:p>
-      <w:pPr>
-        <w:numPr>
-          <w:ilvl w:val="0"/>
-          <w:numId w:val="1006"/>
-        </w:numPr>
-        <w:pStyle w:val="Compact"/>
-      </w:pPr>
-      <w:r>
-        <w:rPr>
-          <w:bCs/>
-          <w:b/>
-        </w:rPr>
-        <w:t xml:space="preserve">具体策略</w:t>
-      </w:r>
-      <w:r>
-        <w:t xml:space="preserve">：拉满任务（105张券），购买128元礼包。购买完礼包后，再使用</w:t>
+        <w:t xml:space="preserve">）即可解锁</w:t>
+      </w:r>
+      <w:r>
+        <w:rPr>
+          <w:bCs/>
+          <w:b/>
+        </w:rPr>
+        <w:t xml:space="preserve">【伏尔甘】</w:t>
       </w:r>
       <w:r>
         <w:drawing>
           <wp:inline>
             <wp:extent cx="228600" cy="228600"/>
             <wp:effectExtent b="0" l="0" r="0" t="0"/>
-            <wp:docPr descr="钻石" title="" id="85" name="Picture"/>
+            <wp:docPr descr="伏尔甘" title="" id="84" name="Picture"/>
             <a:graphic>
               <a:graphicData uri="http://schemas.openxmlformats.org/drawingml/2006/picture">
                 <pic:pic>
                   <pic:nvPicPr>
-                    <pic:cNvPr descr="assets/img/道具/钻石.png" id="86" name="Picture"/>
+                    <pic:cNvPr descr="assets/img/特工/伏尔甘.png" id="85" name="Picture"/>
                     <pic:cNvPicPr>
                       <a:picLocks noChangeArrowheads="1" noChangeAspect="1"/>
                     </pic:cNvPicPr>
                   </pic:nvPicPr>
                   <pic:blipFill>
-                    <a:blip r:embed="rId30"/>
+                    <a:blip r:embed="rId20"/>
                     <a:stretch>
                       <a:fillRect/>
                     </a:stretch>
@@ -1992,54 +2425,41 @@
         </w:drawing>
       </w:r>
       <w:r>
-        <w:t xml:space="preserve">补齐</w:t>
-      </w:r>
-      <w:r>
-        <w:t xml:space="preserve"> </w:t>
-      </w:r>
-      <w:r>
-        <w:rPr>
-          <w:bCs/>
-          <w:b/>
-        </w:rPr>
-        <w:t xml:space="preserve">130</w:t>
-      </w:r>
-      <w:r>
-        <w:t xml:space="preserve"> </w:t>
-      </w:r>
-      <w:r>
-        <w:t xml:space="preserve">张券（相当于</w:t>
-      </w:r>
-      <w:r>
-        <w:t xml:space="preserve"> </w:t>
-      </w:r>
-      <w:r>
-        <w:rPr>
-          <w:bCs/>
-          <w:b/>
-        </w:rPr>
-        <w:t xml:space="preserve">39,000</w:t>
-      </w:r>
-      <w:r>
-        <w:t xml:space="preserve"> </w:t>
+        <w:t xml:space="preserve">，同时额外获得</w:t>
+      </w:r>
+      <w:r>
+        <w:t xml:space="preserve"> </w:t>
+      </w:r>
+      <w:r>
+        <w:t xml:space="preserve">80</w:t>
+      </w:r>
+      <w:r>
+        <w:t xml:space="preserve"> </w:t>
+      </w:r>
+      <w:r>
+        <w:rPr>
+          <w:bCs/>
+          <w:b/>
+        </w:rPr>
+        <w:t xml:space="preserve">【火神之锤】</w:t>
       </w:r>
       <w:r>
         <w:drawing>
           <wp:inline>
             <wp:extent cx="228600" cy="228600"/>
             <wp:effectExtent b="0" l="0" r="0" t="0"/>
-            <wp:docPr descr="钻石" title="" id="87" name="Picture"/>
+            <wp:docPr descr="火神之锤" title="" id="87" name="Picture"/>
             <a:graphic>
               <a:graphicData uri="http://schemas.openxmlformats.org/drawingml/2006/picture">
                 <pic:pic>
                   <pic:nvPicPr>
-                    <pic:cNvPr descr="assets/img/道具/钻石.png" id="88" name="Picture"/>
+                    <pic:cNvPr descr="assets/img/活动道具/神火活动/火神之锤.png" id="88" name="Picture"/>
                     <pic:cNvPicPr>
                       <a:picLocks noChangeArrowheads="1" noChangeAspect="1"/>
                     </pic:cNvPicPr>
                   </pic:nvPicPr>
                   <pic:blipFill>
-                    <a:blip r:embed="rId30"/>
+                    <a:blip r:embed="rId86"/>
                     <a:stretch>
                       <a:fillRect/>
                     </a:stretch>
@@ -2066,19 +2486,44 @@
         </w:drawing>
       </w:r>
       <w:r>
-        <w:t xml:space="preserve">）即可多获得80</w:t>
+        <w:t xml:space="preserve"> </w:t>
+      </w:r>
+      <w:r>
+        <w:t xml:space="preserve">碎片用于升星。</w:t>
+      </w:r>
+    </w:p>
+    <w:p>
+      <w:r>
+        <w:pict>
+          <v:rect style="width:0;height:1.5pt" o:hralign="center" o:hrstd="t" o:hr="t"/>
+        </w:pict>
+      </w:r>
+    </w:p>
+    <w:p>
+      <w:pPr>
+        <w:pStyle w:val="FirstParagraph"/>
+      </w:pPr>
+      <w:r>
+        <w:t xml:space="preserve">此外，还有一种特殊情况：如果你目前尚未解锁</w:t>
+      </w:r>
+      <w:r>
+        <w:rPr>
+          <w:bCs/>
+          <w:b/>
+        </w:rPr>
+        <w:t xml:space="preserve">【哪吒】</w:t>
       </w:r>
       <w:r>
         <w:drawing>
           <wp:inline>
             <wp:extent cx="228600" cy="228600"/>
             <wp:effectExtent b="0" l="0" r="0" t="0"/>
-            <wp:docPr descr="火神之锤" title="" id="90" name="Picture"/>
+            <wp:docPr descr="哪吒" title="" id="90" name="Picture"/>
             <a:graphic>
               <a:graphicData uri="http://schemas.openxmlformats.org/drawingml/2006/picture">
                 <pic:pic>
                   <pic:nvPicPr>
-                    <pic:cNvPr descr="assets/img/活动道具/神火活动/火神之锤.png" id="91" name="Picture"/>
+                    <pic:cNvPr descr="assets/img/特工/哪吒.png" id="91" name="Picture"/>
                     <pic:cNvPicPr>
                       <a:picLocks noChangeArrowheads="1" noChangeAspect="1"/>
                     </pic:cNvPicPr>
@@ -2111,34 +2556,26 @@
         </w:drawing>
       </w:r>
       <w:r>
-        <w:t xml:space="preserve">碎片用于升星。</w:t>
-      </w:r>
-    </w:p>
-    <w:p>
-      <w:r>
-        <w:pict>
-          <v:rect style="width:0;height:1.5pt" o:hralign="center" o:hrstd="t" o:hr="t"/>
-        </w:pict>
-      </w:r>
-    </w:p>
-    <w:p>
-      <w:pPr>
-        <w:pStyle w:val="FirstParagraph"/>
-      </w:pPr>
-      <w:r>
-        <w:t xml:space="preserve">此外，还有一种特殊情况：如果你目前尚未解锁哪吒</w:t>
+        <w:t xml:space="preserve">，那么在本次活动中建议优先选择</w:t>
+      </w:r>
+      <w:r>
+        <w:rPr>
+          <w:bCs/>
+          <w:b/>
+        </w:rPr>
+        <w:t xml:space="preserve">【莲花化身】</w:t>
       </w:r>
       <w:r>
         <w:drawing>
           <wp:inline>
             <wp:extent cx="228600" cy="228600"/>
             <wp:effectExtent b="0" l="0" r="0" t="0"/>
-            <wp:docPr descr="哪吒" title="" id="93" name="Picture"/>
+            <wp:docPr descr="莲花化身" title="" id="93" name="Picture"/>
             <a:graphic>
               <a:graphicData uri="http://schemas.openxmlformats.org/drawingml/2006/picture">
                 <pic:pic>
                   <pic:nvPicPr>
-                    <pic:cNvPr descr="assets/img/特工/哪吒.png" id="94" name="Picture"/>
+                    <pic:cNvPr descr="assets/img/活动道具/神火活动/莲花化身.png" id="94" name="Picture"/>
                     <pic:cNvPicPr>
                       <a:picLocks noChangeArrowheads="1" noChangeAspect="1"/>
                     </pic:cNvPicPr>
@@ -2171,19 +2608,148 @@
         </w:drawing>
       </w:r>
       <w:r>
-        <w:t xml:space="preserve">，那么在本次活动中建议优先选择哪吒碎片，待哪吒解锁后再选择伏尔甘</w:t>
+        <w:t xml:space="preserve">，待</w:t>
+      </w:r>
+      <w:r>
+        <w:rPr>
+          <w:bCs/>
+          <w:b/>
+        </w:rPr>
+        <w:t xml:space="preserve">【哪吒】</w:t>
       </w:r>
       <w:r>
         <w:drawing>
           <wp:inline>
             <wp:extent cx="228600" cy="228600"/>
             <wp:effectExtent b="0" l="0" r="0" t="0"/>
-            <wp:docPr descr="伏尔甘" title="" id="95" name="Picture"/>
+            <wp:docPr descr="哪吒" title="" id="95" name="Picture"/>
             <a:graphic>
               <a:graphicData uri="http://schemas.openxmlformats.org/drawingml/2006/picture">
                 <pic:pic>
                   <pic:nvPicPr>
-                    <pic:cNvPr descr="assets/img/特工/伏尔甘.png" id="96" name="Picture"/>
+                    <pic:cNvPr descr="assets/img/特工/哪吒.png" id="96" name="Picture"/>
+                    <pic:cNvPicPr>
+                      <a:picLocks noChangeArrowheads="1" noChangeAspect="1"/>
+                    </pic:cNvPicPr>
+                  </pic:nvPicPr>
+                  <pic:blipFill>
+                    <a:blip r:embed="rId89"/>
+                    <a:stretch>
+                      <a:fillRect/>
+                    </a:stretch>
+                  </pic:blipFill>
+                  <pic:spPr bwMode="auto">
+                    <a:xfrm>
+                      <a:off x="0" y="0"/>
+                      <a:ext cx="228600" cy="228600"/>
+                    </a:xfrm>
+                    <a:prstGeom prst="rect">
+                      <a:avLst/>
+                    </a:prstGeom>
+                    <a:noFill/>
+                    <a:ln w="9525">
+                      <a:noFill/>
+                      <a:headEnd/>
+                      <a:tailEnd/>
+                    </a:ln>
+                  </pic:spPr>
+                </pic:pic>
+              </a:graphicData>
+            </a:graphic>
+          </wp:inline>
+        </w:drawing>
+      </w:r>
+      <w:r>
+        <w:t xml:space="preserve">解锁后再选择</w:t>
+      </w:r>
+      <w:r>
+        <w:rPr>
+          <w:bCs/>
+          <w:b/>
+        </w:rPr>
+        <w:t xml:space="preserve">【火神之锤】</w:t>
+      </w:r>
+      <w:r>
+        <w:drawing>
+          <wp:inline>
+            <wp:extent cx="228600" cy="228600"/>
+            <wp:effectExtent b="0" l="0" r="0" t="0"/>
+            <wp:docPr descr="火神之锤" title="" id="97" name="Picture"/>
+            <a:graphic>
+              <a:graphicData uri="http://schemas.openxmlformats.org/drawingml/2006/picture">
+                <pic:pic>
+                  <pic:nvPicPr>
+                    <pic:cNvPr descr="assets/img/活动道具/神火活动/火神之锤.png" id="98" name="Picture"/>
+                    <pic:cNvPicPr>
+                      <a:picLocks noChangeArrowheads="1" noChangeAspect="1"/>
+                    </pic:cNvPicPr>
+                  </pic:nvPicPr>
+                  <pic:blipFill>
+                    <a:blip r:embed="rId86"/>
+                    <a:stretch>
+                      <a:fillRect/>
+                    </a:stretch>
+                  </pic:blipFill>
+                  <pic:spPr bwMode="auto">
+                    <a:xfrm>
+                      <a:off x="0" y="0"/>
+                      <a:ext cx="228600" cy="228600"/>
+                    </a:xfrm>
+                    <a:prstGeom prst="rect">
+                      <a:avLst/>
+                    </a:prstGeom>
+                    <a:noFill/>
+                    <a:ln w="9525">
+                      <a:noFill/>
+                      <a:headEnd/>
+                      <a:tailEnd/>
+                    </a:ln>
+                  </pic:spPr>
+                </pic:pic>
+              </a:graphicData>
+            </a:graphic>
+          </wp:inline>
+        </w:drawing>
+      </w:r>
+      <w:r>
+        <w:t xml:space="preserve">碎片。因为伏尔甘的核心伤害加成需要哪吒挂</w:t>
+      </w:r>
+      <w:r>
+        <w:rPr>
+          <w:bCs/>
+          <w:b/>
+        </w:rPr>
+        <w:t xml:space="preserve">【神火Buff】</w:t>
+      </w:r>
+      <w:r>
+        <w:t xml:space="preserve">才能完全发挥。若本期钻石不足以直接解锁伏尔甘也无需担心，下期神火活动预计依然能兑换其碎片，届时提前备足钻石即可。</w:t>
+      </w:r>
+    </w:p>
+    <w:p>
+      <w:pPr>
+        <w:pStyle w:val="BodyText"/>
+      </w:pPr>
+      <w:r>
+        <w:t xml:space="preserve">以上就是本次《神火特工第二弹 SP特工伏尔甘获取攻略》的全部内容，祝大家都能顺利拿到！下一篇内容将会对</w:t>
+      </w:r>
+      <w:r>
+        <w:rPr>
+          <w:bCs/>
+          <w:b/>
+        </w:rPr>
+        <w:t xml:space="preserve">【伏尔甘】</w:t>
+      </w:r>
+      <w:r>
+        <w:drawing>
+          <wp:inline>
+            <wp:extent cx="228600" cy="228600"/>
+            <wp:effectExtent b="0" l="0" r="0" t="0"/>
+            <wp:docPr descr="伏尔甘" title="" id="99" name="Picture"/>
+            <a:graphic>
+              <a:graphicData uri="http://schemas.openxmlformats.org/drawingml/2006/picture">
+                <pic:pic>
+                  <pic:nvPicPr>
+                    <pic:cNvPr descr="assets/img/特工/伏尔甘.png" id="100" name="Picture"/>
                     <pic:cNvPicPr>
                       <a:picLocks noChangeArrowheads="1" noChangeAspect="1"/>
                     </pic:cNvPicPr>
@@ -2216,7 +2782,7 @@
         </w:drawing>
       </w:r>
       <w:r>
-        <w:t xml:space="preserve">碎片。因为伏尔甘的核心伤害加成需要哪吒挂神火 Buff 才能完全发挥。若本期钻石不足以直接解锁伏尔甘也无需担心，下期神火活动预计依然能兑换其碎片，届时提前备足钻石即可。</w:t>
+        <w:t xml:space="preserve">的技能和属性做详细的讲解，同时也会就当前版本下伏尔甘的强度做详细的分析，欢迎到时候观看！</w:t>
       </w:r>
     </w:p>
     <w:p>
@@ -2224,52 +2790,27 @@
         <w:pStyle w:val="BodyText"/>
       </w:pPr>
       <w:r>
-        <w:t xml:space="preserve">以上就是本次《神火特工第二弹 SP特工伏尔甘获取攻略》的全部内容，祝大家都能顺利拿到！下一篇内容将会对</w:t>
-      </w:r>
-      <w:r>
-        <w:drawing>
-          <wp:inline>
-            <wp:extent cx="228600" cy="228600"/>
-            <wp:effectExtent b="0" l="0" r="0" t="0"/>
-            <wp:docPr descr="伏尔甘" title="" id="97" name="Picture"/>
-            <a:graphic>
-              <a:graphicData uri="http://schemas.openxmlformats.org/drawingml/2006/picture">
-                <pic:pic>
-                  <pic:nvPicPr>
-                    <pic:cNvPr descr="assets/img/特工/伏尔甘.png" id="98" name="Picture"/>
-                    <pic:cNvPicPr>
-                      <a:picLocks noChangeArrowheads="1" noChangeAspect="1"/>
-                    </pic:cNvPicPr>
-                  </pic:nvPicPr>
-                  <pic:blipFill>
-                    <a:blip r:embed="rId20"/>
-                    <a:stretch>
-                      <a:fillRect/>
-                    </a:stretch>
-                  </pic:blipFill>
-                  <pic:spPr bwMode="auto">
-                    <a:xfrm>
-                      <a:off x="0" y="0"/>
-                      <a:ext cx="228600" cy="228600"/>
-                    </a:xfrm>
-                    <a:prstGeom prst="rect">
-                      <a:avLst/>
-                    </a:prstGeom>
-                    <a:noFill/>
-                    <a:ln w="9525">
-                      <a:noFill/>
-                      <a:headEnd/>
-                      <a:tailEnd/>
-                    </a:ln>
-                  </pic:spPr>
-                </pic:pic>
-              </a:graphicData>
-            </a:graphic>
-          </wp:inline>
-        </w:drawing>
-      </w:r>
-      <w:r>
-        <w:t xml:space="preserve">的技能和属性做详细的讲解，同时也会就当前版本下伏尔甘的强度做详细的分析，欢迎到时候观看！</w:t>
+        <w:t xml:space="preserve">【免责声明】本攻略纯属个人</w:t>
+      </w:r>
+      <w:r>
+        <w:rPr>
+          <w:bCs/>
+          <w:b/>
+        </w:rPr>
+        <w:t xml:space="preserve">经验分享</w:t>
+      </w:r>
+      <w:r>
+        <w:t xml:space="preserve">，</w:t>
+      </w:r>
+      <w:r>
+        <w:rPr>
+          <w:bCs/>
+          <w:b/>
+        </w:rPr>
+        <w:t xml:space="preserve">仅供参考</w:t>
+      </w:r>
+      <w:r>
+        <w:t xml:space="preserve">，不构成任何消费建议。游戏版本更新较快，具体数值以游戏内实际表现为准。本攻略所引用的美术图片及游戏内截图版权均归 Habby 公司所有。</w:t>
       </w:r>
     </w:p>
     <w:p>
@@ -2277,59 +2818,31 @@
         <w:pStyle w:val="BodyText"/>
       </w:pPr>
       <w:r>
-        <w:t xml:space="preserve">【免责声明】本攻略纯属个人</w:t>
-      </w:r>
-      <w:r>
-        <w:rPr>
-          <w:bCs/>
-          <w:b/>
-        </w:rPr>
-        <w:t xml:space="preserve">经验分享</w:t>
-      </w:r>
-      <w:r>
-        <w:t xml:space="preserve">，</w:t>
-      </w:r>
-      <w:r>
-        <w:rPr>
-          <w:bCs/>
-          <w:b/>
-        </w:rPr>
-        <w:t xml:space="preserve">仅供参考</w:t>
-      </w:r>
-      <w:r>
-        <w:t xml:space="preserve">，不构成任何消费建议。游戏版本更新较快，具体数值以游戏内实际表现为准。本攻略所引用的美术图片及游戏内截图版权均归 Habby 公司所有。</w:t>
+        <w:t xml:space="preserve">如果本篇攻略帮到了你，别忘了</w:t>
+      </w:r>
+      <w:r>
+        <w:rPr>
+          <w:bCs/>
+          <w:b/>
+        </w:rPr>
+        <w:t xml:space="preserve">点赞和关注</w:t>
+      </w:r>
+      <w:r>
+        <w:t xml:space="preserve">哦！你们的支持是我更新的动力！对攻略有疑问？欢迎在</w:t>
+      </w:r>
+      <w:r>
+        <w:rPr>
+          <w:bCs/>
+          <w:b/>
+        </w:rPr>
+        <w:t xml:space="preserve">评论区留言</w:t>
+      </w:r>
+      <w:r>
+        <w:t xml:space="preserve">讨论，我会第一时间回复大家，我们下期再见！</w:t>
       </w:r>
     </w:p>
-    <w:p>
-      <w:pPr>
-        <w:pStyle w:val="BodyText"/>
-      </w:pPr>
-      <w:r>
-        <w:t xml:space="preserve">如果本篇攻略帮到了你，别忘了</w:t>
-      </w:r>
-      <w:r>
-        <w:rPr>
-          <w:bCs/>
-          <w:b/>
-        </w:rPr>
-        <w:t xml:space="preserve">点赞和关注</w:t>
-      </w:r>
-      <w:r>
-        <w:t xml:space="preserve">哦！你们的支持是我更新的动力！对攻略有疑问？欢迎在</w:t>
-      </w:r>
-      <w:r>
-        <w:rPr>
-          <w:bCs/>
-          <w:b/>
-        </w:rPr>
-        <w:t xml:space="preserve">评论区留言</w:t>
-      </w:r>
-      <w:r>
-        <w:t xml:space="preserve">讨论，我会第一时间回复大家，我们下期再见！</w:t>
-      </w:r>
-    </w:p>
-    <w:bookmarkEnd w:id="99"/>
-    <w:bookmarkEnd w:id="100"/>
+    <w:bookmarkEnd w:id="101"/>
+    <w:bookmarkEnd w:id="102"/>
     <w:sectPr/>
   </w:body>
 </w:document>

</xml_diff>

<commit_message>
docs: restore clean source markdown and publish updated WeChat draft
</commit_message>
<xml_diff>
--- a/my-articles-md/活动/sp特工伏尔甘获取攻略/sp特工伏尔甘获取攻略_wechat.docx
+++ b/my-articles-md/活动/sp特工伏尔甘获取攻略/sp特工伏尔甘获取攻略_wechat.docx
@@ -37,11 +37,7 @@
         <w:pStyle w:val="FirstParagraph"/>
       </w:pPr>
       <w:r>
-        <w:rPr>
-          <w:bCs/>
-          <w:b/>
-        </w:rPr>
-        <w:t xml:space="preserve">【SP特工伏尔甘】</w:t>
+        <w:t xml:space="preserve">SP特工</w:t>
       </w:r>
       <w:r>
         <w:drawing>
@@ -89,13 +85,6 @@
         <w:t xml:space="preserve">降临！本篇攻略将为您详细拆解本次活动的玩法以及获取</w:t>
       </w:r>
       <w:r>
-        <w:rPr>
-          <w:bCs/>
-          <w:b/>
-        </w:rPr>
-        <w:t xml:space="preserve">【伏尔甘】</w:t>
-      </w:r>
-      <w:r>
         <w:drawing>
           <wp:inline>
             <wp:extent cx="228600" cy="228600"/>
@@ -165,13 +154,6 @@
         <w:t xml:space="preserve">目前获取</w:t>
       </w:r>
       <w:r>
-        <w:rPr>
-          <w:bCs/>
-          <w:b/>
-        </w:rPr>
-        <w:t xml:space="preserve">【伏尔甘】</w:t>
-      </w:r>
-      <w:r>
         <w:drawing>
           <wp:inline>
             <wp:extent cx="228600" cy="228600"/>
@@ -243,24 +225,10 @@
           <w:bCs/>
           <w:b/>
         </w:rPr>
-        <w:t xml:space="preserve">128</w:t>
-      </w:r>
-      <w:r>
-        <w:rPr>
-          <w:bCs/>
-          <w:b/>
-        </w:rPr>
-        <w:t xml:space="preserve">元礼包</w:t>
+        <w:t xml:space="preserve">128元礼包</w:t>
       </w:r>
       <w:r>
         <w:t xml:space="preserve">（内含</w:t>
-      </w:r>
-      <w:r>
-        <w:rPr>
-          <w:bCs/>
-          <w:b/>
-        </w:rPr>
-        <w:t xml:space="preserve">【伏尔甘】</w:t>
       </w:r>
       <w:r>
         <w:drawing>
@@ -321,20 +289,10 @@
           <w:bCs/>
           <w:b/>
         </w:rPr>
-        <w:t xml:space="preserve">转盘</w:t>
-      </w:r>
-      <w:r>
-        <w:t xml:space="preserve">：在活动</w:t>
-      </w:r>
-      <w:r>
-        <w:rPr>
-          <w:bCs/>
-          <w:b/>
-        </w:rPr>
-        <w:t xml:space="preserve">【转盘】</w:t>
-      </w:r>
-      <w:r>
-        <w:t xml:space="preserve">中，累计消耗</w:t>
+        <w:t xml:space="preserve">转盘累计</w:t>
+      </w:r>
+      <w:r>
+        <w:t xml:space="preserve">：在活动转盘中，累计消耗</w:t>
       </w:r>
       <w:r>
         <w:t xml:space="preserve"> </w:t>
@@ -360,7 +318,7 @@
           <w:bCs/>
           <w:b/>
         </w:rPr>
-        <w:t xml:space="preserve">【火神锤抽奖券】</w:t>
+        <w:t xml:space="preserve">火神锤抽奖券</w:t>
       </w:r>
       <w:r>
         <w:t xml:space="preserve"> </w:t>
@@ -377,7 +335,7 @@
       </w:r>
     </w:p>
     <w:bookmarkEnd w:id="29"/>
-    <w:bookmarkStart w:id="42" w:name="二白嫖及钻石规划策略"/>
+    <w:bookmarkStart w:id="57" w:name="二白嫖及钻石规划策略"/>
     <w:p>
       <w:pPr>
         <w:pStyle w:val="Heading2"/>
@@ -392,13 +350,6 @@
       </w:pPr>
       <w:r>
         <w:t xml:space="preserve">针对想要通过活动白嫖或利用储备</w:t>
-      </w:r>
-      <w:r>
-        <w:rPr>
-          <w:bCs/>
-          <w:b/>
-        </w:rPr>
-        <w:t xml:space="preserve">【钻石】</w:t>
       </w:r>
       <w:r>
         <w:drawing>
@@ -462,14 +413,7 @@
         <w:t xml:space="preserve">属性机制简析</w:t>
       </w:r>
       <w:r>
-        <w:t xml:space="preserve">：个人认为，非常推荐入手。虽然</w:t>
-      </w:r>
-      <w:r>
-        <w:rPr>
-          <w:bCs/>
-          <w:b/>
-        </w:rPr>
-        <w:t xml:space="preserve">【伏尔甘】</w:t>
+        <w:t xml:space="preserve">：个人认为，推荐入手。虽然</w:t>
       </w:r>
       <w:r>
         <w:drawing>
@@ -524,7 +468,7 @@
           <w:bCs/>
           <w:b/>
         </w:rPr>
-        <w:t xml:space="preserve">【神火】</w:t>
+        <w:t xml:space="preserve">神火</w:t>
       </w:r>
       <w:r>
         <w:drawing>
@@ -582,7 +526,7 @@
           <w:bCs/>
           <w:b/>
         </w:rPr>
-        <w:t xml:space="preserve">【裂伤】</w:t>
+        <w:t xml:space="preserve">裂伤</w:t>
       </w:r>
       <w:r>
         <w:drawing>
@@ -630,190 +574,319 @@
         <w:t xml:space="preserve"> </w:t>
       </w:r>
       <w:r>
-        <w:t xml:space="preserve">处于同一伤害乘区，但其带来的“武器技能初始学习等级+1（满级可达+2）”属性十分强力。用在</w:t>
-      </w:r>
-      <w:r>
-        <w:t xml:space="preserve"> </w:t>
-      </w:r>
-      <w:r>
-        <w:rPr>
-          <w:bCs/>
-          <w:b/>
-        </w:rPr>
-        <w:t xml:space="preserve">【SS级武器】</w:t>
-      </w:r>
-      <w:r>
-        <w:t xml:space="preserve"> </w:t>
-      </w:r>
-      <w:r>
-        <w:t xml:space="preserve">上，</w:t>
-      </w:r>
-      <w:r>
-        <w:t xml:space="preserve">1</w:t>
-      </w:r>
-      <w:r>
-        <w:rPr>
-          <w:bCs/>
-          <w:b/>
-        </w:rPr>
-        <w:t xml:space="preserve">【红星】</w:t>
-      </w:r>
-      <w:r>
-        <w:t xml:space="preserve">开局即可达到</w:t>
-      </w:r>
-      <w:r>
-        <w:t xml:space="preserve"> </w:t>
-      </w:r>
-      <w:r>
-        <w:t xml:space="preserve">4</w:t>
-      </w:r>
-      <w:r>
-        <w:t xml:space="preserve"> </w:t>
-      </w:r>
-      <w:r>
-        <w:t xml:space="preserve">级，</w:t>
-      </w:r>
-      <w:r>
-        <w:t xml:space="preserve">4</w:t>
-      </w:r>
-      <w:r>
-        <w:rPr>
-          <w:bCs/>
-          <w:b/>
-        </w:rPr>
-        <w:t xml:space="preserve">【红星】</w:t>
-      </w:r>
-      <w:r>
-        <w:t xml:space="preserve">开局直接</w:t>
-      </w:r>
-      <w:r>
-        <w:t xml:space="preserve"> </w:t>
-      </w:r>
-      <w:r>
-        <w:t xml:space="preserve">5</w:t>
-      </w:r>
-      <w:r>
-        <w:t xml:space="preserve"> </w:t>
-      </w:r>
-      <w:r>
-        <w:t xml:space="preserve">级（满级），对</w:t>
-      </w:r>
-      <w:r>
-        <w:rPr>
-          <w:bCs/>
-          <w:b/>
-        </w:rPr>
-        <w:t xml:space="preserve">【回响之战】</w:t>
-      </w:r>
-      <w:r>
-        <w:t xml:space="preserve">的体验有着颠覆性的提升。平民与微氪玩家可以考虑从“解锁</w:t>
-      </w:r>
-      <w:r>
-        <w:t xml:space="preserve"> </w:t>
-      </w:r>
-      <m:oMath>
-        <m:r>
-          <m:rPr>
-            <m:sty m:val="p"/>
-          </m:rPr>
-          <m:t>→</m:t>
-        </m:r>
-      </m:oMath>
-      <w:r>
-        <w:t xml:space="preserve"> </w:t>
-      </w:r>
-      <w:r>
-        <w:t xml:space="preserve">1</w:t>
-      </w:r>
-      <w:r>
-        <w:rPr>
-          <w:bCs/>
-          <w:b/>
-        </w:rPr>
-        <w:t xml:space="preserve">【红星】</w:t>
-      </w:r>
-      <w:r>
-        <w:t xml:space="preserve"> </w:t>
-      </w:r>
-      <m:oMath>
-        <m:r>
-          <m:rPr>
-            <m:sty m:val="p"/>
-          </m:rPr>
-          <m:t>→</m:t>
-        </m:r>
-      </m:oMath>
-      <w:r>
-        <w:t xml:space="preserve"> </w:t>
-      </w:r>
-      <w:r>
-        <w:t xml:space="preserve">2</w:t>
-      </w:r>
-      <w:r>
-        <w:rPr>
-          <w:bCs/>
-          <w:b/>
-        </w:rPr>
-        <w:t xml:space="preserve">【红星】</w:t>
-      </w:r>
-      <w:r>
-        <w:t xml:space="preserve"> </w:t>
-      </w:r>
-      <m:oMath>
-        <m:r>
-          <m:rPr>
-            <m:sty m:val="p"/>
-          </m:rPr>
-          <m:t>→</m:t>
-        </m:r>
-      </m:oMath>
-      <w:r>
-        <w:t xml:space="preserve"> </w:t>
-      </w:r>
-      <w:r>
-        <w:t xml:space="preserve">4</w:t>
-      </w:r>
-      <w:r>
-        <w:rPr>
-          <w:bCs/>
-          <w:b/>
-        </w:rPr>
-        <w:t xml:space="preserve">【红星】</w:t>
-      </w:r>
-      <w:r>
-        <w:t xml:space="preserve">”逐步培养；重氪玩家则推荐直接拉满至</w:t>
-      </w:r>
-      <w:r>
-        <w:t xml:space="preserve"> </w:t>
-      </w:r>
-      <w:r>
-        <w:t xml:space="preserve">4</w:t>
-      </w:r>
-      <w:r>
-        <w:rPr>
-          <w:bCs/>
-          <w:b/>
-        </w:rPr>
-        <w:t xml:space="preserve">【红星】</w:t>
-      </w:r>
-      <w:r>
-        <w:t xml:space="preserve"> </w:t>
-      </w:r>
-      <w:r>
-        <w:t xml:space="preserve">或</w:t>
-      </w:r>
-      <w:r>
-        <w:t xml:space="preserve"> </w:t>
-      </w:r>
-      <w:r>
-        <w:t xml:space="preserve">6</w:t>
-      </w:r>
-      <w:r>
-        <w:rPr>
-          <w:bCs/>
-          <w:b/>
-        </w:rPr>
-        <w:t xml:space="preserve">【红星】</w:t>
+        <w:t xml:space="preserve">处于同一伤害乘区，但其带来的武器技能初始学习等级+1（满级+2）用在ss武器上1</w:t>
+      </w:r>
+      <w:r>
+        <w:drawing>
+          <wp:inline>
+            <wp:extent cx="228600" cy="228600"/>
+            <wp:effectExtent b="0" l="0" r="0" t="0"/>
+            <wp:docPr descr="红星" title="" id="42" name="Picture"/>
+            <a:graphic>
+              <a:graphicData uri="http://schemas.openxmlformats.org/drawingml/2006/picture">
+                <pic:pic>
+                  <pic:nvPicPr>
+                    <pic:cNvPr descr="assets/img/其它/红星.png" id="43" name="Picture"/>
+                    <pic:cNvPicPr>
+                      <a:picLocks noChangeArrowheads="1" noChangeAspect="1"/>
+                    </pic:cNvPicPr>
+                  </pic:nvPicPr>
+                  <pic:blipFill>
+                    <a:blip r:embed="rId41"/>
+                    <a:stretch>
+                      <a:fillRect/>
+                    </a:stretch>
+                  </pic:blipFill>
+                  <pic:spPr bwMode="auto">
+                    <a:xfrm>
+                      <a:off x="0" y="0"/>
+                      <a:ext cx="228600" cy="228600"/>
+                    </a:xfrm>
+                    <a:prstGeom prst="rect">
+                      <a:avLst/>
+                    </a:prstGeom>
+                    <a:noFill/>
+                    <a:ln w="9525">
+                      <a:noFill/>
+                      <a:headEnd/>
+                      <a:tailEnd/>
+                    </a:ln>
+                  </pic:spPr>
+                </pic:pic>
+              </a:graphicData>
+            </a:graphic>
+          </wp:inline>
+        </w:drawing>
+      </w:r>
+      <w:r>
+        <w:t xml:space="preserve">开局4级，4</w:t>
+      </w:r>
+      <w:r>
+        <w:drawing>
+          <wp:inline>
+            <wp:extent cx="228600" cy="228600"/>
+            <wp:effectExtent b="0" l="0" r="0" t="0"/>
+            <wp:docPr descr="红星" title="" id="44" name="Picture"/>
+            <a:graphic>
+              <a:graphicData uri="http://schemas.openxmlformats.org/drawingml/2006/picture">
+                <pic:pic>
+                  <pic:nvPicPr>
+                    <pic:cNvPr descr="assets/img/其它/红星.png" id="45" name="Picture"/>
+                    <pic:cNvPicPr>
+                      <a:picLocks noChangeArrowheads="1" noChangeAspect="1"/>
+                    </pic:cNvPicPr>
+                  </pic:nvPicPr>
+                  <pic:blipFill>
+                    <a:blip r:embed="rId41"/>
+                    <a:stretch>
+                      <a:fillRect/>
+                    </a:stretch>
+                  </pic:blipFill>
+                  <pic:spPr bwMode="auto">
+                    <a:xfrm>
+                      <a:off x="0" y="0"/>
+                      <a:ext cx="228600" cy="228600"/>
+                    </a:xfrm>
+                    <a:prstGeom prst="rect">
+                      <a:avLst/>
+                    </a:prstGeom>
+                    <a:noFill/>
+                    <a:ln w="9525">
+                      <a:noFill/>
+                      <a:headEnd/>
+                      <a:tailEnd/>
+                    </a:ln>
+                  </pic:spPr>
+                </pic:pic>
+              </a:graphicData>
+            </a:graphic>
+          </wp:inline>
+        </w:drawing>
+      </w:r>
+      <w:r>
+        <w:t xml:space="preserve">开局5级的收益非常可观，足以改变回响之战的体验，微氪玩家平民玩家慢慢从开通-&gt;1</w:t>
+      </w:r>
+      <w:r>
+        <w:drawing>
+          <wp:inline>
+            <wp:extent cx="228600" cy="228600"/>
+            <wp:effectExtent b="0" l="0" r="0" t="0"/>
+            <wp:docPr descr="红星" title="" id="46" name="Picture"/>
+            <a:graphic>
+              <a:graphicData uri="http://schemas.openxmlformats.org/drawingml/2006/picture">
+                <pic:pic>
+                  <pic:nvPicPr>
+                    <pic:cNvPr descr="assets/img/其它/红星.png" id="47" name="Picture"/>
+                    <pic:cNvPicPr>
+                      <a:picLocks noChangeArrowheads="1" noChangeAspect="1"/>
+                    </pic:cNvPicPr>
+                  </pic:nvPicPr>
+                  <pic:blipFill>
+                    <a:blip r:embed="rId41"/>
+                    <a:stretch>
+                      <a:fillRect/>
+                    </a:stretch>
+                  </pic:blipFill>
+                  <pic:spPr bwMode="auto">
+                    <a:xfrm>
+                      <a:off x="0" y="0"/>
+                      <a:ext cx="228600" cy="228600"/>
+                    </a:xfrm>
+                    <a:prstGeom prst="rect">
+                      <a:avLst/>
+                    </a:prstGeom>
+                    <a:noFill/>
+                    <a:ln w="9525">
+                      <a:noFill/>
+                      <a:headEnd/>
+                      <a:tailEnd/>
+                    </a:ln>
+                  </pic:spPr>
+                </pic:pic>
+              </a:graphicData>
+            </a:graphic>
+          </wp:inline>
+        </w:drawing>
+      </w:r>
+      <w:r>
+        <w:t xml:space="preserve">-&gt;2</w:t>
+      </w:r>
+      <w:r>
+        <w:drawing>
+          <wp:inline>
+            <wp:extent cx="228600" cy="228600"/>
+            <wp:effectExtent b="0" l="0" r="0" t="0"/>
+            <wp:docPr descr="红星" title="" id="48" name="Picture"/>
+            <a:graphic>
+              <a:graphicData uri="http://schemas.openxmlformats.org/drawingml/2006/picture">
+                <pic:pic>
+                  <pic:nvPicPr>
+                    <pic:cNvPr descr="assets/img/其它/红星.png" id="49" name="Picture"/>
+                    <pic:cNvPicPr>
+                      <a:picLocks noChangeArrowheads="1" noChangeAspect="1"/>
+                    </pic:cNvPicPr>
+                  </pic:nvPicPr>
+                  <pic:blipFill>
+                    <a:blip r:embed="rId41"/>
+                    <a:stretch>
+                      <a:fillRect/>
+                    </a:stretch>
+                  </pic:blipFill>
+                  <pic:spPr bwMode="auto">
+                    <a:xfrm>
+                      <a:off x="0" y="0"/>
+                      <a:ext cx="228600" cy="228600"/>
+                    </a:xfrm>
+                    <a:prstGeom prst="rect">
+                      <a:avLst/>
+                    </a:prstGeom>
+                    <a:noFill/>
+                    <a:ln w="9525">
+                      <a:noFill/>
+                      <a:headEnd/>
+                      <a:tailEnd/>
+                    </a:ln>
+                  </pic:spPr>
+                </pic:pic>
+              </a:graphicData>
+            </a:graphic>
+          </wp:inline>
+        </w:drawing>
+      </w:r>
+      <w:r>
+        <w:t xml:space="preserve">-&gt;4</w:t>
+      </w:r>
+      <w:r>
+        <w:drawing>
+          <wp:inline>
+            <wp:extent cx="228600" cy="228600"/>
+            <wp:effectExtent b="0" l="0" r="0" t="0"/>
+            <wp:docPr descr="红星" title="" id="50" name="Picture"/>
+            <a:graphic>
+              <a:graphicData uri="http://schemas.openxmlformats.org/drawingml/2006/picture">
+                <pic:pic>
+                  <pic:nvPicPr>
+                    <pic:cNvPr descr="assets/img/其它/红星.png" id="51" name="Picture"/>
+                    <pic:cNvPicPr>
+                      <a:picLocks noChangeArrowheads="1" noChangeAspect="1"/>
+                    </pic:cNvPicPr>
+                  </pic:nvPicPr>
+                  <pic:blipFill>
+                    <a:blip r:embed="rId41"/>
+                    <a:stretch>
+                      <a:fillRect/>
+                    </a:stretch>
+                  </pic:blipFill>
+                  <pic:spPr bwMode="auto">
+                    <a:xfrm>
+                      <a:off x="0" y="0"/>
+                      <a:ext cx="228600" cy="228600"/>
+                    </a:xfrm>
+                    <a:prstGeom prst="rect">
+                      <a:avLst/>
+                    </a:prstGeom>
+                    <a:noFill/>
+                    <a:ln w="9525">
+                      <a:noFill/>
+                      <a:headEnd/>
+                      <a:tailEnd/>
+                    </a:ln>
+                  </pic:spPr>
+                </pic:pic>
+              </a:graphicData>
+            </a:graphic>
+          </wp:inline>
+        </w:drawing>
+      </w:r>
+      <w:r>
+        <w:t xml:space="preserve">，重氪玩家可选择直接到4</w:t>
+      </w:r>
+      <w:r>
+        <w:drawing>
+          <wp:inline>
+            <wp:extent cx="228600" cy="228600"/>
+            <wp:effectExtent b="0" l="0" r="0" t="0"/>
+            <wp:docPr descr="红星" title="" id="52" name="Picture"/>
+            <a:graphic>
+              <a:graphicData uri="http://schemas.openxmlformats.org/drawingml/2006/picture">
+                <pic:pic>
+                  <pic:nvPicPr>
+                    <pic:cNvPr descr="assets/img/其它/红星.png" id="53" name="Picture"/>
+                    <pic:cNvPicPr>
+                      <a:picLocks noChangeArrowheads="1" noChangeAspect="1"/>
+                    </pic:cNvPicPr>
+                  </pic:nvPicPr>
+                  <pic:blipFill>
+                    <a:blip r:embed="rId41"/>
+                    <a:stretch>
+                      <a:fillRect/>
+                    </a:stretch>
+                  </pic:blipFill>
+                  <pic:spPr bwMode="auto">
+                    <a:xfrm>
+                      <a:off x="0" y="0"/>
+                      <a:ext cx="228600" cy="228600"/>
+                    </a:xfrm>
+                    <a:prstGeom prst="rect">
+                      <a:avLst/>
+                    </a:prstGeom>
+                    <a:noFill/>
+                    <a:ln w="9525">
+                      <a:noFill/>
+                      <a:headEnd/>
+                      <a:tailEnd/>
+                    </a:ln>
+                  </pic:spPr>
+                </pic:pic>
+              </a:graphicData>
+            </a:graphic>
+          </wp:inline>
+        </w:drawing>
+      </w:r>
+      <w:r>
+        <w:t xml:space="preserve">或者6</w:t>
+      </w:r>
+      <w:r>
+        <w:drawing>
+          <wp:inline>
+            <wp:extent cx="228600" cy="228600"/>
+            <wp:effectExtent b="0" l="0" r="0" t="0"/>
+            <wp:docPr descr="红星" title="" id="54" name="Picture"/>
+            <a:graphic>
+              <a:graphicData uri="http://schemas.openxmlformats.org/drawingml/2006/picture">
+                <pic:pic>
+                  <pic:nvPicPr>
+                    <pic:cNvPr descr="assets/img/其它/红星.png" id="55" name="Picture"/>
+                    <pic:cNvPicPr>
+                      <a:picLocks noChangeArrowheads="1" noChangeAspect="1"/>
+                    </pic:cNvPicPr>
+                  </pic:nvPicPr>
+                  <pic:blipFill>
+                    <a:blip r:embed="rId41"/>
+                    <a:stretch>
+                      <a:fillRect/>
+                    </a:stretch>
+                  </pic:blipFill>
+                  <pic:spPr bwMode="auto">
+                    <a:xfrm>
+                      <a:off x="0" y="0"/>
+                      <a:ext cx="228600" cy="228600"/>
+                    </a:xfrm>
+                    <a:prstGeom prst="rect">
+                      <a:avLst/>
+                    </a:prstGeom>
+                    <a:noFill/>
+                    <a:ln w="9525">
+                      <a:noFill/>
+                      <a:headEnd/>
+                      <a:tailEnd/>
+                    </a:ln>
+                  </pic:spPr>
+                </pic:pic>
+              </a:graphicData>
+            </a:graphic>
+          </wp:inline>
+        </w:drawing>
       </w:r>
       <w:r>
         <w:t xml:space="preserve">。</w:t>
@@ -827,7 +900,7 @@
         </w:numPr>
         <w:pStyle w:val="Heading2"/>
       </w:pPr>
-      <w:bookmarkStart w:id="41" w:name="解锁需要票数转盘解锁共需-300-票"/>
+      <w:bookmarkStart w:id="56" w:name="解锁需要票数转盘解锁共需-300-票"/>
       <w:r>
         <w:rPr>
           <w:bCs/>
@@ -854,10 +927,10 @@
       <w:r>
         <w:t xml:space="preserve">票。</w:t>
       </w:r>
-      <w:bookmarkEnd w:id="41"/>
-    </w:p>
-    <w:bookmarkEnd w:id="42"/>
-    <w:bookmarkStart w:id="47" w:name="三火神锤抽奖券任务产出统计"/>
+      <w:bookmarkEnd w:id="56"/>
+    </w:p>
+    <w:bookmarkEnd w:id="57"/>
+    <w:bookmarkStart w:id="62" w:name="三火神锤抽奖券任务产出统计"/>
     <w:p>
       <w:pPr>
         <w:pStyle w:val="Heading2"/>
@@ -1095,41 +1168,19 @@
         <w:t xml:space="preserve"> </w:t>
       </w:r>
       <w:r>
-        <w:t xml:space="preserve">-</w:t>
-      </w:r>
-      <w:r>
-        <w:t xml:space="preserve"> </w:t>
-      </w:r>
-      <w:r>
-        <w:t xml:space="preserve">1</w:t>
-      </w:r>
-      <w:r>
-        <w:t xml:space="preserve">张票 =</w:t>
-      </w:r>
-      <w:r>
-        <w:t xml:space="preserve"> </w:t>
-      </w:r>
-      <w:r>
-        <w:t xml:space="preserve">300</w:t>
-      </w:r>
-      <w:r>
-        <w:rPr>
-          <w:bCs/>
-          <w:b/>
-        </w:rPr>
-        <w:t xml:space="preserve">【钻石】</w:t>
+        <w:t xml:space="preserve">- 1张票 = 300</w:t>
       </w:r>
       <w:r>
         <w:drawing>
           <wp:inline>
             <wp:extent cx="228600" cy="228600"/>
             <wp:effectExtent b="0" l="0" r="0" t="0"/>
-            <wp:docPr descr="钻石" title="" id="43" name="Picture"/>
+            <wp:docPr descr="钻石" title="" id="58" name="Picture"/>
             <a:graphic>
               <a:graphicData uri="http://schemas.openxmlformats.org/drawingml/2006/picture">
                 <pic:pic>
                   <pic:nvPicPr>
-                    <pic:cNvPr descr="assets/img/道具/钻石.png" id="44" name="Picture"/>
+                    <pic:cNvPr descr="assets/img/道具/钻石.png" id="59" name="Picture"/>
                     <pic:cNvPicPr>
                       <a:picLocks noChangeArrowheads="1" noChangeAspect="1"/>
                     </pic:cNvPicPr>
@@ -1194,23 +1245,16 @@
         <w:t xml:space="preserve"> </w:t>
       </w:r>
       <w:r>
-        <w:rPr>
-          <w:bCs/>
-          <w:b/>
-        </w:rPr>
-        <w:t xml:space="preserve">【钻石】</w:t>
-      </w:r>
-      <w:r>
         <w:drawing>
           <wp:inline>
             <wp:extent cx="228600" cy="228600"/>
             <wp:effectExtent b="0" l="0" r="0" t="0"/>
-            <wp:docPr descr="钻石" title="" id="45" name="Picture"/>
+            <wp:docPr descr="钻石" title="" id="60" name="Picture"/>
             <a:graphic>
               <a:graphicData uri="http://schemas.openxmlformats.org/drawingml/2006/picture">
                 <pic:pic>
                   <pic:nvPicPr>
-                    <pic:cNvPr descr="assets/img/道具/钻石.png" id="46" name="Picture"/>
+                    <pic:cNvPr descr="assets/img/道具/钻石.png" id="61" name="Picture"/>
                     <pic:cNvPicPr>
                       <a:picLocks noChangeArrowheads="1" noChangeAspect="1"/>
                     </pic:cNvPicPr>
@@ -1253,8 +1297,8 @@
         </w:pict>
       </w:r>
     </w:p>
-    <w:bookmarkEnd w:id="47"/>
-    <w:bookmarkStart w:id="102" w:name="四不同预算段获取方案推荐"/>
+    <w:bookmarkEnd w:id="62"/>
+    <w:bookmarkStart w:id="100" w:name="四不同预算段获取方案推荐"/>
     <w:p>
       <w:pPr>
         <w:pStyle w:val="Heading2"/>
@@ -1263,7 +1307,7 @@
         <w:t xml:space="preserve">四、不同预算段获取方案推荐</w:t>
       </w:r>
     </w:p>
-    <w:bookmarkStart w:id="56" w:name="方案一适度氪金方案"/>
+    <w:bookmarkStart w:id="65" w:name="方案一适度氪金方案"/>
     <w:p>
       <w:pPr>
         <w:pStyle w:val="Heading3"/>
@@ -1317,45 +1361,22 @@
           <w:bCs/>
           <w:b/>
         </w:rPr>
-        <w:t xml:space="preserve">128</w:t>
-      </w:r>
-      <w:r>
-        <w:rPr>
-          <w:bCs/>
-          <w:b/>
-        </w:rPr>
-        <w:t xml:space="preserve">元礼包</w:t>
-      </w:r>
-      <w:r>
-        <w:t xml:space="preserve">。对比直接买</w:t>
-      </w:r>
-      <w:r>
-        <w:t xml:space="preserve"> </w:t>
-      </w:r>
-      <w:r>
-        <w:t xml:space="preserve">45,000</w:t>
-      </w:r>
-      <w:r>
-        <w:t xml:space="preserve"> </w:t>
-      </w:r>
-      <w:r>
-        <w:rPr>
-          <w:bCs/>
-          <w:b/>
-        </w:rPr>
-        <w:t xml:space="preserve">【钻石】</w:t>
+        <w:t xml:space="preserve">128元礼包</w:t>
+      </w:r>
+      <w:r>
+        <w:t xml:space="preserve">。对比直接买45,000</w:t>
       </w:r>
       <w:r>
         <w:drawing>
           <wp:inline>
             <wp:extent cx="228600" cy="228600"/>
             <wp:effectExtent b="0" l="0" r="0" t="0"/>
-            <wp:docPr descr="钻石" title="" id="48" name="Picture"/>
+            <wp:docPr descr="钻石" title="" id="63" name="Picture"/>
             <a:graphic>
               <a:graphicData uri="http://schemas.openxmlformats.org/drawingml/2006/picture">
                 <pic:pic>
                   <pic:nvPicPr>
-                    <pic:cNvPr descr="assets/img/道具/钻石.png" id="49" name="Picture"/>
+                    <pic:cNvPr descr="assets/img/道具/钻石.png" id="64" name="Picture"/>
                     <pic:cNvPicPr>
                       <a:picLocks noChangeArrowheads="1" noChangeAspect="1"/>
                     </pic:cNvPicPr>
@@ -1388,124 +1409,11 @@
         </w:drawing>
       </w:r>
       <w:r>
-        <w:t xml:space="preserve">，该礼包性价比极高。买完后多余的转盘票数可用于获取其他稀有奖励，如</w:t>
-      </w:r>
-      <w:r>
-        <w:t xml:space="preserve"> </w:t>
-      </w:r>
-      <w:r>
-        <w:rPr>
-          <w:bCs/>
-          <w:b/>
-        </w:rPr>
-        <w:t xml:space="preserve">【末世战马碎片】</w:t>
-      </w:r>
-      <w:r>
-        <w:drawing>
-          <wp:inline>
-            <wp:extent cx="228600" cy="228600"/>
-            <wp:effectExtent b="0" l="0" r="0" t="0"/>
-            <wp:docPr descr="末世战马碎片" title="" id="51" name="Picture"/>
-            <a:graphic>
-              <a:graphicData uri="http://schemas.openxmlformats.org/drawingml/2006/picture">
-                <pic:pic>
-                  <pic:nvPicPr>
-                    <pic:cNvPr descr="assets/img/碎片/末世战马碎片.png" id="52" name="Picture"/>
-                    <pic:cNvPicPr>
-                      <a:picLocks noChangeArrowheads="1" noChangeAspect="1"/>
-                    </pic:cNvPicPr>
-                  </pic:nvPicPr>
-                  <pic:blipFill>
-                    <a:blip r:embed="rId50"/>
-                    <a:stretch>
-                      <a:fillRect/>
-                    </a:stretch>
-                  </pic:blipFill>
-                  <pic:spPr bwMode="auto">
-                    <a:xfrm>
-                      <a:off x="0" y="0"/>
-                      <a:ext cx="228600" cy="228600"/>
-                    </a:xfrm>
-                    <a:prstGeom prst="rect">
-                      <a:avLst/>
-                    </a:prstGeom>
-                    <a:noFill/>
-                    <a:ln w="9525">
-                      <a:noFill/>
-                      <a:headEnd/>
-                      <a:tailEnd/>
-                    </a:ln>
-                  </pic:spPr>
-                </pic:pic>
-              </a:graphicData>
-            </a:graphic>
-          </wp:inline>
-        </w:drawing>
-      </w:r>
-      <w:r>
-        <w:t xml:space="preserve"> </w:t>
-      </w:r>
-      <w:r>
-        <w:t xml:space="preserve">和</w:t>
-      </w:r>
-      <w:r>
-        <w:t xml:space="preserve"> </w:t>
-      </w:r>
-      <w:r>
-        <w:rPr>
-          <w:bCs/>
-          <w:b/>
-        </w:rPr>
-        <w:t xml:space="preserve">【核心自选宝箱精华】</w:t>
-      </w:r>
-      <w:r>
-        <w:drawing>
-          <wp:inline>
-            <wp:extent cx="228600" cy="228600"/>
-            <wp:effectExtent b="0" l="0" r="0" t="0"/>
-            <wp:docPr descr="核心自选宝箱精华" title="" id="54" name="Picture"/>
-            <a:graphic>
-              <a:graphicData uri="http://schemas.openxmlformats.org/drawingml/2006/picture">
-                <pic:pic>
-                  <pic:nvPicPr>
-                    <pic:cNvPr descr="assets/img/道具/核心自选宝箱精华.png" id="55" name="Picture"/>
-                    <pic:cNvPicPr>
-                      <a:picLocks noChangeArrowheads="1" noChangeAspect="1"/>
-                    </pic:cNvPicPr>
-                  </pic:nvPicPr>
-                  <pic:blipFill>
-                    <a:blip r:embed="rId53"/>
-                    <a:stretch>
-                      <a:fillRect/>
-                    </a:stretch>
-                  </pic:blipFill>
-                  <pic:spPr bwMode="auto">
-                    <a:xfrm>
-                      <a:off x="0" y="0"/>
-                      <a:ext cx="228600" cy="228600"/>
-                    </a:xfrm>
-                    <a:prstGeom prst="rect">
-                      <a:avLst/>
-                    </a:prstGeom>
-                    <a:noFill/>
-                    <a:ln w="9525">
-                      <a:noFill/>
-                      <a:headEnd/>
-                      <a:tailEnd/>
-                    </a:ln>
-                  </pic:spPr>
-                </pic:pic>
-              </a:graphicData>
-            </a:graphic>
-          </wp:inline>
-        </w:drawing>
-      </w:r>
-      <w:r>
-        <w:t xml:space="preserve">。</w:t>
-      </w:r>
-    </w:p>
-    <w:bookmarkEnd w:id="56"/>
-    <w:bookmarkStart w:id="63" w:name="方案二完全白嫖钻石直购方案"/>
+        <w:t xml:space="preserve">，该礼包性价比极高。买完后多余的转盘票数可用于获取星级道具和其他稀有奖励。</w:t>
+      </w:r>
+    </w:p>
+    <w:bookmarkEnd w:id="65"/>
+    <w:bookmarkStart w:id="70" w:name="方案二完全白嫖钻石直购方案"/>
     <w:p>
       <w:pPr>
         <w:pStyle w:val="Heading3"/>
@@ -1530,26 +1438,19 @@
         <w:t xml:space="preserve">适用人群</w:t>
       </w:r>
       <w:r>
-        <w:t xml:space="preserve">：零氪或拥有充足</w:t>
-      </w:r>
-      <w:r>
-        <w:rPr>
-          <w:bCs/>
-          <w:b/>
-        </w:rPr>
-        <w:t xml:space="preserve">【钻石】</w:t>
+        <w:t xml:space="preserve">：无氪、拥有充足</w:t>
       </w:r>
       <w:r>
         <w:drawing>
           <wp:inline>
             <wp:extent cx="228600" cy="228600"/>
             <wp:effectExtent b="0" l="0" r="0" t="0"/>
-            <wp:docPr descr="钻石" title="" id="57" name="Picture"/>
+            <wp:docPr descr="钻石" title="" id="66" name="Picture"/>
             <a:graphic>
               <a:graphicData uri="http://schemas.openxmlformats.org/drawingml/2006/picture">
                 <pic:pic>
                   <pic:nvPicPr>
-                    <pic:cNvPr descr="assets/img/道具/钻石.png" id="58" name="Picture"/>
+                    <pic:cNvPr descr="assets/img/道具/钻石.png" id="67" name="Picture"/>
                     <pic:cNvPicPr>
                       <a:picLocks noChangeArrowheads="1" noChangeAspect="1"/>
                     </pic:cNvPicPr>
@@ -1601,19 +1502,7 @@
         <w:t xml:space="preserve">具体策略</w:t>
       </w:r>
       <w:r>
-        <w:t xml:space="preserve">：拉满所有活动任务（白嫖</w:t>
-      </w:r>
-      <w:r>
-        <w:t xml:space="preserve"> </w:t>
-      </w:r>
-      <w:r>
-        <w:t xml:space="preserve">105</w:t>
-      </w:r>
-      <w:r>
-        <w:t xml:space="preserve"> </w:t>
-      </w:r>
-      <w:r>
-        <w:t xml:space="preserve">张券），最后一天定好闹钟（以免活动期间官方通过其他途径送券而多花钻石），使用</w:t>
+        <w:t xml:space="preserve">：拉满所有活动任务（白嫖 105 张券），最后一天定好闹钟（以免活动期间官方送券而浪费钻石），使用</w:t>
       </w:r>
       <w:r>
         <w:t xml:space="preserve"> </w:t>
@@ -1629,23 +1518,16 @@
         <w:t xml:space="preserve"> </w:t>
       </w:r>
       <w:r>
-        <w:rPr>
-          <w:bCs/>
-          <w:b/>
-        </w:rPr>
-        <w:t xml:space="preserve">【钻石】</w:t>
-      </w:r>
-      <w:r>
         <w:drawing>
           <wp:inline>
             <wp:extent cx="228600" cy="228600"/>
             <wp:effectExtent b="0" l="0" r="0" t="0"/>
-            <wp:docPr descr="钻石" title="" id="59" name="Picture"/>
+            <wp:docPr descr="钻石" title="" id="68" name="Picture"/>
             <a:graphic>
               <a:graphicData uri="http://schemas.openxmlformats.org/drawingml/2006/picture">
                 <pic:pic>
                   <pic:nvPicPr>
-                    <pic:cNvPr descr="assets/img/道具/钻石.png" id="60" name="Picture"/>
+                    <pic:cNvPr descr="assets/img/道具/钻石.png" id="69" name="Picture"/>
                     <pic:cNvPicPr>
                       <a:picLocks noChangeArrowheads="1" noChangeAspect="1"/>
                     </pic:cNvPicPr>
@@ -1697,32 +1579,76 @@
         <w:t xml:space="preserve"> </w:t>
       </w:r>
       <w:r>
-        <w:t xml:space="preserve">张券，即可成功解锁</w:t>
-      </w:r>
+        <w:t xml:space="preserve">张券，即可成功解锁。</w:t>
+      </w:r>
+    </w:p>
+    <w:bookmarkEnd w:id="70"/>
+    <w:bookmarkStart w:id="84" w:name="方案三任务-钻石自选礼包方案"/>
+    <w:p>
+      <w:pPr>
+        <w:pStyle w:val="Heading3"/>
+      </w:pPr>
+      <w:r>
+        <w:t xml:space="preserve">方案三：任务 + 钻石自选礼包方案</w:t>
+      </w:r>
+    </w:p>
+    <w:p>
+      <w:pPr>
+        <w:numPr>
+          <w:ilvl w:val="0"/>
+          <w:numId w:val="1005"/>
+        </w:numPr>
+        <w:pStyle w:val="Compact"/>
+      </w:pPr>
       <w:r>
         <w:rPr>
           <w:bCs/>
           <w:b/>
         </w:rPr>
-        <w:t xml:space="preserve">【伏尔甘】</w:t>
+        <w:t xml:space="preserve">适用人群</w:t>
+      </w:r>
+      <w:r>
+        <w:t xml:space="preserve">：钻石充足、希望同时补齐其他核心养成资源的玩家。</w:t>
+      </w:r>
+    </w:p>
+    <w:p>
+      <w:pPr>
+        <w:numPr>
+          <w:ilvl w:val="0"/>
+          <w:numId w:val="1005"/>
+        </w:numPr>
+        <w:pStyle w:val="Compact"/>
+      </w:pPr>
+      <w:r>
+        <w:rPr>
+          <w:bCs/>
+          <w:b/>
+        </w:rPr>
+        <w:t xml:space="preserve">具体策略</w:t>
+      </w:r>
+      <w:r>
+        <w:t xml:space="preserve">：拉满任务（105张券），购买包含</w:t>
+      </w:r>
+      <w:r>
+        <w:t xml:space="preserve"> </w:t>
       </w:r>
       <w:r>
         <w:drawing>
           <wp:inline>
             <wp:extent cx="228600" cy="228600"/>
             <wp:effectExtent b="0" l="0" r="0" t="0"/>
-            <wp:docPr descr="伏尔甘" title="" id="61" name="Picture"/>
+            <wp:docPr descr="异宠核心自选" title="" id="72" name="Picture"/>
             <a:graphic>
               <a:graphicData uri="http://schemas.openxmlformats.org/drawingml/2006/picture">
                 <pic:pic>
                   <pic:nvPicPr>
-                    <pic:cNvPr descr="assets/img/特工/伏尔甘.png" id="62" name="Picture"/>
+                    <pic:cNvPr descr="assets/img/宝箱/异宠核心自选宝箱.png" id="73" name="Picture"/>
                     <pic:cNvPicPr>
                       <a:picLocks noChangeArrowheads="1" noChangeAspect="1"/>
                     </pic:cNvPicPr>
                   </pic:nvPicPr>
                   <pic:blipFill>
-                    <a:blip r:embed="rId20"/>
+                    <a:blip r:embed="rId71"/>
                     <a:stretch>
                       <a:fillRect/>
                     </a:stretch>
@@ -1749,89 +1675,31 @@
         </w:drawing>
       </w:r>
       <w:r>
-        <w:t xml:space="preserve">。</w:t>
-      </w:r>
-    </w:p>
-    <w:bookmarkEnd w:id="63"/>
-    <w:bookmarkStart w:id="79" w:name="方案三任务-钻石自选礼包方案"/>
-    <w:p>
-      <w:pPr>
-        <w:pStyle w:val="Heading3"/>
-      </w:pPr>
-      <w:r>
-        <w:t xml:space="preserve">方案三：任务 + 钻石自选礼包方案</w:t>
-      </w:r>
-    </w:p>
-    <w:p>
-      <w:pPr>
-        <w:numPr>
-          <w:ilvl w:val="0"/>
-          <w:numId w:val="1005"/>
-        </w:numPr>
-        <w:pStyle w:val="Compact"/>
-      </w:pPr>
-      <w:r>
-        <w:rPr>
-          <w:bCs/>
-          <w:b/>
-        </w:rPr>
-        <w:t xml:space="preserve">适用人群</w:t>
-      </w:r>
-      <w:r>
-        <w:t xml:space="preserve">：钻石充足、希望同时补齐其他核心养成资源的玩家。</w:t>
-      </w:r>
-    </w:p>
-    <w:p>
-      <w:pPr>
-        <w:numPr>
-          <w:ilvl w:val="0"/>
-          <w:numId w:val="1005"/>
-        </w:numPr>
-        <w:pStyle w:val="Compact"/>
-      </w:pPr>
-      <w:r>
-        <w:rPr>
-          <w:bCs/>
-          <w:b/>
-        </w:rPr>
-        <w:t xml:space="preserve">具体策略</w:t>
-      </w:r>
-      <w:r>
-        <w:t xml:space="preserve">：拉满任务（</w:t>
-      </w:r>
-      <w:r>
-        <w:t xml:space="preserve">105</w:t>
-      </w:r>
-      <w:r>
-        <w:t xml:space="preserve">张券），购买包含</w:t>
-      </w:r>
-      <w:r>
-        <w:t xml:space="preserve"> </w:t>
-      </w:r>
-      <w:r>
-        <w:rPr>
-          <w:bCs/>
-          <w:b/>
-        </w:rPr>
-        <w:t xml:space="preserve">【异宠核心自选】</w:t>
+        <w:t xml:space="preserve"> </w:t>
+      </w:r>
+      <w:r>
+        <w:t xml:space="preserve">和</w:t>
+      </w:r>
+      <w:r>
+        <w:t xml:space="preserve"> </w:t>
       </w:r>
       <w:r>
         <w:drawing>
           <wp:inline>
             <wp:extent cx="228600" cy="228600"/>
             <wp:effectExtent b="0" l="0" r="0" t="0"/>
-            <wp:docPr descr="异宠核心自选" title="" id="65" name="Picture"/>
+            <wp:docPr descr="谐振芯片自选" title="" id="75" name="Picture"/>
             <a:graphic>
               <a:graphicData uri="http://schemas.openxmlformats.org/drawingml/2006/picture">
                 <pic:pic>
                   <pic:nvPicPr>
-                    <pic:cNvPr descr="assets/img/宝箱/异宠核心自选宝箱.png" id="66" name="Picture"/>
+                    <pic:cNvPr descr="assets/img/宝箱/谐振芯片自选宝箱.png" id="76" name="Picture"/>
                     <pic:cNvPicPr>
                       <a:picLocks noChangeArrowheads="1" noChangeAspect="1"/>
                     </pic:cNvPicPr>
                   </pic:nvPicPr>
                   <pic:blipFill>
-                    <a:blip r:embed="rId64"/>
+                    <a:blip r:embed="rId74"/>
                     <a:stretch>
                       <a:fillRect/>
                     </a:stretch>
@@ -1861,35 +1729,28 @@
         <w:t xml:space="preserve"> </w:t>
       </w:r>
       <w:r>
-        <w:t xml:space="preserve">和</w:t>
-      </w:r>
-      <w:r>
-        <w:t xml:space="preserve"> </w:t>
-      </w:r>
-      <w:r>
-        <w:rPr>
-          <w:bCs/>
-          <w:b/>
-        </w:rPr>
-        <w:t xml:space="preserve">【谐振芯片自选】</w:t>
+        <w:t xml:space="preserve">的特惠自选箱礼包（不推荐包含</w:t>
+      </w:r>
+      <w:r>
+        <w:t xml:space="preserve"> </w:t>
       </w:r>
       <w:r>
         <w:drawing>
           <wp:inline>
             <wp:extent cx="228600" cy="228600"/>
             <wp:effectExtent b="0" l="0" r="0" t="0"/>
-            <wp:docPr descr="谐振芯片自选" title="" id="68" name="Picture"/>
+            <wp:docPr descr="神器核心自选" title="" id="78" name="Picture"/>
             <a:graphic>
               <a:graphicData uri="http://schemas.openxmlformats.org/drawingml/2006/picture">
                 <pic:pic>
                   <pic:nvPicPr>
-                    <pic:cNvPr descr="assets/img/宝箱/谐振芯片自选宝箱.png" id="69" name="Picture"/>
+                    <pic:cNvPr descr="assets/img/宝箱/神器核心自选宝箱png.png" id="79" name="Picture"/>
                     <pic:cNvPicPr>
                       <a:picLocks noChangeArrowheads="1" noChangeAspect="1"/>
                     </pic:cNvPicPr>
                   </pic:nvPicPr>
                   <pic:blipFill>
-                    <a:blip r:embed="rId67"/>
+                    <a:blip r:embed="rId77"/>
                     <a:stretch>
                       <a:fillRect/>
                     </a:stretch>
@@ -1919,335 +1780,7 @@
         <w:t xml:space="preserve"> </w:t>
       </w:r>
       <w:r>
-        <w:t xml:space="preserve">的自选箱礼包（不推荐包含</w:t>
-      </w:r>
-      <w:r>
-        <w:t xml:space="preserve"> </w:t>
-      </w:r>
-      <w:r>
-        <w:rPr>
-          <w:bCs/>
-          <w:b/>
-        </w:rPr>
-        <w:t xml:space="preserve">【神器核心自选】</w:t>
-      </w:r>
-      <w:r>
-        <w:drawing>
-          <wp:inline>
-            <wp:extent cx="228600" cy="228600"/>
-            <wp:effectExtent b="0" l="0" r="0" t="0"/>
-            <wp:docPr descr="神器核心自选" title="" id="71" name="Picture"/>
-            <a:graphic>
-              <a:graphicData uri="http://schemas.openxmlformats.org/drawingml/2006/picture">
-                <pic:pic>
-                  <pic:nvPicPr>
-                    <pic:cNvPr descr="assets/img/宝箱/神器核心自选宝箱png.png" id="72" name="Picture"/>
-                    <pic:cNvPicPr>
-                      <a:picLocks noChangeArrowheads="1" noChangeAspect="1"/>
-                    </pic:cNvPicPr>
-                  </pic:nvPicPr>
-                  <pic:blipFill>
-                    <a:blip r:embed="rId70"/>
-                    <a:stretch>
-                      <a:fillRect/>
-                    </a:stretch>
-                  </pic:blipFill>
-                  <pic:spPr bwMode="auto">
-                    <a:xfrm>
-                      <a:off x="0" y="0"/>
-                      <a:ext cx="228600" cy="228600"/>
-                    </a:xfrm>
-                    <a:prstGeom prst="rect">
-                      <a:avLst/>
-                    </a:prstGeom>
-                    <a:noFill/>
-                    <a:ln w="9525">
-                      <a:noFill/>
-                      <a:headEnd/>
-                      <a:tailEnd/>
-                    </a:ln>
-                  </pic:spPr>
-                </pic:pic>
-              </a:graphicData>
-            </a:graphic>
-          </wp:inline>
-        </w:drawing>
-      </w:r>
-      <w:r>
-        <w:t xml:space="preserve"> </w:t>
-      </w:r>
-      <w:r>
         <w:t xml:space="preserve">的礼包）。购买完礼包后，再使用</w:t>
-      </w:r>
-      <w:r>
-        <w:rPr>
-          <w:bCs/>
-          <w:b/>
-        </w:rPr>
-        <w:t xml:space="preserve">【钻石】</w:t>
-      </w:r>
-      <w:r>
-        <w:drawing>
-          <wp:inline>
-            <wp:extent cx="228600" cy="228600"/>
-            <wp:effectExtent b="0" l="0" r="0" t="0"/>
-            <wp:docPr descr="钻石" title="" id="73" name="Picture"/>
-            <a:graphic>
-              <a:graphicData uri="http://schemas.openxmlformats.org/drawingml/2006/picture">
-                <pic:pic>
-                  <pic:nvPicPr>
-                    <pic:cNvPr descr="assets/img/道具/钻石.png" id="74" name="Picture"/>
-                    <pic:cNvPicPr>
-                      <a:picLocks noChangeArrowheads="1" noChangeAspect="1"/>
-                    </pic:cNvPicPr>
-                  </pic:nvPicPr>
-                  <pic:blipFill>
-                    <a:blip r:embed="rId30"/>
-                    <a:stretch>
-                      <a:fillRect/>
-                    </a:stretch>
-                  </pic:blipFill>
-                  <pic:spPr bwMode="auto">
-                    <a:xfrm>
-                      <a:off x="0" y="0"/>
-                      <a:ext cx="228600" cy="228600"/>
-                    </a:xfrm>
-                    <a:prstGeom prst="rect">
-                      <a:avLst/>
-                    </a:prstGeom>
-                    <a:noFill/>
-                    <a:ln w="9525">
-                      <a:noFill/>
-                      <a:headEnd/>
-                      <a:tailEnd/>
-                    </a:ln>
-                  </pic:spPr>
-                </pic:pic>
-              </a:graphicData>
-            </a:graphic>
-          </wp:inline>
-        </w:drawing>
-      </w:r>
-      <w:r>
-        <w:t xml:space="preserve">补齐</w:t>
-      </w:r>
-      <w:r>
-        <w:t xml:space="preserve"> </w:t>
-      </w:r>
-      <w:r>
-        <w:rPr>
-          <w:bCs/>
-          <w:b/>
-        </w:rPr>
-        <w:t xml:space="preserve">130</w:t>
-      </w:r>
-      <w:r>
-        <w:t xml:space="preserve"> </w:t>
-      </w:r>
-      <w:r>
-        <w:t xml:space="preserve">张券（相当于</w:t>
-      </w:r>
-      <w:r>
-        <w:t xml:space="preserve"> </w:t>
-      </w:r>
-      <w:r>
-        <w:rPr>
-          <w:bCs/>
-          <w:b/>
-        </w:rPr>
-        <w:t xml:space="preserve">39,000</w:t>
-      </w:r>
-      <w:r>
-        <w:t xml:space="preserve"> </w:t>
-      </w:r>
-      <w:r>
-        <w:rPr>
-          <w:bCs/>
-          <w:b/>
-        </w:rPr>
-        <w:t xml:space="preserve">【钻石】</w:t>
-      </w:r>
-      <w:r>
-        <w:drawing>
-          <wp:inline>
-            <wp:extent cx="228600" cy="228600"/>
-            <wp:effectExtent b="0" l="0" r="0" t="0"/>
-            <wp:docPr descr="钻石" title="" id="75" name="Picture"/>
-            <a:graphic>
-              <a:graphicData uri="http://schemas.openxmlformats.org/drawingml/2006/picture">
-                <pic:pic>
-                  <pic:nvPicPr>
-                    <pic:cNvPr descr="assets/img/道具/钻石.png" id="76" name="Picture"/>
-                    <pic:cNvPicPr>
-                      <a:picLocks noChangeArrowheads="1" noChangeAspect="1"/>
-                    </pic:cNvPicPr>
-                  </pic:nvPicPr>
-                  <pic:blipFill>
-                    <a:blip r:embed="rId30"/>
-                    <a:stretch>
-                      <a:fillRect/>
-                    </a:stretch>
-                  </pic:blipFill>
-                  <pic:spPr bwMode="auto">
-                    <a:xfrm>
-                      <a:off x="0" y="0"/>
-                      <a:ext cx="228600" cy="228600"/>
-                    </a:xfrm>
-                    <a:prstGeom prst="rect">
-                      <a:avLst/>
-                    </a:prstGeom>
-                    <a:noFill/>
-                    <a:ln w="9525">
-                      <a:noFill/>
-                      <a:headEnd/>
-                      <a:tailEnd/>
-                    </a:ln>
-                  </pic:spPr>
-                </pic:pic>
-              </a:graphicData>
-            </a:graphic>
-          </wp:inline>
-        </w:drawing>
-      </w:r>
-      <w:r>
-        <w:t xml:space="preserve">）即可解锁</w:t>
-      </w:r>
-      <w:r>
-        <w:rPr>
-          <w:bCs/>
-          <w:b/>
-        </w:rPr>
-        <w:t xml:space="preserve">【伏尔甘】</w:t>
-      </w:r>
-      <w:r>
-        <w:drawing>
-          <wp:inline>
-            <wp:extent cx="228600" cy="228600"/>
-            <wp:effectExtent b="0" l="0" r="0" t="0"/>
-            <wp:docPr descr="伏尔甘" title="" id="77" name="Picture"/>
-            <a:graphic>
-              <a:graphicData uri="http://schemas.openxmlformats.org/drawingml/2006/picture">
-                <pic:pic>
-                  <pic:nvPicPr>
-                    <pic:cNvPr descr="assets/img/特工/伏尔甘.png" id="78" name="Picture"/>
-                    <pic:cNvPicPr>
-                      <a:picLocks noChangeArrowheads="1" noChangeAspect="1"/>
-                    </pic:cNvPicPr>
-                  </pic:nvPicPr>
-                  <pic:blipFill>
-                    <a:blip r:embed="rId20"/>
-                    <a:stretch>
-                      <a:fillRect/>
-                    </a:stretch>
-                  </pic:blipFill>
-                  <pic:spPr bwMode="auto">
-                    <a:xfrm>
-                      <a:off x="0" y="0"/>
-                      <a:ext cx="228600" cy="228600"/>
-                    </a:xfrm>
-                    <a:prstGeom prst="rect">
-                      <a:avLst/>
-                    </a:prstGeom>
-                    <a:noFill/>
-                    <a:ln w="9525">
-                      <a:noFill/>
-                      <a:headEnd/>
-                      <a:tailEnd/>
-                    </a:ln>
-                  </pic:spPr>
-                </pic:pic>
-              </a:graphicData>
-            </a:graphic>
-          </wp:inline>
-        </w:drawing>
-      </w:r>
-      <w:r>
-        <w:t xml:space="preserve">。</w:t>
-      </w:r>
-    </w:p>
-    <w:bookmarkEnd w:id="79"/>
-    <w:bookmarkStart w:id="101" w:name="方案四拉满任务-购买128元礼包方案"/>
-    <w:p>
-      <w:pPr>
-        <w:pStyle w:val="Heading3"/>
-      </w:pPr>
-      <w:r>
-        <w:t xml:space="preserve">方案四：拉满任务 + 购买128元礼包方案</w:t>
-      </w:r>
-    </w:p>
-    <w:p>
-      <w:pPr>
-        <w:numPr>
-          <w:ilvl w:val="0"/>
-          <w:numId w:val="1006"/>
-        </w:numPr>
-        <w:pStyle w:val="Compact"/>
-      </w:pPr>
-      <w:r>
-        <w:rPr>
-          <w:bCs/>
-          <w:b/>
-        </w:rPr>
-        <w:t xml:space="preserve">适用人群</w:t>
-      </w:r>
-      <w:r>
-        <w:t xml:space="preserve">：钻石充足、希望同时补齐其他核心养成资源的微氪玩家。</w:t>
-      </w:r>
-    </w:p>
-    <w:p>
-      <w:pPr>
-        <w:numPr>
-          <w:ilvl w:val="0"/>
-          <w:numId w:val="1006"/>
-        </w:numPr>
-        <w:pStyle w:val="Compact"/>
-      </w:pPr>
-      <w:r>
-        <w:rPr>
-          <w:bCs/>
-          <w:b/>
-        </w:rPr>
-        <w:t xml:space="preserve">具体策略</w:t>
-      </w:r>
-      <w:r>
-        <w:t xml:space="preserve">：拉满任务（</w:t>
-      </w:r>
-      <w:r>
-        <w:t xml:space="preserve">105</w:t>
-      </w:r>
-      <w:r>
-        <w:t xml:space="preserve">张券），购买</w:t>
-      </w:r>
-      <w:r>
-        <w:t xml:space="preserve"> </w:t>
-      </w:r>
-      <w:r>
-        <w:t xml:space="preserve">128</w:t>
-      </w:r>
-      <w:r>
-        <w:t xml:space="preserve"> </w:t>
-      </w:r>
-      <w:r>
-        <w:t xml:space="preserve">元礼包（内含</w:t>
-      </w:r>
-      <w:r>
-        <w:t xml:space="preserve"> </w:t>
-      </w:r>
-      <w:r>
-        <w:t xml:space="preserve">10</w:t>
-      </w:r>
-      <w:r>
-        <w:t xml:space="preserve"> </w:t>
-      </w:r>
-      <w:r>
-        <w:t xml:space="preserve">张券）。购买完礼包后，再使用</w:t>
-      </w:r>
-      <w:r>
-        <w:rPr>
-          <w:bCs/>
-          <w:b/>
-        </w:rPr>
-        <w:t xml:space="preserve">【钻石】</w:t>
       </w:r>
       <w:r>
         <w:drawing>
@@ -2302,7 +1835,7 @@
           <w:bCs/>
           <w:b/>
         </w:rPr>
-        <w:t xml:space="preserve">185</w:t>
+        <w:t xml:space="preserve">130</w:t>
       </w:r>
       <w:r>
         <w:t xml:space="preserve"> </w:t>
@@ -2318,17 +1851,10 @@
           <w:bCs/>
           <w:b/>
         </w:rPr>
-        <w:t xml:space="preserve">55,500</w:t>
-      </w:r>
-      <w:r>
-        <w:t xml:space="preserve"> </w:t>
-      </w:r>
-      <w:r>
-        <w:rPr>
-          <w:bCs/>
-          <w:b/>
-        </w:rPr>
-        <w:t xml:space="preserve">【钻石】</w:t>
+        <w:t xml:space="preserve">39,000</w:t>
+      </w:r>
+      <w:r>
+        <w:t xml:space="preserve"> </w:t>
       </w:r>
       <w:r>
         <w:drawing>
@@ -2373,26 +1899,291 @@
         </w:drawing>
       </w:r>
       <w:r>
-        <w:t xml:space="preserve">）即可解锁</w:t>
-      </w:r>
+        <w:t xml:space="preserve">）即可解锁。</w:t>
+      </w:r>
+    </w:p>
+    <w:bookmarkEnd w:id="84"/>
+    <w:bookmarkStart w:id="99" w:name="方案四拉满任务-购买128元礼包方案"/>
+    <w:p>
+      <w:pPr>
+        <w:pStyle w:val="Heading3"/>
+      </w:pPr>
+      <w:r>
+        <w:t xml:space="preserve">方案四：拉满任务 + 购买128元礼包方案</w:t>
+      </w:r>
+    </w:p>
+    <w:p>
+      <w:pPr>
+        <w:numPr>
+          <w:ilvl w:val="0"/>
+          <w:numId w:val="1006"/>
+        </w:numPr>
+        <w:pStyle w:val="Compact"/>
+      </w:pPr>
       <w:r>
         <w:rPr>
           <w:bCs/>
           <w:b/>
         </w:rPr>
-        <w:t xml:space="preserve">【伏尔甘】</w:t>
+        <w:t xml:space="preserve">适用人群</w:t>
+      </w:r>
+      <w:r>
+        <w:t xml:space="preserve">：钻石充足、微氪希望同时补齐其他核心养成资源的玩家。</w:t>
+      </w:r>
+    </w:p>
+    <w:p>
+      <w:pPr>
+        <w:numPr>
+          <w:ilvl w:val="0"/>
+          <w:numId w:val="1006"/>
+        </w:numPr>
+        <w:pStyle w:val="Compact"/>
+      </w:pPr>
+      <w:r>
+        <w:rPr>
+          <w:bCs/>
+          <w:b/>
+        </w:rPr>
+        <w:t xml:space="preserve">具体策略</w:t>
+      </w:r>
+      <w:r>
+        <w:t xml:space="preserve">：拉满任务（105张券），购买128元礼包。购买完礼包后，再使用</w:t>
       </w:r>
       <w:r>
         <w:drawing>
           <wp:inline>
             <wp:extent cx="228600" cy="228600"/>
             <wp:effectExtent b="0" l="0" r="0" t="0"/>
-            <wp:docPr descr="伏尔甘" title="" id="84" name="Picture"/>
+            <wp:docPr descr="钻石" title="" id="85" name="Picture"/>
             <a:graphic>
               <a:graphicData uri="http://schemas.openxmlformats.org/drawingml/2006/picture">
                 <pic:pic>
                   <pic:nvPicPr>
-                    <pic:cNvPr descr="assets/img/特工/伏尔甘.png" id="85" name="Picture"/>
+                    <pic:cNvPr descr="assets/img/道具/钻石.png" id="86" name="Picture"/>
+                    <pic:cNvPicPr>
+                      <a:picLocks noChangeArrowheads="1" noChangeAspect="1"/>
+                    </pic:cNvPicPr>
+                  </pic:nvPicPr>
+                  <pic:blipFill>
+                    <a:blip r:embed="rId30"/>
+                    <a:stretch>
+                      <a:fillRect/>
+                    </a:stretch>
+                  </pic:blipFill>
+                  <pic:spPr bwMode="auto">
+                    <a:xfrm>
+                      <a:off x="0" y="0"/>
+                      <a:ext cx="228600" cy="228600"/>
+                    </a:xfrm>
+                    <a:prstGeom prst="rect">
+                      <a:avLst/>
+                    </a:prstGeom>
+                    <a:noFill/>
+                    <a:ln w="9525">
+                      <a:noFill/>
+                      <a:headEnd/>
+                      <a:tailEnd/>
+                    </a:ln>
+                  </pic:spPr>
+                </pic:pic>
+              </a:graphicData>
+            </a:graphic>
+          </wp:inline>
+        </w:drawing>
+      </w:r>
+      <w:r>
+        <w:t xml:space="preserve">补齐</w:t>
+      </w:r>
+      <w:r>
+        <w:t xml:space="preserve"> </w:t>
+      </w:r>
+      <w:r>
+        <w:rPr>
+          <w:bCs/>
+          <w:b/>
+        </w:rPr>
+        <w:t xml:space="preserve">130</w:t>
+      </w:r>
+      <w:r>
+        <w:t xml:space="preserve"> </w:t>
+      </w:r>
+      <w:r>
+        <w:t xml:space="preserve">张券（相当于</w:t>
+      </w:r>
+      <w:r>
+        <w:t xml:space="preserve"> </w:t>
+      </w:r>
+      <w:r>
+        <w:rPr>
+          <w:bCs/>
+          <w:b/>
+        </w:rPr>
+        <w:t xml:space="preserve">39,000</w:t>
+      </w:r>
+      <w:r>
+        <w:t xml:space="preserve"> </w:t>
+      </w:r>
+      <w:r>
+        <w:drawing>
+          <wp:inline>
+            <wp:extent cx="228600" cy="228600"/>
+            <wp:effectExtent b="0" l="0" r="0" t="0"/>
+            <wp:docPr descr="钻石" title="" id="87" name="Picture"/>
+            <a:graphic>
+              <a:graphicData uri="http://schemas.openxmlformats.org/drawingml/2006/picture">
+                <pic:pic>
+                  <pic:nvPicPr>
+                    <pic:cNvPr descr="assets/img/道具/钻石.png" id="88" name="Picture"/>
+                    <pic:cNvPicPr>
+                      <a:picLocks noChangeArrowheads="1" noChangeAspect="1"/>
+                    </pic:cNvPicPr>
+                  </pic:nvPicPr>
+                  <pic:blipFill>
+                    <a:blip r:embed="rId30"/>
+                    <a:stretch>
+                      <a:fillRect/>
+                    </a:stretch>
+                  </pic:blipFill>
+                  <pic:spPr bwMode="auto">
+                    <a:xfrm>
+                      <a:off x="0" y="0"/>
+                      <a:ext cx="228600" cy="228600"/>
+                    </a:xfrm>
+                    <a:prstGeom prst="rect">
+                      <a:avLst/>
+                    </a:prstGeom>
+                    <a:noFill/>
+                    <a:ln w="9525">
+                      <a:noFill/>
+                      <a:headEnd/>
+                      <a:tailEnd/>
+                    </a:ln>
+                  </pic:spPr>
+                </pic:pic>
+              </a:graphicData>
+            </a:graphic>
+          </wp:inline>
+        </w:drawing>
+      </w:r>
+      <w:r>
+        <w:t xml:space="preserve">）即可多获得80</w:t>
+      </w:r>
+      <w:r>
+        <w:drawing>
+          <wp:inline>
+            <wp:extent cx="228600" cy="228600"/>
+            <wp:effectExtent b="0" l="0" r="0" t="0"/>
+            <wp:docPr descr="火神之锤" title="" id="90" name="Picture"/>
+            <a:graphic>
+              <a:graphicData uri="http://schemas.openxmlformats.org/drawingml/2006/picture">
+                <pic:pic>
+                  <pic:nvPicPr>
+                    <pic:cNvPr descr="assets/img/活动道具/神火活动/火神之锤.png" id="91" name="Picture"/>
+                    <pic:cNvPicPr>
+                      <a:picLocks noChangeArrowheads="1" noChangeAspect="1"/>
+                    </pic:cNvPicPr>
+                  </pic:nvPicPr>
+                  <pic:blipFill>
+                    <a:blip r:embed="rId89"/>
+                    <a:stretch>
+                      <a:fillRect/>
+                    </a:stretch>
+                  </pic:blipFill>
+                  <pic:spPr bwMode="auto">
+                    <a:xfrm>
+                      <a:off x="0" y="0"/>
+                      <a:ext cx="228600" cy="228600"/>
+                    </a:xfrm>
+                    <a:prstGeom prst="rect">
+                      <a:avLst/>
+                    </a:prstGeom>
+                    <a:noFill/>
+                    <a:ln w="9525">
+                      <a:noFill/>
+                      <a:headEnd/>
+                      <a:tailEnd/>
+                    </a:ln>
+                  </pic:spPr>
+                </pic:pic>
+              </a:graphicData>
+            </a:graphic>
+          </wp:inline>
+        </w:drawing>
+      </w:r>
+      <w:r>
+        <w:t xml:space="preserve">碎片用于升星。</w:t>
+      </w:r>
+    </w:p>
+    <w:p>
+      <w:r>
+        <w:pict>
+          <v:rect style="width:0;height:1.5pt" o:hralign="center" o:hrstd="t" o:hr="t"/>
+        </w:pict>
+      </w:r>
+    </w:p>
+    <w:p>
+      <w:pPr>
+        <w:pStyle w:val="FirstParagraph"/>
+      </w:pPr>
+      <w:r>
+        <w:t xml:space="preserve">此外，还有一种特殊情况：如果你目前尚未解锁哪吒</w:t>
+      </w:r>
+      <w:r>
+        <w:drawing>
+          <wp:inline>
+            <wp:extent cx="228600" cy="228600"/>
+            <wp:effectExtent b="0" l="0" r="0" t="0"/>
+            <wp:docPr descr="哪吒" title="" id="93" name="Picture"/>
+            <a:graphic>
+              <a:graphicData uri="http://schemas.openxmlformats.org/drawingml/2006/picture">
+                <pic:pic>
+                  <pic:nvPicPr>
+                    <pic:cNvPr descr="assets/img/特工/哪吒.png" id="94" name="Picture"/>
+                    <pic:cNvPicPr>
+                      <a:picLocks noChangeArrowheads="1" noChangeAspect="1"/>
+                    </pic:cNvPicPr>
+                  </pic:nvPicPr>
+                  <pic:blipFill>
+                    <a:blip r:embed="rId92"/>
+                    <a:stretch>
+                      <a:fillRect/>
+                    </a:stretch>
+                  </pic:blipFill>
+                  <pic:spPr bwMode="auto">
+                    <a:xfrm>
+                      <a:off x="0" y="0"/>
+                      <a:ext cx="228600" cy="228600"/>
+                    </a:xfrm>
+                    <a:prstGeom prst="rect">
+                      <a:avLst/>
+                    </a:prstGeom>
+                    <a:noFill/>
+                    <a:ln w="9525">
+                      <a:noFill/>
+                      <a:headEnd/>
+                      <a:tailEnd/>
+                    </a:ln>
+                  </pic:spPr>
+                </pic:pic>
+              </a:graphicData>
+            </a:graphic>
+          </wp:inline>
+        </w:drawing>
+      </w:r>
+      <w:r>
+        <w:t xml:space="preserve">，那么在本次活动中建议优先选择哪吒碎片，待哪吒解锁后再选择伏尔甘</w:t>
+      </w:r>
+      <w:r>
+        <w:drawing>
+          <wp:inline>
+            <wp:extent cx="228600" cy="228600"/>
+            <wp:effectExtent b="0" l="0" r="0" t="0"/>
+            <wp:docPr descr="伏尔甘" title="" id="95" name="Picture"/>
+            <a:graphic>
+              <a:graphicData uri="http://schemas.openxmlformats.org/drawingml/2006/picture">
+                <pic:pic>
+                  <pic:nvPicPr>
+                    <pic:cNvPr descr="assets/img/特工/伏尔甘.png" id="96" name="Picture"/>
                     <pic:cNvPicPr>
                       <a:picLocks noChangeArrowheads="1" noChangeAspect="1"/>
                     </pic:cNvPicPr>
@@ -2425,331 +2216,27 @@
         </w:drawing>
       </w:r>
       <w:r>
-        <w:t xml:space="preserve">，同时额外获得</w:t>
-      </w:r>
-      <w:r>
-        <w:t xml:space="preserve"> </w:t>
-      </w:r>
-      <w:r>
-        <w:t xml:space="preserve">80</w:t>
-      </w:r>
-      <w:r>
-        <w:t xml:space="preserve"> </w:t>
-      </w:r>
-      <w:r>
-        <w:rPr>
-          <w:bCs/>
-          <w:b/>
-        </w:rPr>
-        <w:t xml:space="preserve">【火神之锤】</w:t>
+        <w:t xml:space="preserve">碎片。因为伏尔甘的核心伤害加成需要哪吒挂神火 Buff 才能完全发挥。若本期钻石不足以直接解锁伏尔甘也无需担心，下期神火活动预计依然能兑换其碎片，届时提前备足钻石即可。</w:t>
+      </w:r>
+    </w:p>
+    <w:p>
+      <w:pPr>
+        <w:pStyle w:val="BodyText"/>
+      </w:pPr>
+      <w:r>
+        <w:t xml:space="preserve">以上就是本次《神火特工第二弹 SP特工伏尔甘获取攻略》的全部内容，祝大家都能顺利拿到！下一篇内容将会对</w:t>
       </w:r>
       <w:r>
         <w:drawing>
           <wp:inline>
             <wp:extent cx="228600" cy="228600"/>
             <wp:effectExtent b="0" l="0" r="0" t="0"/>
-            <wp:docPr descr="火神之锤" title="" id="87" name="Picture"/>
+            <wp:docPr descr="伏尔甘" title="" id="97" name="Picture"/>
             <a:graphic>
               <a:graphicData uri="http://schemas.openxmlformats.org/drawingml/2006/picture">
                 <pic:pic>
                   <pic:nvPicPr>
-                    <pic:cNvPr descr="assets/img/活动道具/神火活动/火神之锤.png" id="88" name="Picture"/>
-                    <pic:cNvPicPr>
-                      <a:picLocks noChangeArrowheads="1" noChangeAspect="1"/>
-                    </pic:cNvPicPr>
-                  </pic:nvPicPr>
-                  <pic:blipFill>
-                    <a:blip r:embed="rId86"/>
-                    <a:stretch>
-                      <a:fillRect/>
-                    </a:stretch>
-                  </pic:blipFill>
-                  <pic:spPr bwMode="auto">
-                    <a:xfrm>
-                      <a:off x="0" y="0"/>
-                      <a:ext cx="228600" cy="228600"/>
-                    </a:xfrm>
-                    <a:prstGeom prst="rect">
-                      <a:avLst/>
-                    </a:prstGeom>
-                    <a:noFill/>
-                    <a:ln w="9525">
-                      <a:noFill/>
-                      <a:headEnd/>
-                      <a:tailEnd/>
-                    </a:ln>
-                  </pic:spPr>
-                </pic:pic>
-              </a:graphicData>
-            </a:graphic>
-          </wp:inline>
-        </w:drawing>
-      </w:r>
-      <w:r>
-        <w:t xml:space="preserve"> </w:t>
-      </w:r>
-      <w:r>
-        <w:t xml:space="preserve">碎片用于升星。</w:t>
-      </w:r>
-    </w:p>
-    <w:p>
-      <w:r>
-        <w:pict>
-          <v:rect style="width:0;height:1.5pt" o:hralign="center" o:hrstd="t" o:hr="t"/>
-        </w:pict>
-      </w:r>
-    </w:p>
-    <w:p>
-      <w:pPr>
-        <w:pStyle w:val="FirstParagraph"/>
-      </w:pPr>
-      <w:r>
-        <w:t xml:space="preserve">此外，还有一种特殊情况：如果你目前尚未解锁</w:t>
-      </w:r>
-      <w:r>
-        <w:rPr>
-          <w:bCs/>
-          <w:b/>
-        </w:rPr>
-        <w:t xml:space="preserve">【哪吒】</w:t>
-      </w:r>
-      <w:r>
-        <w:drawing>
-          <wp:inline>
-            <wp:extent cx="228600" cy="228600"/>
-            <wp:effectExtent b="0" l="0" r="0" t="0"/>
-            <wp:docPr descr="哪吒" title="" id="90" name="Picture"/>
-            <a:graphic>
-              <a:graphicData uri="http://schemas.openxmlformats.org/drawingml/2006/picture">
-                <pic:pic>
-                  <pic:nvPicPr>
-                    <pic:cNvPr descr="assets/img/特工/哪吒.png" id="91" name="Picture"/>
-                    <pic:cNvPicPr>
-                      <a:picLocks noChangeArrowheads="1" noChangeAspect="1"/>
-                    </pic:cNvPicPr>
-                  </pic:nvPicPr>
-                  <pic:blipFill>
-                    <a:blip r:embed="rId89"/>
-                    <a:stretch>
-                      <a:fillRect/>
-                    </a:stretch>
-                  </pic:blipFill>
-                  <pic:spPr bwMode="auto">
-                    <a:xfrm>
-                      <a:off x="0" y="0"/>
-                      <a:ext cx="228600" cy="228600"/>
-                    </a:xfrm>
-                    <a:prstGeom prst="rect">
-                      <a:avLst/>
-                    </a:prstGeom>
-                    <a:noFill/>
-                    <a:ln w="9525">
-                      <a:noFill/>
-                      <a:headEnd/>
-                      <a:tailEnd/>
-                    </a:ln>
-                  </pic:spPr>
-                </pic:pic>
-              </a:graphicData>
-            </a:graphic>
-          </wp:inline>
-        </w:drawing>
-      </w:r>
-      <w:r>
-        <w:t xml:space="preserve">，那么在本次活动中建议优先选择</w:t>
-      </w:r>
-      <w:r>
-        <w:rPr>
-          <w:bCs/>
-          <w:b/>
-        </w:rPr>
-        <w:t xml:space="preserve">【莲花化身】</w:t>
-      </w:r>
-      <w:r>
-        <w:drawing>
-          <wp:inline>
-            <wp:extent cx="228600" cy="228600"/>
-            <wp:effectExtent b="0" l="0" r="0" t="0"/>
-            <wp:docPr descr="莲花化身" title="" id="93" name="Picture"/>
-            <a:graphic>
-              <a:graphicData uri="http://schemas.openxmlformats.org/drawingml/2006/picture">
-                <pic:pic>
-                  <pic:nvPicPr>
-                    <pic:cNvPr descr="assets/img/活动道具/神火活动/莲花化身.png" id="94" name="Picture"/>
-                    <pic:cNvPicPr>
-                      <a:picLocks noChangeArrowheads="1" noChangeAspect="1"/>
-                    </pic:cNvPicPr>
-                  </pic:nvPicPr>
-                  <pic:blipFill>
-                    <a:blip r:embed="rId92"/>
-                    <a:stretch>
-                      <a:fillRect/>
-                    </a:stretch>
-                  </pic:blipFill>
-                  <pic:spPr bwMode="auto">
-                    <a:xfrm>
-                      <a:off x="0" y="0"/>
-                      <a:ext cx="228600" cy="228600"/>
-                    </a:xfrm>
-                    <a:prstGeom prst="rect">
-                      <a:avLst/>
-                    </a:prstGeom>
-                    <a:noFill/>
-                    <a:ln w="9525">
-                      <a:noFill/>
-                      <a:headEnd/>
-                      <a:tailEnd/>
-                    </a:ln>
-                  </pic:spPr>
-                </pic:pic>
-              </a:graphicData>
-            </a:graphic>
-          </wp:inline>
-        </w:drawing>
-      </w:r>
-      <w:r>
-        <w:t xml:space="preserve">，待</w:t>
-      </w:r>
-      <w:r>
-        <w:rPr>
-          <w:bCs/>
-          <w:b/>
-        </w:rPr>
-        <w:t xml:space="preserve">【哪吒】</w:t>
-      </w:r>
-      <w:r>
-        <w:drawing>
-          <wp:inline>
-            <wp:extent cx="228600" cy="228600"/>
-            <wp:effectExtent b="0" l="0" r="0" t="0"/>
-            <wp:docPr descr="哪吒" title="" id="95" name="Picture"/>
-            <a:graphic>
-              <a:graphicData uri="http://schemas.openxmlformats.org/drawingml/2006/picture">
-                <pic:pic>
-                  <pic:nvPicPr>
-                    <pic:cNvPr descr="assets/img/特工/哪吒.png" id="96" name="Picture"/>
-                    <pic:cNvPicPr>
-                      <a:picLocks noChangeArrowheads="1" noChangeAspect="1"/>
-                    </pic:cNvPicPr>
-                  </pic:nvPicPr>
-                  <pic:blipFill>
-                    <a:blip r:embed="rId89"/>
-                    <a:stretch>
-                      <a:fillRect/>
-                    </a:stretch>
-                  </pic:blipFill>
-                  <pic:spPr bwMode="auto">
-                    <a:xfrm>
-                      <a:off x="0" y="0"/>
-                      <a:ext cx="228600" cy="228600"/>
-                    </a:xfrm>
-                    <a:prstGeom prst="rect">
-                      <a:avLst/>
-                    </a:prstGeom>
-                    <a:noFill/>
-                    <a:ln w="9525">
-                      <a:noFill/>
-                      <a:headEnd/>
-                      <a:tailEnd/>
-                    </a:ln>
-                  </pic:spPr>
-                </pic:pic>
-              </a:graphicData>
-            </a:graphic>
-          </wp:inline>
-        </w:drawing>
-      </w:r>
-      <w:r>
-        <w:t xml:space="preserve">解锁后再选择</w:t>
-      </w:r>
-      <w:r>
-        <w:rPr>
-          <w:bCs/>
-          <w:b/>
-        </w:rPr>
-        <w:t xml:space="preserve">【火神之锤】</w:t>
-      </w:r>
-      <w:r>
-        <w:drawing>
-          <wp:inline>
-            <wp:extent cx="228600" cy="228600"/>
-            <wp:effectExtent b="0" l="0" r="0" t="0"/>
-            <wp:docPr descr="火神之锤" title="" id="97" name="Picture"/>
-            <a:graphic>
-              <a:graphicData uri="http://schemas.openxmlformats.org/drawingml/2006/picture">
-                <pic:pic>
-                  <pic:nvPicPr>
-                    <pic:cNvPr descr="assets/img/活动道具/神火活动/火神之锤.png" id="98" name="Picture"/>
-                    <pic:cNvPicPr>
-                      <a:picLocks noChangeArrowheads="1" noChangeAspect="1"/>
-                    </pic:cNvPicPr>
-                  </pic:nvPicPr>
-                  <pic:blipFill>
-                    <a:blip r:embed="rId86"/>
-                    <a:stretch>
-                      <a:fillRect/>
-                    </a:stretch>
-                  </pic:blipFill>
-                  <pic:spPr bwMode="auto">
-                    <a:xfrm>
-                      <a:off x="0" y="0"/>
-                      <a:ext cx="228600" cy="228600"/>
-                    </a:xfrm>
-                    <a:prstGeom prst="rect">
-                      <a:avLst/>
-                    </a:prstGeom>
-                    <a:noFill/>
-                    <a:ln w="9525">
-                      <a:noFill/>
-                      <a:headEnd/>
-                      <a:tailEnd/>
-                    </a:ln>
-                  </pic:spPr>
-                </pic:pic>
-              </a:graphicData>
-            </a:graphic>
-          </wp:inline>
-        </w:drawing>
-      </w:r>
-      <w:r>
-        <w:t xml:space="preserve">碎片。因为伏尔甘的核心伤害加成需要哪吒挂</w:t>
-      </w:r>
-      <w:r>
-        <w:rPr>
-          <w:bCs/>
-          <w:b/>
-        </w:rPr>
-        <w:t xml:space="preserve">【神火Buff】</w:t>
-      </w:r>
-      <w:r>
-        <w:t xml:space="preserve">才能完全发挥。若本期钻石不足以直接解锁伏尔甘也无需担心，下期神火活动预计依然能兑换其碎片，届时提前备足钻石即可。</w:t>
-      </w:r>
-    </w:p>
-    <w:p>
-      <w:pPr>
-        <w:pStyle w:val="BodyText"/>
-      </w:pPr>
-      <w:r>
-        <w:t xml:space="preserve">以上就是本次《神火特工第二弹 SP特工伏尔甘获取攻略》的全部内容，祝大家都能顺利拿到！下一篇内容将会对</w:t>
-      </w:r>
-      <w:r>
-        <w:rPr>
-          <w:bCs/>
-          <w:b/>
-        </w:rPr>
-        <w:t xml:space="preserve">【伏尔甘】</w:t>
-      </w:r>
-      <w:r>
-        <w:drawing>
-          <wp:inline>
-            <wp:extent cx="228600" cy="228600"/>
-            <wp:effectExtent b="0" l="0" r="0" t="0"/>
-            <wp:docPr descr="伏尔甘" title="" id="99" name="Picture"/>
-            <a:graphic>
-              <a:graphicData uri="http://schemas.openxmlformats.org/drawingml/2006/picture">
-                <pic:pic>
-                  <pic:nvPicPr>
-                    <pic:cNvPr descr="assets/img/特工/伏尔甘.png" id="100" name="Picture"/>
+                    <pic:cNvPr descr="assets/img/特工/伏尔甘.png" id="98" name="Picture"/>
                     <pic:cNvPicPr>
                       <a:picLocks noChangeArrowheads="1" noChangeAspect="1"/>
                     </pic:cNvPicPr>
@@ -2841,8 +2328,8 @@
         <w:t xml:space="preserve">讨论，我会第一时间回复大家，我们下期再见！</w:t>
       </w:r>
     </w:p>
-    <w:bookmarkEnd w:id="101"/>
-    <w:bookmarkEnd w:id="102"/>
+    <w:bookmarkEnd w:id="99"/>
+    <w:bookmarkEnd w:id="100"/>
     <w:sectPr/>
   </w:body>
 </w:document>

</xml_diff>

<commit_message>
docs: update Vulcan guide text and compile to wechat draft
</commit_message>
<xml_diff>
--- a/my-articles-md/活动/sp特工伏尔甘获取攻略/sp特工伏尔甘获取攻略_wechat.docx
+++ b/my-articles-md/活动/sp特工伏尔甘获取攻略/sp特工伏尔甘获取攻略_wechat.docx
@@ -335,7 +335,7 @@
       </w:r>
     </w:p>
     <w:bookmarkEnd w:id="29"/>
-    <w:bookmarkStart w:id="57" w:name="二白嫖及钻石规划策略"/>
+    <w:bookmarkStart w:id="59" w:name="二白嫖及钻石规划策略"/>
     <w:p>
       <w:pPr>
         <w:pStyle w:val="Heading2"/>
@@ -413,19 +413,64 @@
         <w:t xml:space="preserve">属性机制简析</w:t>
       </w:r>
       <w:r>
-        <w:t xml:space="preserve">：个人认为，推荐入手。虽然</w:t>
+        <w:t xml:space="preserve">：个人认为，推荐入手本次活动可以先开通后面慢慢到1</w:t>
       </w:r>
       <w:r>
         <w:drawing>
           <wp:inline>
             <wp:extent cx="228600" cy="228600"/>
             <wp:effectExtent b="0" l="0" r="0" t="0"/>
-            <wp:docPr descr="伏尔甘" title="" id="33" name="Picture"/>
+            <wp:docPr descr="红星" title="" id="34" name="Picture"/>
             <a:graphic>
               <a:graphicData uri="http://schemas.openxmlformats.org/drawingml/2006/picture">
                 <pic:pic>
                   <pic:nvPicPr>
-                    <pic:cNvPr descr="assets/img/特工/伏尔甘.png" id="34" name="Picture"/>
+                    <pic:cNvPr descr="assets/img/其它/红星.png" id="35" name="Picture"/>
+                    <pic:cNvPicPr>
+                      <a:picLocks noChangeArrowheads="1" noChangeAspect="1"/>
+                    </pic:cNvPicPr>
+                  </pic:nvPicPr>
+                  <pic:blipFill>
+                    <a:blip r:embed="rId33"/>
+                    <a:stretch>
+                      <a:fillRect/>
+                    </a:stretch>
+                  </pic:blipFill>
+                  <pic:spPr bwMode="auto">
+                    <a:xfrm>
+                      <a:off x="0" y="0"/>
+                      <a:ext cx="228600" cy="228600"/>
+                    </a:xfrm>
+                    <a:prstGeom prst="rect">
+                      <a:avLst/>
+                    </a:prstGeom>
+                    <a:noFill/>
+                    <a:ln w="9525">
+                      <a:noFill/>
+                      <a:headEnd/>
+                      <a:tailEnd/>
+                    </a:ln>
+                  </pic:spPr>
+                </pic:pic>
+              </a:graphicData>
+            </a:graphic>
+          </wp:inline>
+        </w:drawing>
+      </w:r>
+      <w:r>
+        <w:t xml:space="preserve">。虽然</w:t>
+      </w:r>
+      <w:r>
+        <w:drawing>
+          <wp:inline>
+            <wp:extent cx="228600" cy="228600"/>
+            <wp:effectExtent b="0" l="0" r="0" t="0"/>
+            <wp:docPr descr="伏尔甘" title="" id="36" name="Picture"/>
+            <a:graphic>
+              <a:graphicData uri="http://schemas.openxmlformats.org/drawingml/2006/picture">
+                <pic:pic>
+                  <pic:nvPicPr>
+                    <pic:cNvPr descr="assets/img/特工/伏尔甘.png" id="37" name="Picture"/>
                     <pic:cNvPicPr>
                       <a:picLocks noChangeArrowheads="1" noChangeAspect="1"/>
                     </pic:cNvPicPr>
@@ -475,70 +520,12 @@
           <wp:inline>
             <wp:extent cx="228600" cy="228600"/>
             <wp:effectExtent b="0" l="0" r="0" t="0"/>
-            <wp:docPr descr="神火" title="" id="36" name="Picture"/>
+            <wp:docPr descr="神火" title="" id="39" name="Picture"/>
             <a:graphic>
               <a:graphicData uri="http://schemas.openxmlformats.org/drawingml/2006/picture">
                 <pic:pic>
                   <pic:nvPicPr>
-                    <pic:cNvPr descr="assets/img/技能图标/战斗中debuff/神火.png" id="37" name="Picture"/>
-                    <pic:cNvPicPr>
-                      <a:picLocks noChangeArrowheads="1" noChangeAspect="1"/>
-                    </pic:cNvPicPr>
-                  </pic:nvPicPr>
-                  <pic:blipFill>
-                    <a:blip r:embed="rId35"/>
-                    <a:stretch>
-                      <a:fillRect/>
-                    </a:stretch>
-                  </pic:blipFill>
-                  <pic:spPr bwMode="auto">
-                    <a:xfrm>
-                      <a:off x="0" y="0"/>
-                      <a:ext cx="228600" cy="228600"/>
-                    </a:xfrm>
-                    <a:prstGeom prst="rect">
-                      <a:avLst/>
-                    </a:prstGeom>
-                    <a:noFill/>
-                    <a:ln w="9525">
-                      <a:noFill/>
-                      <a:headEnd/>
-                      <a:tailEnd/>
-                    </a:ln>
-                  </pic:spPr>
-                </pic:pic>
-              </a:graphicData>
-            </a:graphic>
-          </wp:inline>
-        </w:drawing>
-      </w:r>
-      <w:r>
-        <w:t xml:space="preserve"> </w:t>
-      </w:r>
-      <w:r>
-        <w:t xml:space="preserve">与</w:t>
-      </w:r>
-      <w:r>
-        <w:t xml:space="preserve"> </w:t>
-      </w:r>
-      <w:r>
-        <w:rPr>
-          <w:bCs/>
-          <w:b/>
-        </w:rPr>
-        <w:t xml:space="preserve">裂伤</w:t>
-      </w:r>
-      <w:r>
-        <w:drawing>
-          <wp:inline>
-            <wp:extent cx="228600" cy="228600"/>
-            <wp:effectExtent b="0" l="0" r="0" t="0"/>
-            <wp:docPr descr="裂伤" title="" id="39" name="Picture"/>
-            <a:graphic>
-              <a:graphicData uri="http://schemas.openxmlformats.org/drawingml/2006/picture">
-                <pic:pic>
-                  <pic:nvPicPr>
-                    <pic:cNvPr descr="assets/img/技能图标/战斗中debuff/裂伤.png" id="40" name="Picture"/>
+                    <pic:cNvPr descr="assets/img/技能图标/战斗中debuff/神火.png" id="40" name="Picture"/>
                     <pic:cNvPicPr>
                       <a:picLocks noChangeArrowheads="1" noChangeAspect="1"/>
                     </pic:cNvPicPr>
@@ -574,19 +561,29 @@
         <w:t xml:space="preserve"> </w:t>
       </w:r>
       <w:r>
-        <w:t xml:space="preserve">处于同一伤害乘区，但其带来的武器技能初始学习等级+1（满级+2）用在ss武器上1</w:t>
+        <w:t xml:space="preserve">与</w:t>
+      </w:r>
+      <w:r>
+        <w:t xml:space="preserve"> </w:t>
+      </w:r>
+      <w:r>
+        <w:rPr>
+          <w:bCs/>
+          <w:b/>
+        </w:rPr>
+        <w:t xml:space="preserve">裂伤</w:t>
       </w:r>
       <w:r>
         <w:drawing>
           <wp:inline>
             <wp:extent cx="228600" cy="228600"/>
             <wp:effectExtent b="0" l="0" r="0" t="0"/>
-            <wp:docPr descr="红星" title="" id="42" name="Picture"/>
+            <wp:docPr descr="裂伤" title="" id="42" name="Picture"/>
             <a:graphic>
               <a:graphicData uri="http://schemas.openxmlformats.org/drawingml/2006/picture">
                 <pic:pic>
                   <pic:nvPicPr>
-                    <pic:cNvPr descr="assets/img/其它/红星.png" id="43" name="Picture"/>
+                    <pic:cNvPr descr="assets/img/技能图标/战斗中debuff/裂伤.png" id="43" name="Picture"/>
                     <pic:cNvPicPr>
                       <a:picLocks noChangeArrowheads="1" noChangeAspect="1"/>
                     </pic:cNvPicPr>
@@ -619,7 +616,10 @@
         </w:drawing>
       </w:r>
       <w:r>
-        <w:t xml:space="preserve">开局4级，4</w:t>
+        <w:t xml:space="preserve"> </w:t>
+      </w:r>
+      <w:r>
+        <w:t xml:space="preserve">处于同一伤害乘区，但其带来的武器技能初始学习等级+1（满级+2）用在ss武器上1</w:t>
       </w:r>
       <w:r>
         <w:drawing>
@@ -637,7 +637,7 @@
                     </pic:cNvPicPr>
                   </pic:nvPicPr>
                   <pic:blipFill>
-                    <a:blip r:embed="rId41"/>
+                    <a:blip r:embed="rId33"/>
                     <a:stretch>
                       <a:fillRect/>
                     </a:stretch>
@@ -664,7 +664,7 @@
         </w:drawing>
       </w:r>
       <w:r>
-        <w:t xml:space="preserve">开局5级的收益非常可观，足以改变回响之战的体验，微氪玩家平民玩家慢慢从开通-&gt;1</w:t>
+        <w:t xml:space="preserve">开局4级，4</w:t>
       </w:r>
       <w:r>
         <w:drawing>
@@ -682,7 +682,7 @@
                     </pic:cNvPicPr>
                   </pic:nvPicPr>
                   <pic:blipFill>
-                    <a:blip r:embed="rId41"/>
+                    <a:blip r:embed="rId33"/>
                     <a:stretch>
                       <a:fillRect/>
                     </a:stretch>
@@ -709,7 +709,7 @@
         </w:drawing>
       </w:r>
       <w:r>
-        <w:t xml:space="preserve">-&gt;2</w:t>
+        <w:t xml:space="preserve">开局5级的收益非常可观，足以改变回响之战的体验，微氪玩家平民玩家慢慢从开通-&gt;1</w:t>
       </w:r>
       <w:r>
         <w:drawing>
@@ -727,7 +727,7 @@
                     </pic:cNvPicPr>
                   </pic:nvPicPr>
                   <pic:blipFill>
-                    <a:blip r:embed="rId41"/>
+                    <a:blip r:embed="rId33"/>
                     <a:stretch>
                       <a:fillRect/>
                     </a:stretch>
@@ -754,7 +754,7 @@
         </w:drawing>
       </w:r>
       <w:r>
-        <w:t xml:space="preserve">-&gt;4</w:t>
+        <w:t xml:space="preserve">-&gt;2</w:t>
       </w:r>
       <w:r>
         <w:drawing>
@@ -772,7 +772,7 @@
                     </pic:cNvPicPr>
                   </pic:nvPicPr>
                   <pic:blipFill>
-                    <a:blip r:embed="rId41"/>
+                    <a:blip r:embed="rId33"/>
                     <a:stretch>
                       <a:fillRect/>
                     </a:stretch>
@@ -799,7 +799,7 @@
         </w:drawing>
       </w:r>
       <w:r>
-        <w:t xml:space="preserve">，重氪玩家可选择直接到4</w:t>
+        <w:t xml:space="preserve">-&gt;4</w:t>
       </w:r>
       <w:r>
         <w:drawing>
@@ -817,7 +817,7 @@
                     </pic:cNvPicPr>
                   </pic:nvPicPr>
                   <pic:blipFill>
-                    <a:blip r:embed="rId41"/>
+                    <a:blip r:embed="rId33"/>
                     <a:stretch>
                       <a:fillRect/>
                     </a:stretch>
@@ -844,7 +844,7 @@
         </w:drawing>
       </w:r>
       <w:r>
-        <w:t xml:space="preserve">或者6</w:t>
+        <w:t xml:space="preserve">，重氪玩家可选择直接到4</w:t>
       </w:r>
       <w:r>
         <w:drawing>
@@ -862,7 +862,7 @@
                     </pic:cNvPicPr>
                   </pic:nvPicPr>
                   <pic:blipFill>
-                    <a:blip r:embed="rId41"/>
+                    <a:blip r:embed="rId33"/>
                     <a:stretch>
                       <a:fillRect/>
                     </a:stretch>
@@ -889,6 +889,51 @@
         </w:drawing>
       </w:r>
       <w:r>
+        <w:t xml:space="preserve">或者6</w:t>
+      </w:r>
+      <w:r>
+        <w:drawing>
+          <wp:inline>
+            <wp:extent cx="228600" cy="228600"/>
+            <wp:effectExtent b="0" l="0" r="0" t="0"/>
+            <wp:docPr descr="红星" title="" id="56" name="Picture"/>
+            <a:graphic>
+              <a:graphicData uri="http://schemas.openxmlformats.org/drawingml/2006/picture">
+                <pic:pic>
+                  <pic:nvPicPr>
+                    <pic:cNvPr descr="assets/img/其它/红星.png" id="57" name="Picture"/>
+                    <pic:cNvPicPr>
+                      <a:picLocks noChangeArrowheads="1" noChangeAspect="1"/>
+                    </pic:cNvPicPr>
+                  </pic:nvPicPr>
+                  <pic:blipFill>
+                    <a:blip r:embed="rId33"/>
+                    <a:stretch>
+                      <a:fillRect/>
+                    </a:stretch>
+                  </pic:blipFill>
+                  <pic:spPr bwMode="auto">
+                    <a:xfrm>
+                      <a:off x="0" y="0"/>
+                      <a:ext cx="228600" cy="228600"/>
+                    </a:xfrm>
+                    <a:prstGeom prst="rect">
+                      <a:avLst/>
+                    </a:prstGeom>
+                    <a:noFill/>
+                    <a:ln w="9525">
+                      <a:noFill/>
+                      <a:headEnd/>
+                      <a:tailEnd/>
+                    </a:ln>
+                  </pic:spPr>
+                </pic:pic>
+              </a:graphicData>
+            </a:graphic>
+          </wp:inline>
+        </w:drawing>
+      </w:r>
+      <w:r>
         <w:t xml:space="preserve">。</w:t>
       </w:r>
     </w:p>
@@ -900,7 +945,7 @@
         </w:numPr>
         <w:pStyle w:val="Heading2"/>
       </w:pPr>
-      <w:bookmarkStart w:id="56" w:name="解锁需要票数转盘解锁共需-300-票"/>
+      <w:bookmarkStart w:id="58" w:name="解锁需要票数转盘解锁共需-300-票"/>
       <w:r>
         <w:rPr>
           <w:bCs/>
@@ -927,10 +972,10 @@
       <w:r>
         <w:t xml:space="preserve">票。</w:t>
       </w:r>
-      <w:bookmarkEnd w:id="56"/>
+      <w:bookmarkEnd w:id="58"/>
     </w:p>
-    <w:bookmarkEnd w:id="57"/>
-    <w:bookmarkStart w:id="62" w:name="三火神锤抽奖券任务产出统计"/>
+    <w:bookmarkEnd w:id="59"/>
+    <w:bookmarkStart w:id="64" w:name="三火神锤抽奖券任务产出统计"/>
     <w:p>
       <w:pPr>
         <w:pStyle w:val="Heading2"/>
@@ -1175,80 +1220,6 @@
           <wp:inline>
             <wp:extent cx="228600" cy="228600"/>
             <wp:effectExtent b="0" l="0" r="0" t="0"/>
-            <wp:docPr descr="钻石" title="" id="58" name="Picture"/>
-            <a:graphic>
-              <a:graphicData uri="http://schemas.openxmlformats.org/drawingml/2006/picture">
-                <pic:pic>
-                  <pic:nvPicPr>
-                    <pic:cNvPr descr="assets/img/道具/钻石.png" id="59" name="Picture"/>
-                    <pic:cNvPicPr>
-                      <a:picLocks noChangeArrowheads="1" noChangeAspect="1"/>
-                    </pic:cNvPicPr>
-                  </pic:nvPicPr>
-                  <pic:blipFill>
-                    <a:blip r:embed="rId30"/>
-                    <a:stretch>
-                      <a:fillRect/>
-                    </a:stretch>
-                  </pic:blipFill>
-                  <pic:spPr bwMode="auto">
-                    <a:xfrm>
-                      <a:off x="0" y="0"/>
-                      <a:ext cx="228600" cy="228600"/>
-                    </a:xfrm>
-                    <a:prstGeom prst="rect">
-                      <a:avLst/>
-                    </a:prstGeom>
-                    <a:noFill/>
-                    <a:ln w="9525">
-                      <a:noFill/>
-                      <a:headEnd/>
-                      <a:tailEnd/>
-                    </a:ln>
-                  </pic:spPr>
-                </pic:pic>
-              </a:graphicData>
-            </a:graphic>
-          </wp:inline>
-        </w:drawing>
-      </w:r>
-      <w:r>
-        <w:t xml:space="preserve"> </w:t>
-      </w:r>
-      <w:r>
-        <w:t xml:space="preserve">- 补齐</w:t>
-      </w:r>
-      <w:r>
-        <w:t xml:space="preserve"> </w:t>
-      </w:r>
-      <w:r>
-        <w:rPr>
-          <w:bCs/>
-          <w:b/>
-        </w:rPr>
-        <w:t xml:space="preserve">195</w:t>
-      </w:r>
-      <w:r>
-        <w:t xml:space="preserve"> </w:t>
-      </w:r>
-      <w:r>
-        <w:t xml:space="preserve">张票需要消耗：</w:t>
-      </w:r>
-      <w:r>
-        <w:rPr>
-          <w:bCs/>
-          <w:b/>
-        </w:rPr>
-        <w:t xml:space="preserve">58500</w:t>
-      </w:r>
-      <w:r>
-        <w:t xml:space="preserve"> </w:t>
-      </w:r>
-      <w:r>
-        <w:drawing>
-          <wp:inline>
-            <wp:extent cx="228600" cy="228600"/>
-            <wp:effectExtent b="0" l="0" r="0" t="0"/>
             <wp:docPr descr="钻石" title="" id="60" name="Picture"/>
             <a:graphic>
               <a:graphicData uri="http://schemas.openxmlformats.org/drawingml/2006/picture">
@@ -1287,96 +1258,48 @@
         </w:drawing>
       </w:r>
       <w:r>
-        <w:t xml:space="preserve">。</w:t>
-      </w:r>
-    </w:p>
-    <w:p>
-      <w:r>
-        <w:pict>
-          <v:rect style="width:0;height:1.5pt" o:hralign="center" o:hrstd="t" o:hr="t"/>
-        </w:pict>
-      </w:r>
-    </w:p>
-    <w:bookmarkEnd w:id="62"/>
-    <w:bookmarkStart w:id="100" w:name="四不同预算段获取方案推荐"/>
-    <w:p>
-      <w:pPr>
-        <w:pStyle w:val="Heading2"/>
-      </w:pPr>
-      <w:r>
-        <w:t xml:space="preserve">四、不同预算段获取方案推荐</w:t>
-      </w:r>
-    </w:p>
-    <w:bookmarkStart w:id="65" w:name="方案一适度氪金方案"/>
-    <w:p>
-      <w:pPr>
-        <w:pStyle w:val="Heading3"/>
-      </w:pPr>
-      <w:r>
-        <w:t xml:space="preserve">方案一：适度氪金方案</w:t>
-      </w:r>
-    </w:p>
-    <w:p>
-      <w:pPr>
-        <w:numPr>
-          <w:ilvl w:val="0"/>
-          <w:numId w:val="1003"/>
-        </w:numPr>
-        <w:pStyle w:val="Compact"/>
-      </w:pPr>
+        <w:t xml:space="preserve"> </w:t>
+      </w:r>
+      <w:r>
+        <w:t xml:space="preserve">- 补齐</w:t>
+      </w:r>
+      <w:r>
+        <w:t xml:space="preserve"> </w:t>
+      </w:r>
       <w:r>
         <w:rPr>
           <w:bCs/>
           <w:b/>
         </w:rPr>
-        <w:t xml:space="preserve">适用人群</w:t>
-      </w:r>
-      <w:r>
-        <w:t xml:space="preserve">：预算充足、追求性价比的氪金玩家。</w:t>
-      </w:r>
-    </w:p>
-    <w:p>
-      <w:pPr>
-        <w:numPr>
-          <w:ilvl w:val="0"/>
-          <w:numId w:val="1003"/>
-        </w:numPr>
-        <w:pStyle w:val="Compact"/>
-      </w:pPr>
+        <w:t xml:space="preserve">195</w:t>
+      </w:r>
+      <w:r>
+        <w:t xml:space="preserve"> </w:t>
+      </w:r>
+      <w:r>
+        <w:t xml:space="preserve">张票需要消耗：</w:t>
+      </w:r>
       <w:r>
         <w:rPr>
           <w:bCs/>
           <w:b/>
         </w:rPr>
-        <w:t xml:space="preserve">具体策略</w:t>
-      </w:r>
-      <w:r>
-        <w:t xml:space="preserve">：直接购买</w:t>
-      </w:r>
-      <w:r>
-        <w:t xml:space="preserve"> </w:t>
-      </w:r>
-      <w:r>
-        <w:rPr>
-          <w:bCs/>
-          <w:b/>
-        </w:rPr>
-        <w:t xml:space="preserve">128元礼包</w:t>
-      </w:r>
-      <w:r>
-        <w:t xml:space="preserve">。对比直接买45,000</w:t>
+        <w:t xml:space="preserve">58500</w:t>
+      </w:r>
+      <w:r>
+        <w:t xml:space="preserve"> </w:t>
       </w:r>
       <w:r>
         <w:drawing>
           <wp:inline>
             <wp:extent cx="228600" cy="228600"/>
             <wp:effectExtent b="0" l="0" r="0" t="0"/>
-            <wp:docPr descr="钻石" title="" id="63" name="Picture"/>
+            <wp:docPr descr="钻石" title="" id="62" name="Picture"/>
             <a:graphic>
               <a:graphicData uri="http://schemas.openxmlformats.org/drawingml/2006/picture">
                 <pic:pic>
                   <pic:nvPicPr>
-                    <pic:cNvPr descr="assets/img/道具/钻石.png" id="64" name="Picture"/>
+                    <pic:cNvPr descr="assets/img/道具/钻石.png" id="63" name="Picture"/>
                     <pic:cNvPicPr>
                       <a:picLocks noChangeArrowheads="1" noChangeAspect="1"/>
                     </pic:cNvPicPr>
@@ -1409,24 +1332,40 @@
         </w:drawing>
       </w:r>
       <w:r>
-        <w:t xml:space="preserve">，该礼包性价比极高。买完后多余的转盘票数可用于获取星级道具和其他稀有奖励。</w:t>
-      </w:r>
-    </w:p>
-    <w:bookmarkEnd w:id="65"/>
-    <w:bookmarkStart w:id="70" w:name="方案二完全白嫖钻石直购方案"/>
-    <w:p>
-      <w:pPr>
-        <w:pStyle w:val="Heading3"/>
-      </w:pPr>
-      <w:r>
-        <w:t xml:space="preserve">方案二：完全白嫖/钻石直购方案</w:t>
+        <w:t xml:space="preserve">。</w:t>
       </w:r>
     </w:p>
     <w:p>
+      <w:r>
+        <w:pict>
+          <v:rect style="width:0;height:1.5pt" o:hralign="center" o:hrstd="t" o:hr="t"/>
+        </w:pict>
+      </w:r>
+    </w:p>
+    <w:bookmarkEnd w:id="64"/>
+    <w:bookmarkStart w:id="115" w:name="四不同预算段获取方案推荐"/>
+    <w:p>
+      <w:pPr>
+        <w:pStyle w:val="Heading2"/>
+      </w:pPr>
+      <w:r>
+        <w:t xml:space="preserve">四、不同预算段获取方案推荐</w:t>
+      </w:r>
+    </w:p>
+    <w:bookmarkStart w:id="73" w:name="方案一适度氪金方案"/>
+    <w:p>
+      <w:pPr>
+        <w:pStyle w:val="Heading3"/>
+      </w:pPr>
+      <w:r>
+        <w:t xml:space="preserve">方案一：适度氪金方案</w:t>
+      </w:r>
+    </w:p>
+    <w:p>
       <w:pPr>
         <w:numPr>
           <w:ilvl w:val="0"/>
-          <w:numId w:val="1004"/>
+          <w:numId w:val="1003"/>
         </w:numPr>
         <w:pStyle w:val="Compact"/>
       </w:pPr>
@@ -1438,19 +1377,51 @@
         <w:t xml:space="preserve">适用人群</w:t>
       </w:r>
       <w:r>
-        <w:t xml:space="preserve">：无氪、拥有充足</w:t>
+        <w:t xml:space="preserve">：预算充足、追求性价比的氪金玩家。</w:t>
+      </w:r>
+    </w:p>
+    <w:p>
+      <w:pPr>
+        <w:numPr>
+          <w:ilvl w:val="0"/>
+          <w:numId w:val="1003"/>
+        </w:numPr>
+        <w:pStyle w:val="Compact"/>
+      </w:pPr>
+      <w:r>
+        <w:rPr>
+          <w:bCs/>
+          <w:b/>
+        </w:rPr>
+        <w:t xml:space="preserve">具体策略</w:t>
+      </w:r>
+      <w:r>
+        <w:t xml:space="preserve">：直接购买</w:t>
+      </w:r>
+      <w:r>
+        <w:t xml:space="preserve"> </w:t>
+      </w:r>
+      <w:r>
+        <w:rPr>
+          <w:bCs/>
+          <w:b/>
+        </w:rPr>
+        <w:t xml:space="preserve">128元礼包</w:t>
+      </w:r>
+      <w:r>
+        <w:t xml:space="preserve">。对比直接买45,000</w:t>
       </w:r>
       <w:r>
         <w:drawing>
           <wp:inline>
             <wp:extent cx="228600" cy="228600"/>
             <wp:effectExtent b="0" l="0" r="0" t="0"/>
-            <wp:docPr descr="钻石" title="" id="66" name="Picture"/>
+            <wp:docPr descr="钻石" title="" id="65" name="Picture"/>
             <a:graphic>
               <a:graphicData uri="http://schemas.openxmlformats.org/drawingml/2006/picture">
                 <pic:pic>
                   <pic:nvPicPr>
-                    <pic:cNvPr descr="assets/img/道具/钻石.png" id="67" name="Picture"/>
+                    <pic:cNvPr descr="assets/img/道具/钻石.png" id="66" name="Picture"/>
                     <pic:cNvPicPr>
                       <a:picLocks noChangeArrowheads="1" noChangeAspect="1"/>
                     </pic:cNvPicPr>
@@ -1483,7 +1454,104 @@
         </w:drawing>
       </w:r>
       <w:r>
-        <w:t xml:space="preserve">储备的玩家。</w:t>
+        <w:t xml:space="preserve">，该礼包性价比高。买完后多余的转盘票数可用于获取星级道具和其他稀有奖励</w:t>
+      </w:r>
+      <w:r>
+        <w:drawing>
+          <wp:inline>
+            <wp:extent cx="228600" cy="228600"/>
+            <wp:effectExtent b="0" l="0" r="0" t="0"/>
+            <wp:docPr descr="末世战马" title="" id="68" name="Picture"/>
+            <a:graphic>
+              <a:graphicData uri="http://schemas.openxmlformats.org/drawingml/2006/picture">
+                <pic:pic>
+                  <pic:nvPicPr>
+                    <pic:cNvPr descr="assets/img/碎片/末世战马碎片.png" id="69" name="Picture"/>
+                    <pic:cNvPicPr>
+                      <a:picLocks noChangeArrowheads="1" noChangeAspect="1"/>
+                    </pic:cNvPicPr>
+                  </pic:nvPicPr>
+                  <pic:blipFill>
+                    <a:blip r:embed="rId67"/>
+                    <a:stretch>
+                      <a:fillRect/>
+                    </a:stretch>
+                  </pic:blipFill>
+                  <pic:spPr bwMode="auto">
+                    <a:xfrm>
+                      <a:off x="0" y="0"/>
+                      <a:ext cx="228600" cy="228600"/>
+                    </a:xfrm>
+                    <a:prstGeom prst="rect">
+                      <a:avLst/>
+                    </a:prstGeom>
+                    <a:noFill/>
+                    <a:ln w="9525">
+                      <a:noFill/>
+                      <a:headEnd/>
+                      <a:tailEnd/>
+                    </a:ln>
+                  </pic:spPr>
+                </pic:pic>
+              </a:graphicData>
+            </a:graphic>
+          </wp:inline>
+        </w:drawing>
+      </w:r>
+      <w:r>
+        <w:drawing>
+          <wp:inline>
+            <wp:extent cx="228600" cy="228600"/>
+            <wp:effectExtent b="0" l="0" r="0" t="0"/>
+            <wp:docPr descr="核心自选宝箱精华" title="" id="71" name="Picture"/>
+            <a:graphic>
+              <a:graphicData uri="http://schemas.openxmlformats.org/drawingml/2006/picture">
+                <pic:pic>
+                  <pic:nvPicPr>
+                    <pic:cNvPr descr="assets/img/道具/核心自选宝箱精华.png" id="72" name="Picture"/>
+                    <pic:cNvPicPr>
+                      <a:picLocks noChangeArrowheads="1" noChangeAspect="1"/>
+                    </pic:cNvPicPr>
+                  </pic:nvPicPr>
+                  <pic:blipFill>
+                    <a:blip r:embed="rId70"/>
+                    <a:stretch>
+                      <a:fillRect/>
+                    </a:stretch>
+                  </pic:blipFill>
+                  <pic:spPr bwMode="auto">
+                    <a:xfrm>
+                      <a:off x="0" y="0"/>
+                      <a:ext cx="228600" cy="228600"/>
+                    </a:xfrm>
+                    <a:prstGeom prst="rect">
+                      <a:avLst/>
+                    </a:prstGeom>
+                    <a:noFill/>
+                    <a:ln w="9525">
+                      <a:noFill/>
+                      <a:headEnd/>
+                      <a:tailEnd/>
+                    </a:ln>
+                  </pic:spPr>
+                </pic:pic>
+              </a:graphicData>
+            </a:graphic>
+          </wp:inline>
+        </w:drawing>
+      </w:r>
+      <w:r>
+        <w:t xml:space="preserve">等。</w:t>
+      </w:r>
+    </w:p>
+    <w:bookmarkEnd w:id="73"/>
+    <w:bookmarkStart w:id="78" w:name="方案二完全白嫖钻石直购方案"/>
+    <w:p>
+      <w:pPr>
+        <w:pStyle w:val="Heading3"/>
+      </w:pPr>
+      <w:r>
+        <w:t xml:space="preserve">方案二：完全白嫖/钻石直购方案</w:t>
       </w:r>
     </w:p>
     <w:p>
@@ -1499,35 +1567,22 @@
           <w:bCs/>
           <w:b/>
         </w:rPr>
-        <w:t xml:space="preserve">具体策略</w:t>
-      </w:r>
-      <w:r>
-        <w:t xml:space="preserve">：拉满所有活动任务（白嫖 105 张券），最后一天定好闹钟（以免活动期间官方送券而浪费钻石），使用</w:t>
-      </w:r>
-      <w:r>
-        <w:t xml:space="preserve"> </w:t>
-      </w:r>
-      <w:r>
-        <w:rPr>
-          <w:bCs/>
-          <w:b/>
-        </w:rPr>
-        <w:t xml:space="preserve">58500</w:t>
-      </w:r>
-      <w:r>
-        <w:t xml:space="preserve"> </w:t>
+        <w:t xml:space="preserve">适用人群</w:t>
+      </w:r>
+      <w:r>
+        <w:t xml:space="preserve">：无氪、拥有充足</w:t>
       </w:r>
       <w:r>
         <w:drawing>
           <wp:inline>
             <wp:extent cx="228600" cy="228600"/>
             <wp:effectExtent b="0" l="0" r="0" t="0"/>
-            <wp:docPr descr="钻石" title="" id="68" name="Picture"/>
+            <wp:docPr descr="钻石" title="" id="74" name="Picture"/>
             <a:graphic>
               <a:graphicData uri="http://schemas.openxmlformats.org/drawingml/2006/picture">
                 <pic:pic>
                   <pic:nvPicPr>
-                    <pic:cNvPr descr="assets/img/道具/钻石.png" id="69" name="Picture"/>
+                    <pic:cNvPr descr="assets/img/道具/钻石.png" id="75" name="Picture"/>
                     <pic:cNvPicPr>
                       <a:picLocks noChangeArrowheads="1" noChangeAspect="1"/>
                     </pic:cNvPicPr>
@@ -1560,62 +1615,14 @@
         </w:drawing>
       </w:r>
       <w:r>
-        <w:t xml:space="preserve"> </w:t>
-      </w:r>
-      <w:r>
-        <w:t xml:space="preserve">补齐剩余的</w:t>
-      </w:r>
-      <w:r>
-        <w:t xml:space="preserve"> </w:t>
-      </w:r>
-      <w:r>
-        <w:rPr>
-          <w:bCs/>
-          <w:b/>
-        </w:rPr>
-        <w:t xml:space="preserve">195</w:t>
-      </w:r>
-      <w:r>
-        <w:t xml:space="preserve"> </w:t>
-      </w:r>
-      <w:r>
-        <w:t xml:space="preserve">张券，即可成功解锁。</w:t>
-      </w:r>
-    </w:p>
-    <w:bookmarkEnd w:id="70"/>
-    <w:bookmarkStart w:id="84" w:name="方案三任务-钻石自选礼包方案"/>
-    <w:p>
-      <w:pPr>
-        <w:pStyle w:val="Heading3"/>
-      </w:pPr>
-      <w:r>
-        <w:t xml:space="preserve">方案三：任务 + 钻石自选礼包方案</w:t>
+        <w:t xml:space="preserve">储备的玩家。</w:t>
       </w:r>
     </w:p>
     <w:p>
       <w:pPr>
         <w:numPr>
           <w:ilvl w:val="0"/>
-          <w:numId w:val="1005"/>
-        </w:numPr>
-        <w:pStyle w:val="Compact"/>
-      </w:pPr>
-      <w:r>
-        <w:rPr>
-          <w:bCs/>
-          <w:b/>
-        </w:rPr>
-        <w:t xml:space="preserve">适用人群</w:t>
-      </w:r>
-      <w:r>
-        <w:t xml:space="preserve">：钻石充足、希望同时补齐其他核心养成资源的玩家。</w:t>
-      </w:r>
-    </w:p>
-    <w:p>
-      <w:pPr>
-        <w:numPr>
-          <w:ilvl w:val="0"/>
-          <w:numId w:val="1005"/>
+          <w:numId w:val="1004"/>
         </w:numPr>
         <w:pStyle w:val="Compact"/>
       </w:pPr>
@@ -1627,7 +1634,17 @@
         <w:t xml:space="preserve">具体策略</w:t>
       </w:r>
       <w:r>
-        <w:t xml:space="preserve">：拉满任务（105张券），购买包含</w:t>
+        <w:t xml:space="preserve">：拉满所有活动任务（白嫖 105 张券），最后一天定好闹钟（以免活动期间官方送券而浪费钻石），使用</w:t>
+      </w:r>
+      <w:r>
+        <w:t xml:space="preserve"> </w:t>
+      </w:r>
+      <w:r>
+        <w:rPr>
+          <w:bCs/>
+          <w:b/>
+        </w:rPr>
+        <w:t xml:space="preserve">58500</w:t>
       </w:r>
       <w:r>
         <w:t xml:space="preserve"> </w:t>
@@ -1637,162 +1654,12 @@
           <wp:inline>
             <wp:extent cx="228600" cy="228600"/>
             <wp:effectExtent b="0" l="0" r="0" t="0"/>
-            <wp:docPr descr="异宠核心自选" title="" id="72" name="Picture"/>
+            <wp:docPr descr="钻石" title="" id="76" name="Picture"/>
             <a:graphic>
               <a:graphicData uri="http://schemas.openxmlformats.org/drawingml/2006/picture">
                 <pic:pic>
                   <pic:nvPicPr>
-                    <pic:cNvPr descr="assets/img/宝箱/异宠核心自选宝箱.png" id="73" name="Picture"/>
-                    <pic:cNvPicPr>
-                      <a:picLocks noChangeArrowheads="1" noChangeAspect="1"/>
-                    </pic:cNvPicPr>
-                  </pic:nvPicPr>
-                  <pic:blipFill>
-                    <a:blip r:embed="rId71"/>
-                    <a:stretch>
-                      <a:fillRect/>
-                    </a:stretch>
-                  </pic:blipFill>
-                  <pic:spPr bwMode="auto">
-                    <a:xfrm>
-                      <a:off x="0" y="0"/>
-                      <a:ext cx="228600" cy="228600"/>
-                    </a:xfrm>
-                    <a:prstGeom prst="rect">
-                      <a:avLst/>
-                    </a:prstGeom>
-                    <a:noFill/>
-                    <a:ln w="9525">
-                      <a:noFill/>
-                      <a:headEnd/>
-                      <a:tailEnd/>
-                    </a:ln>
-                  </pic:spPr>
-                </pic:pic>
-              </a:graphicData>
-            </a:graphic>
-          </wp:inline>
-        </w:drawing>
-      </w:r>
-      <w:r>
-        <w:t xml:space="preserve"> </w:t>
-      </w:r>
-      <w:r>
-        <w:t xml:space="preserve">和</w:t>
-      </w:r>
-      <w:r>
-        <w:t xml:space="preserve"> </w:t>
-      </w:r>
-      <w:r>
-        <w:drawing>
-          <wp:inline>
-            <wp:extent cx="228600" cy="228600"/>
-            <wp:effectExtent b="0" l="0" r="0" t="0"/>
-            <wp:docPr descr="谐振芯片自选" title="" id="75" name="Picture"/>
-            <a:graphic>
-              <a:graphicData uri="http://schemas.openxmlformats.org/drawingml/2006/picture">
-                <pic:pic>
-                  <pic:nvPicPr>
-                    <pic:cNvPr descr="assets/img/宝箱/谐振芯片自选宝箱.png" id="76" name="Picture"/>
-                    <pic:cNvPicPr>
-                      <a:picLocks noChangeArrowheads="1" noChangeAspect="1"/>
-                    </pic:cNvPicPr>
-                  </pic:nvPicPr>
-                  <pic:blipFill>
-                    <a:blip r:embed="rId74"/>
-                    <a:stretch>
-                      <a:fillRect/>
-                    </a:stretch>
-                  </pic:blipFill>
-                  <pic:spPr bwMode="auto">
-                    <a:xfrm>
-                      <a:off x="0" y="0"/>
-                      <a:ext cx="228600" cy="228600"/>
-                    </a:xfrm>
-                    <a:prstGeom prst="rect">
-                      <a:avLst/>
-                    </a:prstGeom>
-                    <a:noFill/>
-                    <a:ln w="9525">
-                      <a:noFill/>
-                      <a:headEnd/>
-                      <a:tailEnd/>
-                    </a:ln>
-                  </pic:spPr>
-                </pic:pic>
-              </a:graphicData>
-            </a:graphic>
-          </wp:inline>
-        </w:drawing>
-      </w:r>
-      <w:r>
-        <w:t xml:space="preserve"> </w:t>
-      </w:r>
-      <w:r>
-        <w:t xml:space="preserve">的特惠自选箱礼包（不推荐包含</w:t>
-      </w:r>
-      <w:r>
-        <w:t xml:space="preserve"> </w:t>
-      </w:r>
-      <w:r>
-        <w:drawing>
-          <wp:inline>
-            <wp:extent cx="228600" cy="228600"/>
-            <wp:effectExtent b="0" l="0" r="0" t="0"/>
-            <wp:docPr descr="神器核心自选" title="" id="78" name="Picture"/>
-            <a:graphic>
-              <a:graphicData uri="http://schemas.openxmlformats.org/drawingml/2006/picture">
-                <pic:pic>
-                  <pic:nvPicPr>
-                    <pic:cNvPr descr="assets/img/宝箱/神器核心自选宝箱png.png" id="79" name="Picture"/>
-                    <pic:cNvPicPr>
-                      <a:picLocks noChangeArrowheads="1" noChangeAspect="1"/>
-                    </pic:cNvPicPr>
-                  </pic:nvPicPr>
-                  <pic:blipFill>
-                    <a:blip r:embed="rId77"/>
-                    <a:stretch>
-                      <a:fillRect/>
-                    </a:stretch>
-                  </pic:blipFill>
-                  <pic:spPr bwMode="auto">
-                    <a:xfrm>
-                      <a:off x="0" y="0"/>
-                      <a:ext cx="228600" cy="228600"/>
-                    </a:xfrm>
-                    <a:prstGeom prst="rect">
-                      <a:avLst/>
-                    </a:prstGeom>
-                    <a:noFill/>
-                    <a:ln w="9525">
-                      <a:noFill/>
-                      <a:headEnd/>
-                      <a:tailEnd/>
-                    </a:ln>
-                  </pic:spPr>
-                </pic:pic>
-              </a:graphicData>
-            </a:graphic>
-          </wp:inline>
-        </w:drawing>
-      </w:r>
-      <w:r>
-        <w:t xml:space="preserve"> </w:t>
-      </w:r>
-      <w:r>
-        <w:t xml:space="preserve">的礼包）。购买完礼包后，再使用</w:t>
-      </w:r>
-      <w:r>
-        <w:drawing>
-          <wp:inline>
-            <wp:extent cx="228600" cy="228600"/>
-            <wp:effectExtent b="0" l="0" r="0" t="0"/>
-            <wp:docPr descr="钻石" title="" id="80" name="Picture"/>
-            <a:graphic>
-              <a:graphicData uri="http://schemas.openxmlformats.org/drawingml/2006/picture">
-                <pic:pic>
-                  <pic:nvPicPr>
-                    <pic:cNvPr descr="assets/img/道具/钻石.png" id="81" name="Picture"/>
+                    <pic:cNvPr descr="assets/img/道具/钻石.png" id="77" name="Picture"/>
                     <pic:cNvPicPr>
                       <a:picLocks noChangeArrowheads="1" noChangeAspect="1"/>
                     </pic:cNvPicPr>
@@ -1825,7 +1692,10 @@
         </w:drawing>
       </w:r>
       <w:r>
-        <w:t xml:space="preserve">补齐</w:t>
+        <w:t xml:space="preserve"> </w:t>
+      </w:r>
+      <w:r>
+        <w:t xml:space="preserve">补齐剩余的</w:t>
       </w:r>
       <w:r>
         <w:t xml:space="preserve"> </w:t>
@@ -1835,23 +1705,61 @@
           <w:bCs/>
           <w:b/>
         </w:rPr>
-        <w:t xml:space="preserve">130</w:t>
-      </w:r>
-      <w:r>
-        <w:t xml:space="preserve"> </w:t>
-      </w:r>
-      <w:r>
-        <w:t xml:space="preserve">张券（相当于</w:t>
-      </w:r>
-      <w:r>
-        <w:t xml:space="preserve"> </w:t>
-      </w:r>
+        <w:t xml:space="preserve">195</w:t>
+      </w:r>
+      <w:r>
+        <w:t xml:space="preserve"> </w:t>
+      </w:r>
+      <w:r>
+        <w:t xml:space="preserve">张券，即可成功解锁。</w:t>
+      </w:r>
+    </w:p>
+    <w:bookmarkEnd w:id="78"/>
+    <w:bookmarkStart w:id="92" w:name="方案三任务-钻石自选礼包方案"/>
+    <w:p>
+      <w:pPr>
+        <w:pStyle w:val="Heading3"/>
+      </w:pPr>
+      <w:r>
+        <w:t xml:space="preserve">方案三：任务 + 钻石自选礼包方案</w:t>
+      </w:r>
+    </w:p>
+    <w:p>
+      <w:pPr>
+        <w:numPr>
+          <w:ilvl w:val="0"/>
+          <w:numId w:val="1005"/>
+        </w:numPr>
+        <w:pStyle w:val="Compact"/>
+      </w:pPr>
       <w:r>
         <w:rPr>
           <w:bCs/>
           <w:b/>
         </w:rPr>
-        <w:t xml:space="preserve">39,000</w:t>
+        <w:t xml:space="preserve">适用人群</w:t>
+      </w:r>
+      <w:r>
+        <w:t xml:space="preserve">：钻石充足、希望同时补齐其他核心养成资源的玩家。</w:t>
+      </w:r>
+    </w:p>
+    <w:p>
+      <w:pPr>
+        <w:numPr>
+          <w:ilvl w:val="0"/>
+          <w:numId w:val="1005"/>
+        </w:numPr>
+        <w:pStyle w:val="Compact"/>
+      </w:pPr>
+      <w:r>
+        <w:rPr>
+          <w:bCs/>
+          <w:b/>
+        </w:rPr>
+        <w:t xml:space="preserve">具体策略</w:t>
+      </w:r>
+      <w:r>
+        <w:t xml:space="preserve">：拉满任务（105张券），购买包含</w:t>
       </w:r>
       <w:r>
         <w:t xml:space="preserve"> </w:t>
@@ -1861,12 +1769,162 @@
           <wp:inline>
             <wp:extent cx="228600" cy="228600"/>
             <wp:effectExtent b="0" l="0" r="0" t="0"/>
-            <wp:docPr descr="钻石" title="" id="82" name="Picture"/>
+            <wp:docPr descr="异宠核心自选" title="" id="80" name="Picture"/>
             <a:graphic>
               <a:graphicData uri="http://schemas.openxmlformats.org/drawingml/2006/picture">
                 <pic:pic>
                   <pic:nvPicPr>
-                    <pic:cNvPr descr="assets/img/道具/钻石.png" id="83" name="Picture"/>
+                    <pic:cNvPr descr="assets/img/宝箱/异宠核心自选宝箱.png" id="81" name="Picture"/>
+                    <pic:cNvPicPr>
+                      <a:picLocks noChangeArrowheads="1" noChangeAspect="1"/>
+                    </pic:cNvPicPr>
+                  </pic:nvPicPr>
+                  <pic:blipFill>
+                    <a:blip r:embed="rId79"/>
+                    <a:stretch>
+                      <a:fillRect/>
+                    </a:stretch>
+                  </pic:blipFill>
+                  <pic:spPr bwMode="auto">
+                    <a:xfrm>
+                      <a:off x="0" y="0"/>
+                      <a:ext cx="228600" cy="228600"/>
+                    </a:xfrm>
+                    <a:prstGeom prst="rect">
+                      <a:avLst/>
+                    </a:prstGeom>
+                    <a:noFill/>
+                    <a:ln w="9525">
+                      <a:noFill/>
+                      <a:headEnd/>
+                      <a:tailEnd/>
+                    </a:ln>
+                  </pic:spPr>
+                </pic:pic>
+              </a:graphicData>
+            </a:graphic>
+          </wp:inline>
+        </w:drawing>
+      </w:r>
+      <w:r>
+        <w:t xml:space="preserve"> </w:t>
+      </w:r>
+      <w:r>
+        <w:t xml:space="preserve">和</w:t>
+      </w:r>
+      <w:r>
+        <w:t xml:space="preserve"> </w:t>
+      </w:r>
+      <w:r>
+        <w:drawing>
+          <wp:inline>
+            <wp:extent cx="228600" cy="228600"/>
+            <wp:effectExtent b="0" l="0" r="0" t="0"/>
+            <wp:docPr descr="谐振芯片与传奇收藏品自选宝箱" title="" id="83" name="Picture"/>
+            <a:graphic>
+              <a:graphicData uri="http://schemas.openxmlformats.org/drawingml/2006/picture">
+                <pic:pic>
+                  <pic:nvPicPr>
+                    <pic:cNvPr descr="assets/img/宝箱/传奇收藏品、谐振芯片高级自选宝箱.png" id="84" name="Picture"/>
+                    <pic:cNvPicPr>
+                      <a:picLocks noChangeArrowheads="1" noChangeAspect="1"/>
+                    </pic:cNvPicPr>
+                  </pic:nvPicPr>
+                  <pic:blipFill>
+                    <a:blip r:embed="rId82"/>
+                    <a:stretch>
+                      <a:fillRect/>
+                    </a:stretch>
+                  </pic:blipFill>
+                  <pic:spPr bwMode="auto">
+                    <a:xfrm>
+                      <a:off x="0" y="0"/>
+                      <a:ext cx="228600" cy="228600"/>
+                    </a:xfrm>
+                    <a:prstGeom prst="rect">
+                      <a:avLst/>
+                    </a:prstGeom>
+                    <a:noFill/>
+                    <a:ln w="9525">
+                      <a:noFill/>
+                      <a:headEnd/>
+                      <a:tailEnd/>
+                    </a:ln>
+                  </pic:spPr>
+                </pic:pic>
+              </a:graphicData>
+            </a:graphic>
+          </wp:inline>
+        </w:drawing>
+      </w:r>
+      <w:r>
+        <w:t xml:space="preserve"> </w:t>
+      </w:r>
+      <w:r>
+        <w:t xml:space="preserve">的礼包（</w:t>
+      </w:r>
+      <w:r>
+        <w:t xml:space="preserve"> </w:t>
+      </w:r>
+      <w:r>
+        <w:drawing>
+          <wp:inline>
+            <wp:extent cx="228600" cy="228600"/>
+            <wp:effectExtent b="0" l="0" r="0" t="0"/>
+            <wp:docPr descr="神器核心自选" title="" id="86" name="Picture"/>
+            <a:graphic>
+              <a:graphicData uri="http://schemas.openxmlformats.org/drawingml/2006/picture">
+                <pic:pic>
+                  <pic:nvPicPr>
+                    <pic:cNvPr descr="assets/img/宝箱/神器核心自选宝箱png.png" id="87" name="Picture"/>
+                    <pic:cNvPicPr>
+                      <a:picLocks noChangeArrowheads="1" noChangeAspect="1"/>
+                    </pic:cNvPicPr>
+                  </pic:nvPicPr>
+                  <pic:blipFill>
+                    <a:blip r:embed="rId85"/>
+                    <a:stretch>
+                      <a:fillRect/>
+                    </a:stretch>
+                  </pic:blipFill>
+                  <pic:spPr bwMode="auto">
+                    <a:xfrm>
+                      <a:off x="0" y="0"/>
+                      <a:ext cx="228600" cy="228600"/>
+                    </a:xfrm>
+                    <a:prstGeom prst="rect">
+                      <a:avLst/>
+                    </a:prstGeom>
+                    <a:noFill/>
+                    <a:ln w="9525">
+                      <a:noFill/>
+                      <a:headEnd/>
+                      <a:tailEnd/>
+                    </a:ln>
+                  </pic:spPr>
+                </pic:pic>
+              </a:graphicData>
+            </a:graphic>
+          </wp:inline>
+        </w:drawing>
+      </w:r>
+      <w:r>
+        <w:t xml:space="preserve"> </w:t>
+      </w:r>
+      <w:r>
+        <w:t xml:space="preserve">的礼包性价比最低）。购买完礼包后，再使用</w:t>
+      </w:r>
+      <w:r>
+        <w:drawing>
+          <wp:inline>
+            <wp:extent cx="228600" cy="228600"/>
+            <wp:effectExtent b="0" l="0" r="0" t="0"/>
+            <wp:docPr descr="钻石" title="" id="88" name="Picture"/>
+            <a:graphic>
+              <a:graphicData uri="http://schemas.openxmlformats.org/drawingml/2006/picture">
+                <pic:pic>
+                  <pic:nvPicPr>
+                    <pic:cNvPr descr="assets/img/道具/钻石.png" id="89" name="Picture"/>
                     <pic:cNvPicPr>
                       <a:picLocks noChangeArrowheads="1" noChangeAspect="1"/>
                     </pic:cNvPicPr>
@@ -1899,67 +1957,48 @@
         </w:drawing>
       </w:r>
       <w:r>
-        <w:t xml:space="preserve">）即可解锁。</w:t>
-      </w:r>
-    </w:p>
-    <w:bookmarkEnd w:id="84"/>
-    <w:bookmarkStart w:id="99" w:name="方案四拉满任务-购买128元礼包方案"/>
-    <w:p>
-      <w:pPr>
-        <w:pStyle w:val="Heading3"/>
-      </w:pPr>
-      <w:r>
-        <w:t xml:space="preserve">方案四：拉满任务 + 购买128元礼包方案</w:t>
-      </w:r>
-    </w:p>
-    <w:p>
-      <w:pPr>
-        <w:numPr>
-          <w:ilvl w:val="0"/>
-          <w:numId w:val="1006"/>
-        </w:numPr>
-        <w:pStyle w:val="Compact"/>
-      </w:pPr>
+        <w:t xml:space="preserve">补齐</w:t>
+      </w:r>
+      <w:r>
+        <w:t xml:space="preserve"> </w:t>
+      </w:r>
       <w:r>
         <w:rPr>
           <w:bCs/>
           <w:b/>
         </w:rPr>
-        <w:t xml:space="preserve">适用人群</w:t>
-      </w:r>
-      <w:r>
-        <w:t xml:space="preserve">：钻石充足、微氪希望同时补齐其他核心养成资源的玩家。</w:t>
-      </w:r>
-    </w:p>
-    <w:p>
-      <w:pPr>
-        <w:numPr>
-          <w:ilvl w:val="0"/>
-          <w:numId w:val="1006"/>
-        </w:numPr>
-        <w:pStyle w:val="Compact"/>
-      </w:pPr>
+        <w:t xml:space="preserve">135</w:t>
+      </w:r>
+      <w:r>
+        <w:t xml:space="preserve"> </w:t>
+      </w:r>
+      <w:r>
+        <w:t xml:space="preserve">张券（相当于</w:t>
+      </w:r>
+      <w:r>
+        <w:t xml:space="preserve"> </w:t>
+      </w:r>
       <w:r>
         <w:rPr>
           <w:bCs/>
           <w:b/>
         </w:rPr>
-        <w:t xml:space="preserve">具体策略</w:t>
-      </w:r>
-      <w:r>
-        <w:t xml:space="preserve">：拉满任务（105张券），购买128元礼包。购买完礼包后，再使用</w:t>
+        <w:t xml:space="preserve">40500</w:t>
+      </w:r>
+      <w:r>
+        <w:t xml:space="preserve"> </w:t>
       </w:r>
       <w:r>
         <w:drawing>
           <wp:inline>
             <wp:extent cx="228600" cy="228600"/>
             <wp:effectExtent b="0" l="0" r="0" t="0"/>
-            <wp:docPr descr="钻石" title="" id="85" name="Picture"/>
+            <wp:docPr descr="钻石" title="" id="90" name="Picture"/>
             <a:graphic>
               <a:graphicData uri="http://schemas.openxmlformats.org/drawingml/2006/picture">
                 <pic:pic>
                   <pic:nvPicPr>
-                    <pic:cNvPr descr="assets/img/道具/钻石.png" id="86" name="Picture"/>
+                    <pic:cNvPr descr="assets/img/道具/钻石.png" id="91" name="Picture"/>
                     <pic:cNvPicPr>
                       <a:picLocks noChangeArrowheads="1" noChangeAspect="1"/>
                     </pic:cNvPicPr>
@@ -1992,48 +2031,67 @@
         </w:drawing>
       </w:r>
       <w:r>
-        <w:t xml:space="preserve">补齐</w:t>
-      </w:r>
-      <w:r>
-        <w:t xml:space="preserve"> </w:t>
-      </w:r>
+        <w:t xml:space="preserve">）即可解锁。</w:t>
+      </w:r>
+    </w:p>
+    <w:bookmarkEnd w:id="92"/>
+    <w:bookmarkStart w:id="114" w:name="方案四拉满任务-购买128元礼包方案"/>
+    <w:p>
+      <w:pPr>
+        <w:pStyle w:val="Heading3"/>
+      </w:pPr>
+      <w:r>
+        <w:t xml:space="preserve">方案四：拉满任务 + 购买128元礼包方案</w:t>
+      </w:r>
+    </w:p>
+    <w:p>
+      <w:pPr>
+        <w:numPr>
+          <w:ilvl w:val="0"/>
+          <w:numId w:val="1006"/>
+        </w:numPr>
+        <w:pStyle w:val="Compact"/>
+      </w:pPr>
       <w:r>
         <w:rPr>
           <w:bCs/>
           <w:b/>
         </w:rPr>
-        <w:t xml:space="preserve">130</w:t>
-      </w:r>
-      <w:r>
-        <w:t xml:space="preserve"> </w:t>
-      </w:r>
-      <w:r>
-        <w:t xml:space="preserve">张券（相当于</w:t>
-      </w:r>
-      <w:r>
-        <w:t xml:space="preserve"> </w:t>
-      </w:r>
+        <w:t xml:space="preserve">适用人群</w:t>
+      </w:r>
+      <w:r>
+        <w:t xml:space="preserve">：钻石充足、微氪希望同时补齐其他核心养成资源的玩家。</w:t>
+      </w:r>
+    </w:p>
+    <w:p>
+      <w:pPr>
+        <w:numPr>
+          <w:ilvl w:val="0"/>
+          <w:numId w:val="1006"/>
+        </w:numPr>
+        <w:pStyle w:val="Compact"/>
+      </w:pPr>
       <w:r>
         <w:rPr>
           <w:bCs/>
           <w:b/>
         </w:rPr>
-        <w:t xml:space="preserve">39,000</w:t>
-      </w:r>
-      <w:r>
-        <w:t xml:space="preserve"> </w:t>
+        <w:t xml:space="preserve">具体策略</w:t>
+      </w:r>
+      <w:r>
+        <w:t xml:space="preserve">：拉满任务（105张券），购买128元礼包。购买完礼包后，再使用</w:t>
       </w:r>
       <w:r>
         <w:drawing>
           <wp:inline>
             <wp:extent cx="228600" cy="228600"/>
             <wp:effectExtent b="0" l="0" r="0" t="0"/>
-            <wp:docPr descr="钻石" title="" id="87" name="Picture"/>
+            <wp:docPr descr="钻石" title="" id="93" name="Picture"/>
             <a:graphic>
               <a:graphicData uri="http://schemas.openxmlformats.org/drawingml/2006/picture">
                 <pic:pic>
                   <pic:nvPicPr>
-                    <pic:cNvPr descr="assets/img/道具/钻石.png" id="88" name="Picture"/>
+                    <pic:cNvPr descr="assets/img/道具/钻石.png" id="94" name="Picture"/>
                     <pic:cNvPicPr>
                       <a:picLocks noChangeArrowheads="1" noChangeAspect="1"/>
                     </pic:cNvPicPr>
@@ -2066,25 +2124,54 @@
         </w:drawing>
       </w:r>
       <w:r>
-        <w:t xml:space="preserve">）即可多获得80</w:t>
+        <w:t xml:space="preserve">补齐</w:t>
+      </w:r>
+      <w:r>
+        <w:t xml:space="preserve"> </w:t>
+      </w:r>
+      <w:r>
+        <w:rPr>
+          <w:bCs/>
+          <w:b/>
+        </w:rPr>
+        <w:t xml:space="preserve">185</w:t>
+      </w:r>
+      <w:r>
+        <w:t xml:space="preserve"> </w:t>
+      </w:r>
+      <w:r>
+        <w:t xml:space="preserve">张券（相当于</w:t>
+      </w:r>
+      <w:r>
+        <w:t xml:space="preserve"> </w:t>
+      </w:r>
+      <w:r>
+        <w:rPr>
+          <w:bCs/>
+          <w:b/>
+        </w:rPr>
+        <w:t xml:space="preserve">55500</w:t>
+      </w:r>
+      <w:r>
+        <w:t xml:space="preserve"> </w:t>
       </w:r>
       <w:r>
         <w:drawing>
           <wp:inline>
             <wp:extent cx="228600" cy="228600"/>
             <wp:effectExtent b="0" l="0" r="0" t="0"/>
-            <wp:docPr descr="火神之锤" title="" id="90" name="Picture"/>
+            <wp:docPr descr="钻石" title="" id="95" name="Picture"/>
             <a:graphic>
               <a:graphicData uri="http://schemas.openxmlformats.org/drawingml/2006/picture">
                 <pic:pic>
                   <pic:nvPicPr>
-                    <pic:cNvPr descr="assets/img/活动道具/神火活动/火神之锤.png" id="91" name="Picture"/>
+                    <pic:cNvPr descr="assets/img/道具/钻石.png" id="96" name="Picture"/>
                     <pic:cNvPicPr>
                       <a:picLocks noChangeArrowheads="1" noChangeAspect="1"/>
                     </pic:cNvPicPr>
                   </pic:nvPicPr>
                   <pic:blipFill>
-                    <a:blip r:embed="rId89"/>
+                    <a:blip r:embed="rId30"/>
                     <a:stretch>
                       <a:fillRect/>
                     </a:stretch>
@@ -2111,40 +2198,25 @@
         </w:drawing>
       </w:r>
       <w:r>
-        <w:t xml:space="preserve">碎片用于升星。</w:t>
-      </w:r>
-    </w:p>
-    <w:p>
-      <w:r>
-        <w:pict>
-          <v:rect style="width:0;height:1.5pt" o:hralign="center" o:hrstd="t" o:hr="t"/>
-        </w:pict>
-      </w:r>
-    </w:p>
-    <w:p>
-      <w:pPr>
-        <w:pStyle w:val="FirstParagraph"/>
-      </w:pPr>
-      <w:r>
-        <w:t xml:space="preserve">此外，还有一种特殊情况：如果你目前尚未解锁哪吒</w:t>
+        <w:t xml:space="preserve">）即可多获得80</w:t>
       </w:r>
       <w:r>
         <w:drawing>
           <wp:inline>
             <wp:extent cx="228600" cy="228600"/>
             <wp:effectExtent b="0" l="0" r="0" t="0"/>
-            <wp:docPr descr="哪吒" title="" id="93" name="Picture"/>
+            <wp:docPr descr="火神之锤" title="" id="98" name="Picture"/>
             <a:graphic>
               <a:graphicData uri="http://schemas.openxmlformats.org/drawingml/2006/picture">
                 <pic:pic>
                   <pic:nvPicPr>
-                    <pic:cNvPr descr="assets/img/特工/哪吒.png" id="94" name="Picture"/>
+                    <pic:cNvPr descr="assets/img/活动道具/神火活动/火神之锤.png" id="99" name="Picture"/>
                     <pic:cNvPicPr>
                       <a:picLocks noChangeArrowheads="1" noChangeAspect="1"/>
                     </pic:cNvPicPr>
                   </pic:nvPicPr>
                   <pic:blipFill>
-                    <a:blip r:embed="rId92"/>
+                    <a:blip r:embed="rId97"/>
                     <a:stretch>
                       <a:fillRect/>
                     </a:stretch>
@@ -2171,19 +2243,270 @@
         </w:drawing>
       </w:r>
       <w:r>
-        <w:t xml:space="preserve">，那么在本次活动中建议优先选择哪吒碎片，待哪吒解锁后再选择伏尔甘</w:t>
+        <w:t xml:space="preserve">碎片用于升星。</w:t>
+      </w:r>
+    </w:p>
+    <w:p>
+      <w:r>
+        <w:pict>
+          <v:rect style="width:0;height:1.5pt" o:hralign="center" o:hrstd="t" o:hr="t"/>
+        </w:pict>
+      </w:r>
+    </w:p>
+    <w:p>
+      <w:pPr>
+        <w:pStyle w:val="FirstParagraph"/>
+      </w:pPr>
+      <w:r>
+        <w:t xml:space="preserve">此外，还有一种特殊情况：如果你目前尚未解锁哪吒</w:t>
       </w:r>
       <w:r>
         <w:drawing>
           <wp:inline>
             <wp:extent cx="228600" cy="228600"/>
             <wp:effectExtent b="0" l="0" r="0" t="0"/>
-            <wp:docPr descr="伏尔甘" title="" id="95" name="Picture"/>
+            <wp:docPr descr="哪吒" title="" id="101" name="Picture"/>
             <a:graphic>
               <a:graphicData uri="http://schemas.openxmlformats.org/drawingml/2006/picture">
                 <pic:pic>
                   <pic:nvPicPr>
-                    <pic:cNvPr descr="assets/img/特工/伏尔甘.png" id="96" name="Picture"/>
+                    <pic:cNvPr descr="assets/img/特工/哪吒.png" id="102" name="Picture"/>
+                    <pic:cNvPicPr>
+                      <a:picLocks noChangeArrowheads="1" noChangeAspect="1"/>
+                    </pic:cNvPicPr>
+                  </pic:nvPicPr>
+                  <pic:blipFill>
+                    <a:blip r:embed="rId100"/>
+                    <a:stretch>
+                      <a:fillRect/>
+                    </a:stretch>
+                  </pic:blipFill>
+                  <pic:spPr bwMode="auto">
+                    <a:xfrm>
+                      <a:off x="0" y="0"/>
+                      <a:ext cx="228600" cy="228600"/>
+                    </a:xfrm>
+                    <a:prstGeom prst="rect">
+                      <a:avLst/>
+                    </a:prstGeom>
+                    <a:noFill/>
+                    <a:ln w="9525">
+                      <a:noFill/>
+                      <a:headEnd/>
+                      <a:tailEnd/>
+                    </a:ln>
+                  </pic:spPr>
+                </pic:pic>
+              </a:graphicData>
+            </a:graphic>
+          </wp:inline>
+        </w:drawing>
+      </w:r>
+      <w:r>
+        <w:t xml:space="preserve">，那么在本次活动中建议优先选择哪吒碎片</w:t>
+      </w:r>
+      <w:r>
+        <w:drawing>
+          <wp:inline>
+            <wp:extent cx="228600" cy="228600"/>
+            <wp:effectExtent b="0" l="0" r="0" t="0"/>
+            <wp:docPr descr="莲花化身" title="" id="104" name="Picture"/>
+            <a:graphic>
+              <a:graphicData uri="http://schemas.openxmlformats.org/drawingml/2006/picture">
+                <pic:pic>
+                  <pic:nvPicPr>
+                    <pic:cNvPr descr="assets/img/活动道具/神火活动/莲花化身.png" id="105" name="Picture"/>
+                    <pic:cNvPicPr>
+                      <a:picLocks noChangeArrowheads="1" noChangeAspect="1"/>
+                    </pic:cNvPicPr>
+                  </pic:nvPicPr>
+                  <pic:blipFill>
+                    <a:blip r:embed="rId103"/>
+                    <a:stretch>
+                      <a:fillRect/>
+                    </a:stretch>
+                  </pic:blipFill>
+                  <pic:spPr bwMode="auto">
+                    <a:xfrm>
+                      <a:off x="0" y="0"/>
+                      <a:ext cx="228600" cy="228600"/>
+                    </a:xfrm>
+                    <a:prstGeom prst="rect">
+                      <a:avLst/>
+                    </a:prstGeom>
+                    <a:noFill/>
+                    <a:ln w="9525">
+                      <a:noFill/>
+                      <a:headEnd/>
+                      <a:tailEnd/>
+                    </a:ln>
+                  </pic:spPr>
+                </pic:pic>
+              </a:graphicData>
+            </a:graphic>
+          </wp:inline>
+        </w:drawing>
+      </w:r>
+      <w:r>
+        <w:t xml:space="preserve">，待哪吒解锁后再选择伏尔甘</w:t>
+      </w:r>
+      <w:r>
+        <w:drawing>
+          <wp:inline>
+            <wp:extent cx="228600" cy="228600"/>
+            <wp:effectExtent b="0" l="0" r="0" t="0"/>
+            <wp:docPr descr="火神之锤" title="" id="106" name="Picture"/>
+            <a:graphic>
+              <a:graphicData uri="http://schemas.openxmlformats.org/drawingml/2006/picture">
+                <pic:pic>
+                  <pic:nvPicPr>
+                    <pic:cNvPr descr="assets/img/活动道具/神火活动/火神之锤.png" id="107" name="Picture"/>
+                    <pic:cNvPicPr>
+                      <a:picLocks noChangeArrowheads="1" noChangeAspect="1"/>
+                    </pic:cNvPicPr>
+                  </pic:nvPicPr>
+                  <pic:blipFill>
+                    <a:blip r:embed="rId97"/>
+                    <a:stretch>
+                      <a:fillRect/>
+                    </a:stretch>
+                  </pic:blipFill>
+                  <pic:spPr bwMode="auto">
+                    <a:xfrm>
+                      <a:off x="0" y="0"/>
+                      <a:ext cx="228600" cy="228600"/>
+                    </a:xfrm>
+                    <a:prstGeom prst="rect">
+                      <a:avLst/>
+                    </a:prstGeom>
+                    <a:noFill/>
+                    <a:ln w="9525">
+                      <a:noFill/>
+                      <a:headEnd/>
+                      <a:tailEnd/>
+                    </a:ln>
+                  </pic:spPr>
+                </pic:pic>
+              </a:graphicData>
+            </a:graphic>
+          </wp:inline>
+        </w:drawing>
+      </w:r>
+      <w:r>
+        <w:t xml:space="preserve">碎片。即便伏尔甘的核心伤害加成需要哪吒挂神火</w:t>
+      </w:r>
+      <w:r>
+        <w:drawing>
+          <wp:inline>
+            <wp:extent cx="228600" cy="228600"/>
+            <wp:effectExtent b="0" l="0" r="0" t="0"/>
+            <wp:docPr descr="神火" title="" id="108" name="Picture"/>
+            <a:graphic>
+              <a:graphicData uri="http://schemas.openxmlformats.org/drawingml/2006/picture">
+                <pic:pic>
+                  <pic:nvPicPr>
+                    <pic:cNvPr descr="assets/img/技能图标/战斗中debuff/神火.png" id="109" name="Picture"/>
+                    <pic:cNvPicPr>
+                      <a:picLocks noChangeArrowheads="1" noChangeAspect="1"/>
+                    </pic:cNvPicPr>
+                  </pic:nvPicPr>
+                  <pic:blipFill>
+                    <a:blip r:embed="rId38"/>
+                    <a:stretch>
+                      <a:fillRect/>
+                    </a:stretch>
+                  </pic:blipFill>
+                  <pic:spPr bwMode="auto">
+                    <a:xfrm>
+                      <a:off x="0" y="0"/>
+                      <a:ext cx="228600" cy="228600"/>
+                    </a:xfrm>
+                    <a:prstGeom prst="rect">
+                      <a:avLst/>
+                    </a:prstGeom>
+                    <a:noFill/>
+                    <a:ln w="9525">
+                      <a:noFill/>
+                      <a:headEnd/>
+                      <a:tailEnd/>
+                    </a:ln>
+                  </pic:spPr>
+                </pic:pic>
+              </a:graphicData>
+            </a:graphic>
+          </wp:inline>
+        </w:drawing>
+      </w:r>
+      <w:r>
+        <w:t xml:space="preserve"> </w:t>
+      </w:r>
+      <w:r>
+        <w:t xml:space="preserve">Buff 才能完全发挥但他的觉醒后技能加成对回响有很大帮助。若本期钻石不足以直接解锁伏尔甘也无需担心，下期神火活动第三弹应该能获取到伏尔甘的碎片，届时提前备足</w:t>
+      </w:r>
+      <w:r>
+        <w:drawing>
+          <wp:inline>
+            <wp:extent cx="228600" cy="228600"/>
+            <wp:effectExtent b="0" l="0" r="0" t="0"/>
+            <wp:docPr descr="钻石" title="" id="110" name="Picture"/>
+            <a:graphic>
+              <a:graphicData uri="http://schemas.openxmlformats.org/drawingml/2006/picture">
+                <pic:pic>
+                  <pic:nvPicPr>
+                    <pic:cNvPr descr="assets/img/道具/钻石.png" id="111" name="Picture"/>
+                    <pic:cNvPicPr>
+                      <a:picLocks noChangeArrowheads="1" noChangeAspect="1"/>
+                    </pic:cNvPicPr>
+                  </pic:nvPicPr>
+                  <pic:blipFill>
+                    <a:blip r:embed="rId30"/>
+                    <a:stretch>
+                      <a:fillRect/>
+                    </a:stretch>
+                  </pic:blipFill>
+                  <pic:spPr bwMode="auto">
+                    <a:xfrm>
+                      <a:off x="0" y="0"/>
+                      <a:ext cx="228600" cy="228600"/>
+                    </a:xfrm>
+                    <a:prstGeom prst="rect">
+                      <a:avLst/>
+                    </a:prstGeom>
+                    <a:noFill/>
+                    <a:ln w="9525">
+                      <a:noFill/>
+                      <a:headEnd/>
+                      <a:tailEnd/>
+                    </a:ln>
+                  </pic:spPr>
+                </pic:pic>
+              </a:graphicData>
+            </a:graphic>
+          </wp:inline>
+        </w:drawing>
+      </w:r>
+      <w:r>
+        <w:t xml:space="preserve">即可。</w:t>
+      </w:r>
+    </w:p>
+    <w:p>
+      <w:pPr>
+        <w:pStyle w:val="BodyText"/>
+      </w:pPr>
+      <w:r>
+        <w:t xml:space="preserve">以上就是本次《神火特工第二弹 SP特工伏尔甘获取攻略》的全部内容，祝大家都能顺利拿到！下一篇内容将会对</w:t>
+      </w:r>
+      <w:r>
+        <w:drawing>
+          <wp:inline>
+            <wp:extent cx="228600" cy="228600"/>
+            <wp:effectExtent b="0" l="0" r="0" t="0"/>
+            <wp:docPr descr="伏尔甘" title="" id="112" name="Picture"/>
+            <a:graphic>
+              <a:graphicData uri="http://schemas.openxmlformats.org/drawingml/2006/picture">
+                <pic:pic>
+                  <pic:nvPicPr>
+                    <pic:cNvPr descr="assets/img/特工/伏尔甘.png" id="113" name="Picture"/>
                     <pic:cNvPicPr>
                       <a:picLocks noChangeArrowheads="1" noChangeAspect="1"/>
                     </pic:cNvPicPr>
@@ -2216,59 +2539,6 @@
         </w:drawing>
       </w:r>
       <w:r>
-        <w:t xml:space="preserve">碎片。因为伏尔甘的核心伤害加成需要哪吒挂神火 Buff 才能完全发挥。若本期钻石不足以直接解锁伏尔甘也无需担心，下期神火活动预计依然能兑换其碎片，届时提前备足钻石即可。</w:t>
-      </w:r>
-    </w:p>
-    <w:p>
-      <w:pPr>
-        <w:pStyle w:val="BodyText"/>
-      </w:pPr>
-      <w:r>
-        <w:t xml:space="preserve">以上就是本次《神火特工第二弹 SP特工伏尔甘获取攻略》的全部内容，祝大家都能顺利拿到！下一篇内容将会对</w:t>
-      </w:r>
-      <w:r>
-        <w:drawing>
-          <wp:inline>
-            <wp:extent cx="228600" cy="228600"/>
-            <wp:effectExtent b="0" l="0" r="0" t="0"/>
-            <wp:docPr descr="伏尔甘" title="" id="97" name="Picture"/>
-            <a:graphic>
-              <a:graphicData uri="http://schemas.openxmlformats.org/drawingml/2006/picture">
-                <pic:pic>
-                  <pic:nvPicPr>
-                    <pic:cNvPr descr="assets/img/特工/伏尔甘.png" id="98" name="Picture"/>
-                    <pic:cNvPicPr>
-                      <a:picLocks noChangeArrowheads="1" noChangeAspect="1"/>
-                    </pic:cNvPicPr>
-                  </pic:nvPicPr>
-                  <pic:blipFill>
-                    <a:blip r:embed="rId20"/>
-                    <a:stretch>
-                      <a:fillRect/>
-                    </a:stretch>
-                  </pic:blipFill>
-                  <pic:spPr bwMode="auto">
-                    <a:xfrm>
-                      <a:off x="0" y="0"/>
-                      <a:ext cx="228600" cy="228600"/>
-                    </a:xfrm>
-                    <a:prstGeom prst="rect">
-                      <a:avLst/>
-                    </a:prstGeom>
-                    <a:noFill/>
-                    <a:ln w="9525">
-                      <a:noFill/>
-                      <a:headEnd/>
-                      <a:tailEnd/>
-                    </a:ln>
-                  </pic:spPr>
-                </pic:pic>
-              </a:graphicData>
-            </a:graphic>
-          </wp:inline>
-        </w:drawing>
-      </w:r>
-      <w:r>
         <w:t xml:space="preserve">的技能和属性做详细的讲解，同时也会就当前版本下伏尔甘的强度做详细的分析，欢迎到时候观看！</w:t>
       </w:r>
     </w:p>
@@ -2328,8 +2598,8 @@
         <w:t xml:space="preserve">讨论，我会第一时间回复大家，我们下期再见！</w:t>
       </w:r>
     </w:p>
-    <w:bookmarkEnd w:id="99"/>
-    <w:bookmarkEnd w:id="100"/>
+    <w:bookmarkEnd w:id="114"/>
+    <w:bookmarkEnd w:id="115"/>
     <w:sectPr/>
   </w:body>
 </w:document>

</xml_diff>